<commit_message>
Add real IG/VK/MAX accounts to brief and post 01, screen-time how-to
Co-Authored-By: Claude Opus 5.5 <noreply@anthropic.com>
Claude-Session: https://claude.ai/code/session_01DZfKE2Qbh1BJBTBdA16C3f
</commit_message>
<xml_diff>
--- a/content/Kontent-plan_Ayrat_oktyabr-2026.docx
+++ b/content/Kontent-plan_Ayrat_oktyabr-2026.docx
@@ -657,7 +657,7 @@
     <w:tbl>
       <w:tblPr>
         <w:tblStyle w:val="Table"/>
-        <w:tblW w:type="auto" w:w="0"/>
+        <w:tblW w:type="pct" w:w="5000"/>
         <w:tblBorders>
           <w:top w:val="single" w:sz="4" w:space="0" w:color="BFBFBF"/>
           <w:left w:val="single" w:sz="4" w:space="0" w:color="BFBFBF"/>
@@ -666,6 +666,7 @@
           <w:insideH w:val="single" w:sz="4" w:space="0" w:color="BFBFBF"/>
           <w:insideV w:val="single" w:sz="4" w:space="0" w:color="BFBFBF"/>
         </w:tblBorders>
+        <w:tblLayout w:type="fixed"/>
         <w:tblLook w:firstRow="1" w:lastRow="0" w:firstColumn="0" w:lastColumn="0" w:noHBand="0" w:noVBand="0" w:val="0020"/>
       </w:tblPr>
       <w:tblGrid>
@@ -780,7 +781,31 @@
               <w:rPr>
                 <w:sz w:val="19"/>
               </w:rPr>
-              <w:t xml:space="preserve">Instagram</w:t>
+              <w:t xml:space="preserve">Instagram —</w:t>
+            </w:r>
+            <w:r>
+              <w:rPr>
+                <w:sz w:val="19"/>
+              </w:rPr>
+              <w:t xml:space="preserve"> </w:t>
+            </w:r>
+            <w:r>
+              <w:rPr>
+                <w:sz w:val="19"/>
+              </w:rPr>
+              <w:t xml:space="preserve">@airat.sagdeev</w:t>
+            </w:r>
+            <w:r>
+              <w:rPr>
+                <w:sz w:val="19"/>
+              </w:rPr>
+              <w:t xml:space="preserve"> </w:t>
+            </w:r>
+            <w:r>
+              <w:rPr>
+                <w:sz w:val="19"/>
+              </w:rPr>
+              <w:t xml:space="preserve">(действующий)</w:t>
             </w:r>
           </w:p>
         </w:tc>
@@ -810,7 +835,7 @@
               <w:rPr>
                 <w:sz w:val="19"/>
               </w:rPr>
-              <w:t xml:space="preserve">ВКонтакте</w:t>
+              <w:t xml:space="preserve">ВКонтакте — vk.ru/a.sagdeev</w:t>
             </w:r>
           </w:p>
         </w:tc>
@@ -840,21 +865,21 @@
               <w:rPr>
                 <w:sz w:val="19"/>
               </w:rPr>
-              <w:t xml:space="preserve">MAX</w:t>
-            </w:r>
-          </w:p>
-        </w:tc>
-        <w:tc>
-          <w:tcPr/>
-          <w:p>
-            <w:pPr>
-              <w:pStyle w:val="Compact"/>
-            </w:pPr>
-            <w:r>
-              <w:rPr>
-                <w:sz w:val="19"/>
-              </w:rPr>
-              <w:t xml:space="preserve">Новый канал, дубль TG (там коллеги-госсектор)</w:t>
+              <w:t xml:space="preserve">MAX — web.max.ru/-79479061387301</w:t>
+            </w:r>
+          </w:p>
+        </w:tc>
+        <w:tc>
+          <w:tcPr/>
+          <w:p>
+            <w:pPr>
+              <w:pStyle w:val="Compact"/>
+            </w:pPr>
+            <w:r>
+              <w:rPr>
+                <w:sz w:val="19"/>
+              </w:rPr>
+              <w:t xml:space="preserve">Дубль TG (там коллеги-госсектор)</w:t>
             </w:r>
           </w:p>
         </w:tc>
@@ -5534,7 +5559,7 @@
         <w:pStyle w:val="BodyText"/>
       </w:pPr>
       <w:r>
-        <w:t xml:space="preserve">Канал теперь будет ещё в Instagram, ВК и MAX. Ссылки в комментариях.</w:t>
+        <w:t xml:space="preserve">Теперь пишу не только здесь: Instagram, ВКонтакте и MAX. Ссылки в первом комментарии, выбирайте, где удобнее.</w:t>
       </w:r>
     </w:p>
     <w:p>
@@ -6013,7 +6038,19 @@
         </w:numPr>
       </w:pPr>
       <w:r>
-        <w:t xml:space="preserve">Ссылки на новые аккаунты IG / ВК / MAX, когда заведём.</w:t>
+        <w:t xml:space="preserve">Первый комментарий под постом TG: ссылки на Instagram (instagram.com/airat.sagdeev), ВК (vk.ru/a.sagdeev), MAX (web.max.ru/-79479061387301).</w:t>
+      </w:r>
+    </w:p>
+    <w:p>
+      <w:pPr>
+        <w:pStyle w:val="Compact"/>
+        <w:numPr>
+          <w:ilvl w:val="0"/>
+          <w:numId w:val="1012"/>
+        </w:numPr>
+      </w:pPr>
+      <w:r>
+        <w:t xml:space="preserve">Скрин экранного времени: iPhone — Настройки → Экранное время → «Вся активность» → вкладка «Неделя»; Android — Настройки → Цифровое благополучие. Нужна строка «сколько часов в день» и топ приложений (Telegram, WhatsApp, MAX, почта).</w:t>
       </w:r>
     </w:p>
     <w:p>

</xml_diff>

<commit_message>
Shorten Telegram texts of posts 01-06, put social links into post 01
Co-Authored-By: Claude Opus 5.5 <noreply@anthropic.com>
Claude-Session: https://claude.ai/code/session_01DZfKE2Qbh1BJBTBdA16C3f
</commit_message>
<xml_diff>
--- a/content/Kontent-plan_Ayrat_oktyabr-2026.docx
+++ b/content/Kontent-plan_Ayrat_oktyabr-2026.docx
@@ -1057,6 +1057,28 @@
       </w:pPr>
       <w:r>
         <w:t xml:space="preserve">На «вы», но лично, с экспертизой и юмором.</w:t>
+      </w:r>
+    </w:p>
+    <w:p>
+      <w:pPr>
+        <w:pStyle w:val="Compact"/>
+        <w:numPr>
+          <w:ilvl w:val="0"/>
+          <w:numId w:val="1004"/>
+        </w:numPr>
+      </w:pPr>
+      <w:r>
+        <w:rPr>
+          <w:b/>
+          <w:bCs/>
+        </w:rPr>
+        <w:t xml:space="preserve">Длина:</w:t>
+      </w:r>
+      <w:r>
+        <w:t xml:space="preserve"> </w:t>
+      </w:r>
+      <w:r>
+        <w:t xml:space="preserve">коротко. Пост TG — до ~1000 знаков, одна мысль, без воды (решено 27.09).</w:t>
       </w:r>
     </w:p>
     <w:p>
@@ -5477,7 +5499,7 @@
         <w:pStyle w:val="BodyText"/>
       </w:pPr>
       <w:r>
-        <w:t xml:space="preserve">Май, потом тишина до конца сентября. Знакомо? Всегда есть задача важнее, чем написать пост.</w:t>
+        <w:t xml:space="preserve">Май, потом тишина до конца сентября. Всегда находилась задача важнее поста.</w:t>
       </w:r>
     </w:p>
     <w:p>
@@ -5485,15 +5507,7 @@
         <w:pStyle w:val="BodyText"/>
       </w:pPr>
       <w:r>
-        <w:t xml:space="preserve">При этом всё это время я занимался тем, о чём стоило рассказывать: разбирался, как отдать рутину ИИ. Почту, сообщения, протоколы встреч, отчёты. Руководитель тонет не в больших решениях, а в мелочах. Вот их я и начал отдавать машине.</w:t>
-      </w:r>
-    </w:p>
-    <w:p>
-      <w:pPr>
-        <w:pStyle w:val="BodyText"/>
-      </w:pPr>
-      <w:r>
-        <w:t xml:space="preserve">Управление у меня давно работает без ручного режима, об этом ещё расскажу. А вот вокруг него рутины меньше не становится.</w:t>
+        <w:t xml:space="preserve">А занимался я как раз тем, о чём стоит рассказать: отдавал рутину ИИ. Почту, сообщения, протоколы, отчёты. Руководитель тонет не в больших решениях, а в мелочах.</w:t>
       </w:r>
     </w:p>
     <w:p>
@@ -5511,7 +5525,13 @@
           <w:b/>
           <w:bCs/>
         </w:rPr>
-        <w:t xml:space="preserve">30 дней автоматизирую свою работу и показываю всё здесь.</w:t>
+        <w:t xml:space="preserve">30 дней автоматизирую свою работу и показываю здесь всё</w:t>
+      </w:r>
+      <w:r>
+        <w:t xml:space="preserve"> </w:t>
+      </w:r>
+      <w:r>
+        <w:t xml:space="preserve">— что сделал, сколько времени сэкономил, где споткнулся. С цифрами.</w:t>
       </w:r>
     </w:p>
     <w:p>
@@ -5519,31 +5539,7 @@
         <w:pStyle w:val="BodyText"/>
       </w:pPr>
       <w:r>
-        <w:t xml:space="preserve">Что будет:</w:t>
-      </w:r>
-      <w:r>
-        <w:t xml:space="preserve"> </w:t>
-      </w:r>
-      <w:r>
-        <w:t xml:space="preserve">▫️ каждую неделю один процесс: что сделал, сколько времени сэкономил, где споткнулся;</w:t>
-      </w:r>
-      <w:r>
-        <w:t xml:space="preserve"> </w:t>
-      </w:r>
-      <w:r>
-        <w:t xml:space="preserve">▫️ цифры до и после, без «ИИ изменит вашу жизнь»;</w:t>
-      </w:r>
-      <w:r>
-        <w:t xml:space="preserve"> </w:t>
-      </w:r>
-      <w:r>
-        <w:t xml:space="preserve">▫️ мысли про управление и эффективность;</w:t>
-      </w:r>
-      <w:r>
-        <w:t xml:space="preserve"> </w:t>
-      </w:r>
-      <w:r>
-        <w:t xml:space="preserve">▫️ и личное, куда без него.</w:t>
+        <w:t xml:space="preserve">Первым автоматизирую сам канал. Пропаду снова на три месяца — значит, эксперимент провалился 🙂</w:t>
       </w:r>
     </w:p>
     <w:p>
@@ -5551,7 +5547,7 @@
         <w:pStyle w:val="BodyText"/>
       </w:pPr>
       <w:r>
-        <w:t xml:space="preserve">Первым автоматизирую сам этот канал. Если посты будут выходить регулярно — значит, работает. Если опять пропаду на три месяца, вы знаете, чем закончился эксперимент 🙂</w:t>
+        <w:t xml:space="preserve">А вы что бы отдали ИИ первым?</w:t>
       </w:r>
     </w:p>
     <w:p>
@@ -5559,15 +5555,25 @@
         <w:pStyle w:val="BodyText"/>
       </w:pPr>
       <w:r>
-        <w:t xml:space="preserve">Теперь пишу не только здесь: Instagram, ВКонтакте и MAX. Ссылки в первом комментарии, выбирайте, где удобнее.</w:t>
-      </w:r>
-    </w:p>
-    <w:p>
-      <w:pPr>
-        <w:pStyle w:val="BodyText"/>
-      </w:pPr>
-      <w:r>
-        <w:t xml:space="preserve">А вы что бы отдали ИИ первым, если бы могли?</w:t>
+        <w:t xml:space="preserve">Теперь я и здесь:</w:t>
+      </w:r>
+      <w:r>
+        <w:br/>
+      </w:r>
+      <w:r>
+        <w:t xml:space="preserve">Instagram — instagram.com/airat.sagdeev</w:t>
+      </w:r>
+      <w:r>
+        <w:br/>
+      </w:r>
+      <w:r>
+        <w:t xml:space="preserve">ВКонтакте — vk.ru/a.sagdeev</w:t>
+      </w:r>
+      <w:r>
+        <w:br/>
+      </w:r>
+      <w:r>
+        <w:t xml:space="preserve">MAX — web.max.ru/-79479061387301</w:t>
       </w:r>
     </w:p>
     <w:p>
@@ -6038,18 +6044,6 @@
         </w:numPr>
       </w:pPr>
       <w:r>
-        <w:t xml:space="preserve">Первый комментарий под постом TG: ссылки на Instagram (instagram.com/airat.sagdeev), ВК (vk.ru/a.sagdeev), MAX (web.max.ru/-79479061387301).</w:t>
-      </w:r>
-    </w:p>
-    <w:p>
-      <w:pPr>
-        <w:pStyle w:val="Compact"/>
-        <w:numPr>
-          <w:ilvl w:val="0"/>
-          <w:numId w:val="1012"/>
-        </w:numPr>
-      </w:pPr>
-      <w:r>
         <w:t xml:space="preserve">Скрин экранного времени: iPhone — Настройки → Экранное время → «Вся активность» → вкладка «Неделя»; Android — Настройки → Цифровое благополучие. Нужна строка «сколько часов в день» и топ приложений (Telegram, WhatsApp, MAX, почта).</w:t>
       </w:r>
     </w:p>
@@ -6116,7 +6110,7 @@
           <w:b/>
           <w:bCs/>
         </w:rPr>
-        <w:t xml:space="preserve">У меня появилась помощница. Зовут Алина. Она не человек</w:t>
+        <w:t xml:space="preserve">У меня появилась помощница Алина. Она не человек</w:t>
       </w:r>
     </w:p>
     <w:p>
@@ -6124,7 +6118,7 @@
         <w:pStyle w:val="BodyText"/>
       </w:pPr>
       <w:r>
-        <w:t xml:space="preserve">Когда я сказал домашним, что «с Алиной разбираем контент-план», повисла пауза. Пришлось объяснять.</w:t>
+        <w:t xml:space="preserve">Сказал домашним, что «с Алиной разбираем контент-план». Повисла пауза.</w:t>
       </w:r>
     </w:p>
     <w:p>
@@ -6132,37 +6126,7 @@
         <w:pStyle w:val="BodyText"/>
       </w:pPr>
       <w:r>
-        <w:t xml:space="preserve">Алина — ИИ-ассистент, которого я собрал сам. Она:</w:t>
-      </w:r>
-      <w:r>
-        <w:t xml:space="preserve"> </w:t>
-      </w:r>
-      <w:r>
-        <w:t xml:space="preserve">▫️ отвечает на типовые сообщения, пока я на встречах;</w:t>
-      </w:r>
-      <w:r>
-        <w:t xml:space="preserve"> </w:t>
-      </w:r>
-      <w:r>
-        <w:t xml:space="preserve">▫️ готовит черновики постов из моих голосовых;</w:t>
-      </w:r>
-      <w:r>
-        <w:t xml:space="preserve"> </w:t>
-      </w:r>
-      <w:r>
-        <w:t xml:space="preserve">▫️ делает картинки к постам;</w:t>
-      </w:r>
-      <w:r>
-        <w:t xml:space="preserve"> </w:t>
-      </w:r>
-      <w:r>
-        <w:t xml:space="preserve">▫️ публикует по расписанию;</w:t>
-      </w:r>
-      <w:r>
-        <w:t xml:space="preserve"> </w:t>
-      </w:r>
-      <w:r>
-        <w:t xml:space="preserve">▫️ и даже предложила переделать мой сайт. Смелая.</w:t>
+        <w:t xml:space="preserve">Алина — ИИ-ассистент, которого я собрал сам. Отвечает на типовые сообщения, пишет черновики постов из моих голосовых, делает картинки, публикует по расписанию. И даже предложила переделать мой сайт. Смелая.</w:t>
       </w:r>
     </w:p>
     <w:p>
@@ -6170,25 +6134,17 @@
         <w:pStyle w:val="BodyText"/>
       </w:pPr>
       <w:r>
-        <w:t xml:space="preserve">Сколько времени это сэкономило, пока не скажу: первая неделя эксперимента, мерю честно. Итоги в воскресенье.</w:t>
-      </w:r>
-    </w:p>
-    <w:p>
-      <w:pPr>
-        <w:pStyle w:val="BodyText"/>
-      </w:pPr>
-      <w:r>
-        <w:t xml:space="preserve">Но первые выводы уже есть:</w:t>
-      </w:r>
-    </w:p>
-    <w:p>
-      <w:pPr>
-        <w:pStyle w:val="Compact"/>
-        <w:numPr>
-          <w:ilvl w:val="0"/>
-          <w:numId w:val="1013"/>
-        </w:numPr>
-      </w:pPr>
+        <w:t xml:space="preserve">Первые выводы:</w:t>
+      </w:r>
+      <w:r>
+        <w:t xml:space="preserve"> </w:t>
+      </w:r>
+      <w:r>
+        <w:t xml:space="preserve">1.</w:t>
+      </w:r>
+      <w:r>
+        <w:t xml:space="preserve"> </w:t>
+      </w:r>
       <w:r>
         <w:rPr>
           <w:b/>
@@ -6200,59 +6156,51 @@
         <w:t xml:space="preserve"> </w:t>
       </w:r>
       <w:r>
-        <w:t xml:space="preserve">Он отлично делает черновик, но без вашего «а вот тут у меня было так» получается гладкий текст ни о чём.</w:t>
-      </w:r>
-    </w:p>
-    <w:p>
-      <w:pPr>
-        <w:pStyle w:val="Compact"/>
-        <w:numPr>
-          <w:ilvl w:val="0"/>
-          <w:numId w:val="1013"/>
-        </w:numPr>
-      </w:pPr>
+        <w:t xml:space="preserve">Без вашего «а у меня было так» выходит гладкий текст ни о чём.</w:t>
+      </w:r>
+      <w:r>
+        <w:t xml:space="preserve"> </w:t>
+      </w:r>
+      <w:r>
+        <w:t xml:space="preserve">2.</w:t>
+      </w:r>
+      <w:r>
+        <w:t xml:space="preserve"> </w:t>
+      </w:r>
       <w:r>
         <w:rPr>
           <w:b/>
           <w:bCs/>
         </w:rPr>
-        <w:t xml:space="preserve">Сложнее всего не настроить, а сформулировать.</w:t>
-      </w:r>
-      <w:r>
-        <w:t xml:space="preserve"> </w:t>
-      </w:r>
-      <w:r>
-        <w:t xml:space="preserve">Чтобы отдать задачу машине, надо самому понять, как вы её делаете. Половина пользы в этом.</w:t>
-      </w:r>
-    </w:p>
-    <w:p>
-      <w:pPr>
-        <w:pStyle w:val="Compact"/>
-        <w:numPr>
-          <w:ilvl w:val="0"/>
-          <w:numId w:val="1013"/>
-        </w:numPr>
-      </w:pPr>
+        <w:t xml:space="preserve">Чтобы отдать задачу машине, надо самому понять, как вы её делаете.</w:t>
+      </w:r>
+      <w:r>
+        <w:t xml:space="preserve"> </w:t>
+      </w:r>
+      <w:r>
+        <w:t xml:space="preserve">Половина пользы — в этом.</w:t>
+      </w:r>
+      <w:r>
+        <w:t xml:space="preserve"> </w:t>
+      </w:r>
+      <w:r>
+        <w:t xml:space="preserve">3.</w:t>
+      </w:r>
+      <w:r>
+        <w:t xml:space="preserve"> </w:t>
+      </w:r>
       <w:r>
         <w:rPr>
           <w:b/>
           <w:bCs/>
         </w:rPr>
-        <w:t xml:space="preserve">Начинать надо с того, что бесит.</w:t>
-      </w:r>
-      <w:r>
-        <w:t xml:space="preserve"> </w:t>
-      </w:r>
-      <w:r>
-        <w:t xml:space="preserve">Не с того, что модно автоматизировать, а с того, от чего вы вздыхаете каждое утро.</w:t>
-      </w:r>
-    </w:p>
-    <w:p>
-      <w:pPr>
-        <w:pStyle w:val="FirstParagraph"/>
-      </w:pPr>
-      <w:r>
-        <w:t xml:space="preserve">Кстати, этот пост тоже начинался как голосовое на 4 минуты. Алина сделала черновик, я правил. Вышло быстрее, чем обычно, а текст всё равно мой.</w:t>
+        <w:t xml:space="preserve">Начинайте с того, что бесит,</w:t>
+      </w:r>
+      <w:r>
+        <w:t xml:space="preserve"> </w:t>
+      </w:r>
+      <w:r>
+        <w:t xml:space="preserve">а не с того, что модно.</w:t>
       </w:r>
     </w:p>
     <w:p>
@@ -6260,7 +6208,15 @@
         <w:pStyle w:val="BodyText"/>
       </w:pPr>
       <w:r>
-        <w:t xml:space="preserve">У вас уже есть ИИ-помощник? Или пока присматриваетесь?</w:t>
+        <w:t xml:space="preserve">Этот пост тоже начался с голосового на 4 минуты. Сколько времени экономит — посчитаю к воскресенью.</w:t>
+      </w:r>
+    </w:p>
+    <w:p>
+      <w:pPr>
+        <w:pStyle w:val="BodyText"/>
+      </w:pPr>
+      <w:r>
+        <w:t xml:space="preserve">У вас уже есть ИИ-помощник?</w:t>
       </w:r>
     </w:p>
     <w:p>
@@ -6656,11 +6612,218 @@
         <w:pStyle w:val="Compact"/>
         <w:numPr>
           <w:ilvl w:val="0"/>
-          <w:numId w:val="1014"/>
+          <w:numId w:val="1013"/>
         </w:numPr>
       </w:pPr>
       <w:r>
         <w:t xml:space="preserve">Экран: вы диктуете голосовое (запись экрана 5 сек) + «Так начинается каждый пост теперь».</w:t>
+      </w:r>
+    </w:p>
+    <w:p>
+      <w:pPr>
+        <w:pStyle w:val="Compact"/>
+        <w:numPr>
+          <w:ilvl w:val="0"/>
+          <w:numId w:val="1013"/>
+        </w:numPr>
+      </w:pPr>
+      <w:r>
+        <w:t xml:space="preserve">Скрин черновика от Алины + ваши правки красным / зачёркнутым: «Вот что пришлось переписать» (честно и смешно).</w:t>
+      </w:r>
+    </w:p>
+    <w:p>
+      <w:pPr>
+        <w:pStyle w:val="Compact"/>
+        <w:numPr>
+          <w:ilvl w:val="0"/>
+          <w:numId w:val="1013"/>
+        </w:numPr>
+      </w:pPr>
+      <w:r>
+        <w:t xml:space="preserve">Ссылка на пост.</w:t>
+      </w:r>
+    </w:p>
+    <w:p>
+      <w:pPr>
+        <w:pStyle w:val="FirstParagraph"/>
+      </w:pPr>
+      <w:r>
+        <w:rPr>
+          <w:b/>
+          <w:bCs/>
+        </w:rPr>
+        <w:t xml:space="preserve">Чт 01.10 (День пожилых людей):</w:t>
+      </w:r>
+      <w:r>
+        <w:t xml:space="preserve"> </w:t>
+      </w:r>
+      <w:r>
+        <w:t xml:space="preserve">фото с родителями или скрин звонка + «Позвонил родителям. Тот случай, когда автоматизировать нельзя» ❤️</w:t>
+      </w:r>
+    </w:p>
+    <w:p>
+      <w:r>
+        <w:br w:type="page"/>
+      </w:r>
+    </w:p>
+    <w:bookmarkEnd w:id="40"/>
+    <w:bookmarkEnd w:id="41"/>
+    <w:bookmarkStart w:id="46" w:name="пт-02.10-10-часов-в-неделю"/>
+    <w:p>
+      <w:pPr>
+        <w:pStyle w:val="Heading1"/>
+      </w:pPr>
+      <w:r>
+        <w:t xml:space="preserve">03 · Пт 02.10 · 10 часов в неделю</w:t>
+      </w:r>
+    </w:p>
+    <w:p>
+      <w:pPr>
+        <w:pStyle w:val="FirstParagraph"/>
+      </w:pPr>
+      <w:r>
+        <w:t xml:space="preserve">Рубрика: #управленческое · Форматы: TG (+ВК, MAX) · Карусель IG · Reels (Сб 10.10) · Сторис</w:t>
+      </w:r>
+      <w:r>
+        <w:t xml:space="preserve"> </w:t>
+      </w:r>
+      <w:r>
+        <w:t xml:space="preserve">Время публикации: 09:00</w:t>
+      </w:r>
+      <w:r>
+        <w:t xml:space="preserve"> </w:t>
+      </w:r>
+      <w:r>
+        <w:t xml:space="preserve">Основа: презентация стартап-завтрака 23.09, слайды 2, 5–7, 16 (materials/text/startup-breakfast_5-pravil.md).</w:t>
+      </w:r>
+    </w:p>
+    <w:p>
+      <w:r>
+        <w:pict>
+          <v:rect style="width:0;height:1.5pt" o:hralign="center" o:hrstd="t" o:hr="t"/>
+        </w:pict>
+      </w:r>
+    </w:p>
+    <w:bookmarkStart w:id="42" w:name="telegram-2"/>
+    <w:p>
+      <w:pPr>
+        <w:pStyle w:val="Heading2"/>
+      </w:pPr>
+      <w:r>
+        <w:t xml:space="preserve">Telegram</w:t>
+      </w:r>
+    </w:p>
+    <w:p>
+      <w:pPr>
+        <w:pStyle w:val="FirstParagraph"/>
+      </w:pPr>
+      <w:r>
+        <w:rPr>
+          <w:b/>
+          <w:bCs/>
+        </w:rPr>
+        <w:t xml:space="preserve">Сколько часов в неделю я трачу на управление? Около десяти</w:t>
+      </w:r>
+    </w:p>
+    <w:p>
+      <w:pPr>
+        <w:pStyle w:val="BodyText"/>
+      </w:pPr>
+      <w:r>
+        <w:t xml:space="preserve">На мне площадка ИТ-парка: 50 000 м², сотня резидентов, 45 человек в штате, дата-центр 24/7.</w:t>
+      </w:r>
+    </w:p>
+    <w:p>
+      <w:pPr>
+        <w:pStyle w:val="BodyText"/>
+      </w:pPr>
+      <w:r>
+        <w:t xml:space="preserve">На управление уходит одно аппаратное и около пяти оперативок в неделю. Вручную не хватило бы и ста часов. Работает, потому что</w:t>
+      </w:r>
+      <w:r>
+        <w:t xml:space="preserve"> </w:t>
+      </w:r>
+      <w:r>
+        <w:rPr>
+          <w:b/>
+          <w:bCs/>
+        </w:rPr>
+        <w:t xml:space="preserve">не всё держится на мне.</w:t>
+      </w:r>
+    </w:p>
+    <w:p>
+      <w:pPr>
+        <w:pStyle w:val="BodyText"/>
+      </w:pPr>
+      <w:r>
+        <w:t xml:space="preserve">Так было не всегда. Первые годы я был бутылочным горлышком: всё через меня, команда ждёт моего ответа, рост упирается в мои сутки.</w:t>
+      </w:r>
+    </w:p>
+    <w:p>
+      <w:pPr>
+        <w:pStyle w:val="BodyText"/>
+      </w:pPr>
+      <w:r>
+        <w:t xml:space="preserve">«Система движется со скоростью самого слабого звена», — Голдратт. Когда всё завязано на руководителя, слабое звено — он.</w:t>
+      </w:r>
+    </w:p>
+    <w:p>
+      <w:pPr>
+        <w:pStyle w:val="BodyText"/>
+      </w:pPr>
+      <w:r>
+        <w:t xml:space="preserve">За 13 лет я вывел 5 правил, как из этого выбраться. Буду разбирать по одному.</w:t>
+      </w:r>
+    </w:p>
+    <w:p>
+      <w:pPr>
+        <w:pStyle w:val="BodyText"/>
+      </w:pPr>
+      <w:r>
+        <w:t xml:space="preserve">А пока вопрос:</w:t>
+      </w:r>
+      <w:r>
+        <w:t xml:space="preserve"> </w:t>
+      </w:r>
+      <w:r>
+        <w:rPr>
+          <w:b/>
+          <w:bCs/>
+        </w:rPr>
+        <w:t xml:space="preserve">кто может уехать на две недели без телефона — и бизнес не встанет?</w:t>
+      </w:r>
+    </w:p>
+    <w:p>
+      <w:pPr>
+        <w:pStyle w:val="BodyText"/>
+      </w:pPr>
+      <w:r>
+        <w:t xml:space="preserve">#управленческое</w:t>
+      </w:r>
+    </w:p>
+    <w:p>
+      <w:r>
+        <w:pict>
+          <v:rect style="width:0;height:1.5pt" o:hralign="center" o:hrstd="t" o:hr="t"/>
+        </w:pict>
+      </w:r>
+    </w:p>
+    <w:bookmarkEnd w:id="42"/>
+    <w:bookmarkStart w:id="43" w:name="карусель-instagram-7-слайдов"/>
+    <w:p>
+      <w:pPr>
+        <w:pStyle w:val="Heading2"/>
+      </w:pPr>
+      <w:r>
+        <w:t xml:space="preserve">Карусель Instagram (7 слайдов)</w:t>
+      </w:r>
+    </w:p>
+    <w:p>
+      <w:pPr>
+        <w:pStyle w:val="FirstParagraph"/>
+      </w:pPr>
+      <w:r>
+        <w:t xml:space="preserve">Стиль как в презентации: тёмный фон, оранжевый акцент, крупный шрифт. Фото — с трибуны (слайд 1 презентации).</w:t>
       </w:r>
     </w:p>
     <w:p>
@@ -6672,7 +6835,17 @@
         </w:numPr>
       </w:pPr>
       <w:r>
-        <w:t xml:space="preserve">Скрин черновика от Алины + ваши правки красным / зачёркнутым: «Вот что пришлось переписать» (честно и смешно).</w:t>
+        <w:rPr>
+          <w:b/>
+          <w:bCs/>
+        </w:rPr>
+        <w:t xml:space="preserve">Обложка:</w:t>
+      </w:r>
+      <w:r>
+        <w:t xml:space="preserve"> </w:t>
+      </w:r>
+      <w:r>
+        <w:t xml:space="preserve">«10 часов в неделю на управление. Как?» + ваше фото с трибуны.</w:t>
       </w:r>
     </w:p>
     <w:p>
@@ -6684,232 +6857,7 @@
         </w:numPr>
       </w:pPr>
       <w:r>
-        <w:t xml:space="preserve">Ссылка на пост.</w:t>
-      </w:r>
-    </w:p>
-    <w:p>
-      <w:pPr>
-        <w:pStyle w:val="FirstParagraph"/>
-      </w:pPr>
-      <w:r>
-        <w:rPr>
-          <w:b/>
-          <w:bCs/>
-        </w:rPr>
-        <w:t xml:space="preserve">Чт 01.10 (День пожилых людей):</w:t>
-      </w:r>
-      <w:r>
-        <w:t xml:space="preserve"> </w:t>
-      </w:r>
-      <w:r>
-        <w:t xml:space="preserve">фото с родителями или скрин звонка + «Позвонил родителям. Тот случай, когда автоматизировать нельзя» ❤️</w:t>
-      </w:r>
-    </w:p>
-    <w:p>
-      <w:r>
-        <w:br w:type="page"/>
-      </w:r>
-    </w:p>
-    <w:bookmarkEnd w:id="40"/>
-    <w:bookmarkEnd w:id="41"/>
-    <w:bookmarkStart w:id="46" w:name="пт-02.10-10-часов-в-неделю"/>
-    <w:p>
-      <w:pPr>
-        <w:pStyle w:val="Heading1"/>
-      </w:pPr>
-      <w:r>
-        <w:t xml:space="preserve">03 · Пт 02.10 · 10 часов в неделю</w:t>
-      </w:r>
-    </w:p>
-    <w:p>
-      <w:pPr>
-        <w:pStyle w:val="FirstParagraph"/>
-      </w:pPr>
-      <w:r>
-        <w:t xml:space="preserve">Рубрика: #управленческое · Форматы: TG (+ВК, MAX) · Карусель IG · Reels (Сб 10.10) · Сторис</w:t>
-      </w:r>
-      <w:r>
-        <w:t xml:space="preserve"> </w:t>
-      </w:r>
-      <w:r>
-        <w:t xml:space="preserve">Время публикации: 09:00</w:t>
-      </w:r>
-      <w:r>
-        <w:t xml:space="preserve"> </w:t>
-      </w:r>
-      <w:r>
-        <w:t xml:space="preserve">Основа: презентация стартап-завтрака 23.09, слайды 2, 5–7, 16 (materials/text/startup-breakfast_5-pravil.md).</w:t>
-      </w:r>
-    </w:p>
-    <w:p>
-      <w:r>
-        <w:pict>
-          <v:rect style="width:0;height:1.5pt" o:hralign="center" o:hrstd="t" o:hr="t"/>
-        </w:pict>
-      </w:r>
-    </w:p>
-    <w:bookmarkStart w:id="42" w:name="telegram-2"/>
-    <w:p>
-      <w:pPr>
-        <w:pStyle w:val="Heading2"/>
-      </w:pPr>
-      <w:r>
-        <w:t xml:space="preserve">Telegram</w:t>
-      </w:r>
-    </w:p>
-    <w:p>
-      <w:pPr>
-        <w:pStyle w:val="FirstParagraph"/>
-      </w:pPr>
-      <w:r>
-        <w:rPr>
-          <w:b/>
-          <w:bCs/>
-        </w:rPr>
-        <w:t xml:space="preserve">Сколько часов в неделю я трачу на управление? Около десяти</w:t>
-      </w:r>
-    </w:p>
-    <w:p>
-      <w:pPr>
-        <w:pStyle w:val="BodyText"/>
-      </w:pPr>
-      <w:r>
-        <w:t xml:space="preserve">Не хвастаюсь, сейчас объясню.</w:t>
-      </w:r>
-    </w:p>
-    <w:p>
-      <w:pPr>
-        <w:pStyle w:val="BodyText"/>
-      </w:pPr>
-      <w:r>
-        <w:t xml:space="preserve">На мне площадка ИТ-парка: здание 50 000 м², сотня резидентов, сотня подрядчиков за год, 700 детей в IT-академии, 45 человек в штате и дата-центр, который работает 24/7. Площадка, которая не спит.</w:t>
-      </w:r>
-    </w:p>
-    <w:p>
-      <w:pPr>
-        <w:pStyle w:val="BodyText"/>
-      </w:pPr>
-      <w:r>
-        <w:t xml:space="preserve">На управление этим уходит одно аппаратное совещание и около пяти оперативок в неделю. Примерно 10 часов.</w:t>
-      </w:r>
-    </w:p>
-    <w:p>
-      <w:pPr>
-        <w:pStyle w:val="BodyText"/>
-      </w:pPr>
-      <w:r>
-        <w:t xml:space="preserve">Вручную не хватило бы и ста. Это работает по одной причине:</w:t>
-      </w:r>
-      <w:r>
-        <w:t xml:space="preserve"> </w:t>
-      </w:r>
-      <w:r>
-        <w:rPr>
-          <w:b/>
-          <w:bCs/>
-        </w:rPr>
-        <w:t xml:space="preserve">не всё держится на мне.</w:t>
-      </w:r>
-    </w:p>
-    <w:p>
-      <w:pPr>
-        <w:pStyle w:val="BodyText"/>
-      </w:pPr>
-      <w:r>
-        <w:t xml:space="preserve">Так было не всегда. Первые годы в управлении я был классическим бутылочным горлышком:</w:t>
-      </w:r>
-      <w:r>
-        <w:t xml:space="preserve"> </w:t>
-      </w:r>
-      <w:r>
-        <w:t xml:space="preserve">▫️ всё проходит через меня;</w:t>
-      </w:r>
-      <w:r>
-        <w:t xml:space="preserve"> </w:t>
-      </w:r>
-      <w:r>
-        <w:t xml:space="preserve">▫️ команда стоит, пока я не отвечу;</w:t>
-      </w:r>
-      <w:r>
-        <w:t xml:space="preserve"> </w:t>
-      </w:r>
-      <w:r>
-        <w:t xml:space="preserve">▫️ рост упирается в мои сутки, а не в рынок.</w:t>
-      </w:r>
-    </w:p>
-    <w:p>
-      <w:pPr>
-        <w:pStyle w:val="BodyText"/>
-      </w:pPr>
-      <w:r>
-        <w:t xml:space="preserve">У Голдратта есть точная фраза: «Система движется со скоростью самого слабого звена». Когда всё завязано на руководителя, самое слабое звено — это он. Даже если он очень старается. Особенно если очень старается.</w:t>
-      </w:r>
-    </w:p>
-    <w:p>
-      <w:pPr>
-        <w:pStyle w:val="BodyText"/>
-      </w:pPr>
-      <w:r>
-        <w:t xml:space="preserve">За 13 лет в управлении я вывел для себя 5 правил, как из этого выбраться. На стартап-завтраке в ИТ-парке рассказывал их предпринимателям. Теперь буду разбирать здесь по одному.</w:t>
-      </w:r>
-    </w:p>
-    <w:p>
-      <w:pPr>
-        <w:pStyle w:val="BodyText"/>
-      </w:pPr>
-      <w:r>
-        <w:t xml:space="preserve">А пока вопрос, с которого я начал выступление. Поднимите руку:</w:t>
-      </w:r>
-      <w:r>
-        <w:t xml:space="preserve"> </w:t>
-      </w:r>
-      <w:r>
-        <w:rPr>
-          <w:b/>
-          <w:bCs/>
-        </w:rPr>
-        <w:t xml:space="preserve">кто может уехать на две недели без телефона — и бизнес не встанет?</w:t>
-      </w:r>
-    </w:p>
-    <w:p>
-      <w:pPr>
-        <w:pStyle w:val="BodyText"/>
-      </w:pPr>
-      <w:r>
-        <w:t xml:space="preserve">Если рука не поднялась, эта серия для вас.</w:t>
-      </w:r>
-    </w:p>
-    <w:p>
-      <w:pPr>
-        <w:pStyle w:val="BodyText"/>
-      </w:pPr>
-      <w:r>
-        <w:t xml:space="preserve">#управленческое</w:t>
-      </w:r>
-    </w:p>
-    <w:p>
-      <w:r>
-        <w:pict>
-          <v:rect style="width:0;height:1.5pt" o:hralign="center" o:hrstd="t" o:hr="t"/>
-        </w:pict>
-      </w:r>
-    </w:p>
-    <w:bookmarkEnd w:id="42"/>
-    <w:bookmarkStart w:id="43" w:name="карусель-instagram-7-слайдов"/>
-    <w:p>
-      <w:pPr>
-        <w:pStyle w:val="Heading2"/>
-      </w:pPr>
-      <w:r>
-        <w:t xml:space="preserve">Карусель Instagram (7 слайдов)</w:t>
-      </w:r>
-    </w:p>
-    <w:p>
-      <w:pPr>
-        <w:pStyle w:val="FirstParagraph"/>
-      </w:pPr>
-      <w:r>
-        <w:t xml:space="preserve">Стиль как в презентации: тёмный фон, оранжевый акцент, крупный шрифт. Фото — с трибуны (слайд 1 презентации).</w:t>
+        <w:t xml:space="preserve">«На мне: 50 000 м², сотня резидентов, 45 человек, дата-центр 24/7.»</w:t>
       </w:r>
     </w:p>
     <w:p>
@@ -6917,21 +6865,11 @@
         <w:pStyle w:val="Compact"/>
         <w:numPr>
           <w:ilvl w:val="0"/>
-          <w:numId w:val="1015"/>
+          <w:numId w:val="1014"/>
         </w:numPr>
       </w:pPr>
       <w:r>
-        <w:rPr>
-          <w:b/>
-          <w:bCs/>
-        </w:rPr>
-        <w:t xml:space="preserve">Обложка:</w:t>
-      </w:r>
-      <w:r>
-        <w:t xml:space="preserve"> </w:t>
-      </w:r>
-      <w:r>
-        <w:t xml:space="preserve">«10 часов в неделю на управление. Как?» + ваше фото с трибуны.</w:t>
+        <w:t xml:space="preserve">«Управление: 1 аппаратное + ~5 оперативок. ≈10 часов в неделю. Вручную не хватило бы и ста.»</w:t>
       </w:r>
     </w:p>
     <w:p>
@@ -6939,31 +6877,7 @@
         <w:pStyle w:val="Compact"/>
         <w:numPr>
           <w:ilvl w:val="0"/>
-          <w:numId w:val="1015"/>
-        </w:numPr>
-      </w:pPr>
-      <w:r>
-        <w:t xml:space="preserve">«На мне: 50 000 м², сотня резидентов, 45 человек, дата-центр 24/7.»</w:t>
-      </w:r>
-    </w:p>
-    <w:p>
-      <w:pPr>
-        <w:pStyle w:val="Compact"/>
-        <w:numPr>
-          <w:ilvl w:val="0"/>
-          <w:numId w:val="1015"/>
-        </w:numPr>
-      </w:pPr>
-      <w:r>
-        <w:t xml:space="preserve">«Управление: 1 аппаратное + ~5 оперативок. ≈10 часов в неделю. Вручную не хватило бы и ста.»</w:t>
-      </w:r>
-    </w:p>
-    <w:p>
-      <w:pPr>
-        <w:pStyle w:val="Compact"/>
-        <w:numPr>
-          <w:ilvl w:val="0"/>
-          <w:numId w:val="1015"/>
+          <w:numId w:val="1014"/>
         </w:numPr>
       </w:pPr>
       <w:r>
@@ -6985,7 +6899,7 @@
         <w:pStyle w:val="Compact"/>
         <w:numPr>
           <w:ilvl w:val="0"/>
-          <w:numId w:val="1015"/>
+          <w:numId w:val="1014"/>
         </w:numPr>
       </w:pPr>
       <w:r>
@@ -6997,7 +6911,7 @@
         <w:pStyle w:val="Compact"/>
         <w:numPr>
           <w:ilvl w:val="0"/>
-          <w:numId w:val="1015"/>
+          <w:numId w:val="1014"/>
         </w:numPr>
       </w:pPr>
       <w:r>
@@ -7009,7 +6923,7 @@
         <w:pStyle w:val="Compact"/>
         <w:numPr>
           <w:ilvl w:val="0"/>
-          <w:numId w:val="1015"/>
+          <w:numId w:val="1014"/>
         </w:numPr>
       </w:pPr>
       <w:r>
@@ -7373,11 +7287,341 @@
         <w:pStyle w:val="Compact"/>
         <w:numPr>
           <w:ilvl w:val="0"/>
-          <w:numId w:val="1016"/>
+          <w:numId w:val="1015"/>
         </w:numPr>
       </w:pPr>
       <w:r>
         <w:t xml:space="preserve">Фото со стартап-завтрака + «Самый частый вопрос: как сделать, чтобы работало без меня?»</w:t>
+      </w:r>
+    </w:p>
+    <w:p>
+      <w:pPr>
+        <w:pStyle w:val="Compact"/>
+        <w:numPr>
+          <w:ilvl w:val="0"/>
+          <w:numId w:val="1015"/>
+        </w:numPr>
+      </w:pPr>
+      <w:r>
+        <w:t xml:space="preserve">Опрос: «Сможет ли ваш бизнес/отдел две недели без вас?» — Да, спокойно / Со скрипом / Лучше не проверять 😅</w:t>
+      </w:r>
+    </w:p>
+    <w:p>
+      <w:pPr>
+        <w:pStyle w:val="Compact"/>
+        <w:numPr>
+          <w:ilvl w:val="0"/>
+          <w:numId w:val="1015"/>
+        </w:numPr>
+      </w:pPr>
+      <w:r>
+        <w:t xml:space="preserve">Ссылка на пост.</w:t>
+      </w:r>
+    </w:p>
+    <w:p>
+      <w:r>
+        <w:br w:type="page"/>
+      </w:r>
+    </w:p>
+    <w:bookmarkEnd w:id="45"/>
+    <w:bookmarkEnd w:id="46"/>
+    <w:bookmarkStart w:id="50" w:name="вс-04.10-итоги-первой-недели"/>
+    <w:p>
+      <w:pPr>
+        <w:pStyle w:val="Heading1"/>
+      </w:pPr>
+      <w:r>
+        <w:t xml:space="preserve">04 · Вс 04.10 · Итоги первой недели</w:t>
+      </w:r>
+    </w:p>
+    <w:p>
+      <w:pPr>
+        <w:pStyle w:val="FirstParagraph"/>
+      </w:pPr>
+      <w:r>
+        <w:t xml:space="preserve">Рубрика: #ближе + #автоматизирую_себя · Форматы: TG (+ВК, MAX) · Сторис</w:t>
+      </w:r>
+      <w:r>
+        <w:t xml:space="preserve"> </w:t>
+      </w:r>
+      <w:r>
+        <w:t xml:space="preserve">Время публикации: 11:00–12:00</w:t>
+      </w:r>
+    </w:p>
+    <w:p>
+      <w:pPr>
+        <w:pStyle w:val="BodyText"/>
+      </w:pPr>
+      <w:r>
+        <w:t xml:space="preserve">❓ Шаблон: поля в [квадратных скобках] заполняем в субботу вечером вашими реальными цифрами. Если чего-то нет — выкидываем пункт, не выдумываем.</w:t>
+      </w:r>
+    </w:p>
+    <w:p>
+      <w:r>
+        <w:pict>
+          <v:rect style="width:0;height:1.5pt" o:hralign="center" o:hrstd="t" o:hr="t"/>
+        </w:pict>
+      </w:r>
+    </w:p>
+    <w:bookmarkStart w:id="47" w:name="telegram-3"/>
+    <w:p>
+      <w:pPr>
+        <w:pStyle w:val="Heading2"/>
+      </w:pPr>
+      <w:r>
+        <w:t xml:space="preserve">Telegram</w:t>
+      </w:r>
+    </w:p>
+    <w:p>
+      <w:pPr>
+        <w:pStyle w:val="FirstParagraph"/>
+      </w:pPr>
+      <w:r>
+        <w:rPr>
+          <w:b/>
+          <w:bCs/>
+        </w:rPr>
+        <w:t xml:space="preserve">Неделя 1 эксперимента. Честные цифры</w:t>
+      </w:r>
+    </w:p>
+    <w:p>
+      <w:pPr>
+        <w:pStyle w:val="BodyText"/>
+      </w:pPr>
+      <w:r>
+        <w:t xml:space="preserve">Обещал считать — считаю.</w:t>
+      </w:r>
+    </w:p>
+    <w:p>
+      <w:pPr>
+        <w:pStyle w:val="BodyText"/>
+      </w:pPr>
+      <w:r>
+        <w:t xml:space="preserve">📊</w:t>
+      </w:r>
+      <w:r>
+        <w:t xml:space="preserve"> </w:t>
+      </w:r>
+      <w:r>
+        <w:rPr>
+          <w:b/>
+          <w:bCs/>
+        </w:rPr>
+        <w:t xml:space="preserve">Было / стало:</w:t>
+      </w:r>
+      <w:r>
+        <w:t xml:space="preserve"> </w:t>
+      </w:r>
+      <w:r>
+        <w:t xml:space="preserve">▫️ Постов в канале за неделю: 0 → [4]</w:t>
+      </w:r>
+      <w:r>
+        <w:t xml:space="preserve"> </w:t>
+      </w:r>
+      <w:r>
+        <w:t xml:space="preserve">▫️ Времени на один пост: [~1,5 часа] → [~25 минут] (голосовое + правка черновика)</w:t>
+      </w:r>
+      <w:r>
+        <w:t xml:space="preserve"> </w:t>
+      </w:r>
+      <w:r>
+        <w:t xml:space="preserve">▫️ Экранное время в мессенджерах: [X ч] в день → [Y ч]</w:t>
+      </w:r>
+      <w:r>
+        <w:t xml:space="preserve"> </w:t>
+      </w:r>
+      <w:r>
+        <w:t xml:space="preserve">▫️ Подписчиков: 131 → [N]</w:t>
+      </w:r>
+    </w:p>
+    <w:p>
+      <w:pPr>
+        <w:pStyle w:val="BodyText"/>
+      </w:pPr>
+      <w:r>
+        <w:t xml:space="preserve">✅</w:t>
+      </w:r>
+      <w:r>
+        <w:t xml:space="preserve"> </w:t>
+      </w:r>
+      <w:r>
+        <w:rPr>
+          <w:b/>
+          <w:bCs/>
+        </w:rPr>
+        <w:t xml:space="preserve">Что сработало:</w:t>
+      </w:r>
+      <w:r>
+        <w:t xml:space="preserve"> </w:t>
+      </w:r>
+      <w:r>
+        <w:t xml:space="preserve">[голосовые вместо набора текста: говорю в машине, текст готов к приезду].</w:t>
+      </w:r>
+    </w:p>
+    <w:p>
+      <w:pPr>
+        <w:pStyle w:val="BodyText"/>
+      </w:pPr>
+      <w:r>
+        <w:t xml:space="preserve">❌</w:t>
+      </w:r>
+      <w:r>
+        <w:t xml:space="preserve"> </w:t>
+      </w:r>
+      <w:r>
+        <w:rPr>
+          <w:b/>
+          <w:bCs/>
+        </w:rPr>
+        <w:t xml:space="preserve">Что не сработало:</w:t>
+      </w:r>
+      <w:r>
+        <w:t xml:space="preserve"> </w:t>
+      </w:r>
+      <w:r>
+        <w:t xml:space="preserve">[пример: автоответы в рабочем чате. Выключил через день, люди обижались, что им отвечает бот. Хороший урок: там, где ждут вас, машину не подсунешь].</w:t>
+      </w:r>
+    </w:p>
+    <w:p>
+      <w:pPr>
+        <w:pStyle w:val="BodyText"/>
+      </w:pPr>
+      <w:r>
+        <w:t xml:space="preserve">🔜</w:t>
+      </w:r>
+      <w:r>
+        <w:t xml:space="preserve"> </w:t>
+      </w:r>
+      <w:r>
+        <w:rPr>
+          <w:b/>
+          <w:bCs/>
+        </w:rPr>
+        <w:t xml:space="preserve">Следующая неделя:</w:t>
+      </w:r>
+      <w:r>
+        <w:t xml:space="preserve"> </w:t>
+      </w:r>
+      <w:r>
+        <w:t xml:space="preserve">протоколы встреч. После каждой встречи — голосовое, ИИ делает протокол и список задач. Посмотрим, сколько это экономит.</w:t>
+      </w:r>
+    </w:p>
+    <w:p>
+      <w:pPr>
+        <w:pStyle w:val="BodyText"/>
+      </w:pPr>
+      <w:r>
+        <w:t xml:space="preserve">А теперь личное. [1–2 абзаца о выходных: семья, дочь, прогулка, что-то, что заметили. Надиктуйте в субботу, как про альпак. Например: чем занимались на выходных, в чём поймали себя на мысли].</w:t>
+      </w:r>
+    </w:p>
+    <w:p>
+      <w:pPr>
+        <w:pStyle w:val="BodyText"/>
+      </w:pPr>
+      <w:r>
+        <w:t xml:space="preserve">Хороших выходных! Как у вас прошла неделя?</w:t>
+      </w:r>
+    </w:p>
+    <w:p>
+      <w:pPr>
+        <w:pStyle w:val="BodyText"/>
+      </w:pPr>
+      <w:r>
+        <w:t xml:space="preserve">#ближе #автоматизирую_себя</w:t>
+      </w:r>
+    </w:p>
+    <w:p>
+      <w:r>
+        <w:pict>
+          <v:rect style="width:0;height:1.5pt" o:hralign="center" o:hrstd="t" o:hr="t"/>
+        </w:pict>
+      </w:r>
+    </w:p>
+    <w:bookmarkEnd w:id="47"/>
+    <w:bookmarkStart w:id="48" w:name="сторис-статусы-tg-3"/>
+    <w:p>
+      <w:pPr>
+        <w:pStyle w:val="Heading2"/>
+      </w:pPr>
+      <w:r>
+        <w:t xml:space="preserve">Сторис / статусы TG</w:t>
+      </w:r>
+    </w:p>
+    <w:p>
+      <w:pPr>
+        <w:pStyle w:val="FirstParagraph"/>
+      </w:pPr>
+      <w:r>
+        <w:rPr>
+          <w:b/>
+          <w:bCs/>
+        </w:rPr>
+        <w:t xml:space="preserve">Сб 03.10</w:t>
+      </w:r>
+      <w:r>
+        <w:t xml:space="preserve"> </w:t>
+      </w:r>
+      <w:r>
+        <w:t xml:space="preserve">1. Живое с выходных, без текста или одной фразой (семья, прогулка, еда).</w:t>
+      </w:r>
+    </w:p>
+    <w:p>
+      <w:pPr>
+        <w:pStyle w:val="BodyText"/>
+      </w:pPr>
+      <w:r>
+        <w:rPr>
+          <w:b/>
+          <w:bCs/>
+        </w:rPr>
+        <w:t xml:space="preserve">Вс 04.10</w:t>
+      </w:r>
+      <w:r>
+        <w:t xml:space="preserve"> </w:t>
+      </w:r>
+      <w:r>
+        <w:t xml:space="preserve">2. «Неделя 1: [4] поста вместо 0. Подробности в канале» + ссылка.</w:t>
+      </w:r>
+      <w:r>
+        <w:t xml:space="preserve"> </w:t>
+      </w:r>
+      <w:r>
+        <w:t xml:space="preserve">3. Ящик вопросов: «Что вы хотите, чтобы я попробовал автоматизировать?» — ответы пойдут в темы следующих недель.</w:t>
+      </w:r>
+    </w:p>
+    <w:p>
+      <w:pPr>
+        <w:pStyle w:val="BodyText"/>
+      </w:pPr>
+      <w:r>
+        <w:rPr>
+          <w:b/>
+          <w:bCs/>
+        </w:rPr>
+        <w:t xml:space="preserve">День защиты животных (4.10):</w:t>
+      </w:r>
+      <w:r>
+        <w:t xml:space="preserve"> </w:t>
+      </w:r>
+      <w:r>
+        <w:t xml:space="preserve">если осталось фото альпак — «Кстати, сегодня День защиты животных. Альпаки передают привет» 🦙</w:t>
+      </w:r>
+    </w:p>
+    <w:p>
+      <w:r>
+        <w:pict>
+          <v:rect style="width:0;height:1.5pt" o:hralign="center" o:hrstd="t" o:hr="t"/>
+        </w:pict>
+      </w:r>
+    </w:p>
+    <w:bookmarkEnd w:id="48"/>
+    <w:bookmarkStart w:id="49" w:name="что-нужно-от-вас-к-субботе"/>
+    <w:p>
+      <w:pPr>
+        <w:pStyle w:val="Heading2"/>
+      </w:pPr>
+      <w:r>
+        <w:t xml:space="preserve">Что нужно от вас к субботе</w:t>
       </w:r>
     </w:p>
     <w:p>
@@ -7389,7 +7633,7 @@
         </w:numPr>
       </w:pPr>
       <w:r>
-        <w:t xml:space="preserve">Опрос: «Сможет ли ваш бизнес/отдел две недели без вас?» — Да, спокойно / Со скрипом / Лучше не проверять 😅</w:t>
+        <w:t xml:space="preserve">Цифры: пост в среднем (время), экранное время, подписчики.</w:t>
       </w:r>
     </w:p>
     <w:p>
@@ -7401,7 +7645,19 @@
         </w:numPr>
       </w:pPr>
       <w:r>
-        <w:t xml:space="preserve">Ссылка на пост.</w:t>
+        <w:t xml:space="preserve">Одно, что сработало, и одно, что нет.</w:t>
+      </w:r>
+    </w:p>
+    <w:p>
+      <w:pPr>
+        <w:pStyle w:val="Compact"/>
+        <w:numPr>
+          <w:ilvl w:val="0"/>
+          <w:numId w:val="1016"/>
+        </w:numPr>
+      </w:pPr>
+      <w:r>
+        <w:t xml:space="preserve">Голосовое 2–3 минуты про выходные.</w:t>
       </w:r>
     </w:p>
     <w:p>
@@ -7409,15 +7665,15 @@
         <w:br w:type="page"/>
       </w:r>
     </w:p>
-    <w:bookmarkEnd w:id="45"/>
-    <w:bookmarkEnd w:id="46"/>
-    <w:bookmarkStart w:id="50" w:name="вс-04.10-итоги-первой-недели"/>
+    <w:bookmarkEnd w:id="49"/>
+    <w:bookmarkEnd w:id="50"/>
+    <w:bookmarkStart w:id="55" w:name="ср-07.10-бот-задач"/>
     <w:p>
       <w:pPr>
         <w:pStyle w:val="Heading1"/>
       </w:pPr>
       <w:r>
-        <w:t xml:space="preserve">04 · Вс 04.10 · Итоги первой недели</w:t>
+        <w:t xml:space="preserve">05 · Ср 07.10 · Бот задач</w:t>
       </w:r>
     </w:p>
     <w:p>
@@ -7425,13 +7681,19 @@
         <w:pStyle w:val="FirstParagraph"/>
       </w:pPr>
       <w:r>
-        <w:t xml:space="preserve">Рубрика: #ближе + #автоматизирую_себя · Форматы: TG (+ВК, MAX) · Сторис</w:t>
-      </w:r>
-      <w:r>
-        <w:t xml:space="preserve"> </w:t>
-      </w:r>
-      <w:r>
-        <w:t xml:space="preserve">Время публикации: 11:00–12:00</w:t>
+        <w:t xml:space="preserve">Рубрика: #автоматизирую_себя · Форматы: TG (+ВК, MAX) · Reels · Карусель IG · Сторис</w:t>
+      </w:r>
+      <w:r>
+        <w:t xml:space="preserve"> </w:t>
+      </w:r>
+      <w:r>
+        <w:t xml:space="preserve">Время публикации: 12:30</w:t>
+      </w:r>
+      <w:r>
+        <w:t xml:space="preserve"> </w:t>
+      </w:r>
+      <w:r>
+        <w:t xml:space="preserve">Основа: слайд 11 презентации стартап-завтрака («Приём директора завода»), продукт «бот задач» с сайта (v3).</w:t>
       </w:r>
     </w:p>
     <w:p>
@@ -7439,7 +7701,7 @@
         <w:pStyle w:val="BodyText"/>
       </w:pPr>
       <w:r>
-        <w:t xml:space="preserve">❓ Шаблон: поля в [квадратных скобках] заполняем в субботу вечером вашими реальными цифрами. Если чего-то нет — выкидываем пункт, не выдумываем.</w:t>
+        <w:t xml:space="preserve">❓ Проверить: у кого вы подсмотрели приём (можно назвать завод/директора или оставить анонимно), с какого числа бот работает у вас, сколько людей им пользуется («На месте (23)» на скрине).</w:t>
       </w:r>
     </w:p>
     <w:p>
@@ -7449,7 +7711,7 @@
         </w:pict>
       </w:r>
     </w:p>
-    <w:bookmarkStart w:id="47" w:name="telegram-3"/>
+    <w:bookmarkStart w:id="51" w:name="telegram-4"/>
     <w:p>
       <w:pPr>
         <w:pStyle w:val="Heading2"/>
@@ -7467,7 +7729,7 @@
           <w:b/>
           <w:bCs/>
         </w:rPr>
-        <w:t xml:space="preserve">Неделя 1 эксперимента. Честные цифры</w:t>
+        <w:t xml:space="preserve">«Спрашивает механизм, а не я»</w:t>
       </w:r>
     </w:p>
     <w:p>
@@ -7475,7 +7737,7 @@
         <w:pStyle w:val="BodyText"/>
       </w:pPr>
       <w:r>
-        <w:t xml:space="preserve">Обещал считать — считаю.</w:t>
+        <w:t xml:space="preserve">Больше всего времени руководитель тратит не на решения, а на вопрос «ну что, как там?».</w:t>
       </w:r>
     </w:p>
     <w:p>
@@ -7483,369 +7745,7 @@
         <w:pStyle w:val="BodyText"/>
       </w:pPr>
       <w:r>
-        <w:t xml:space="preserve">📊</w:t>
-      </w:r>
-      <w:r>
-        <w:t xml:space="preserve"> </w:t>
-      </w:r>
-      <w:r>
-        <w:rPr>
-          <w:b/>
-          <w:bCs/>
-        </w:rPr>
-        <w:t xml:space="preserve">Было / стало:</w:t>
-      </w:r>
-      <w:r>
-        <w:t xml:space="preserve"> </w:t>
-      </w:r>
-      <w:r>
-        <w:t xml:space="preserve">▫️ Постов в канале за неделю: 0 → [4]</w:t>
-      </w:r>
-      <w:r>
-        <w:t xml:space="preserve"> </w:t>
-      </w:r>
-      <w:r>
-        <w:t xml:space="preserve">▫️ Времени на один пост: [~1,5 часа] → [~25 минут] (голосовое + правка черновика)</w:t>
-      </w:r>
-      <w:r>
-        <w:t xml:space="preserve"> </w:t>
-      </w:r>
-      <w:r>
-        <w:t xml:space="preserve">▫️ Экранное время в мессенджерах: [X ч] в день → [Y ч]</w:t>
-      </w:r>
-      <w:r>
-        <w:t xml:space="preserve"> </w:t>
-      </w:r>
-      <w:r>
-        <w:t xml:space="preserve">▫️ Подписчиков: 131 → [N]</w:t>
-      </w:r>
-    </w:p>
-    <w:p>
-      <w:pPr>
-        <w:pStyle w:val="BodyText"/>
-      </w:pPr>
-      <w:r>
-        <w:t xml:space="preserve">✅</w:t>
-      </w:r>
-      <w:r>
-        <w:t xml:space="preserve"> </w:t>
-      </w:r>
-      <w:r>
-        <w:rPr>
-          <w:b/>
-          <w:bCs/>
-        </w:rPr>
-        <w:t xml:space="preserve">Что сработало:</w:t>
-      </w:r>
-      <w:r>
-        <w:t xml:space="preserve"> </w:t>
-      </w:r>
-      <w:r>
-        <w:t xml:space="preserve">[голосовые вместо набора текста: говорю в машине, текст готов к приезду].</w:t>
-      </w:r>
-    </w:p>
-    <w:p>
-      <w:pPr>
-        <w:pStyle w:val="BodyText"/>
-      </w:pPr>
-      <w:r>
-        <w:t xml:space="preserve">❌</w:t>
-      </w:r>
-      <w:r>
-        <w:t xml:space="preserve"> </w:t>
-      </w:r>
-      <w:r>
-        <w:rPr>
-          <w:b/>
-          <w:bCs/>
-        </w:rPr>
-        <w:t xml:space="preserve">Что не сработало:</w:t>
-      </w:r>
-      <w:r>
-        <w:t xml:space="preserve"> </w:t>
-      </w:r>
-      <w:r>
-        <w:t xml:space="preserve">[пример: автоответы в рабочем чате. Выключил через день, люди обижались, что им отвечает бот. Хороший урок: там, где ждут вас, машину не подсунешь].</w:t>
-      </w:r>
-    </w:p>
-    <w:p>
-      <w:pPr>
-        <w:pStyle w:val="BodyText"/>
-      </w:pPr>
-      <w:r>
-        <w:t xml:space="preserve">🔜</w:t>
-      </w:r>
-      <w:r>
-        <w:t xml:space="preserve"> </w:t>
-      </w:r>
-      <w:r>
-        <w:rPr>
-          <w:b/>
-          <w:bCs/>
-        </w:rPr>
-        <w:t xml:space="preserve">Следующая неделя:</w:t>
-      </w:r>
-      <w:r>
-        <w:t xml:space="preserve"> </w:t>
-      </w:r>
-      <w:r>
-        <w:t xml:space="preserve">протоколы встреч. После каждой встречи — голосовое, ИИ делает протокол и список задач. Посмотрим, сколько это экономит.</w:t>
-      </w:r>
-    </w:p>
-    <w:p>
-      <w:pPr>
-        <w:pStyle w:val="BodyText"/>
-      </w:pPr>
-      <w:r>
-        <w:t xml:space="preserve">А теперь личное. [1–2 абзаца о выходных: семья, дочь, прогулка, что-то, что заметили. Надиктуйте в субботу, как про альпак. Например: чем занимались на выходных, в чём поймали себя на мысли].</w:t>
-      </w:r>
-    </w:p>
-    <w:p>
-      <w:pPr>
-        <w:pStyle w:val="BodyText"/>
-      </w:pPr>
-      <w:r>
-        <w:t xml:space="preserve">Хороших выходных! Как у вас прошла неделя?</w:t>
-      </w:r>
-    </w:p>
-    <w:p>
-      <w:pPr>
-        <w:pStyle w:val="BodyText"/>
-      </w:pPr>
-      <w:r>
-        <w:t xml:space="preserve">#ближе #автоматизирую_себя</w:t>
-      </w:r>
-    </w:p>
-    <w:p>
-      <w:r>
-        <w:pict>
-          <v:rect style="width:0;height:1.5pt" o:hralign="center" o:hrstd="t" o:hr="t"/>
-        </w:pict>
-      </w:r>
-    </w:p>
-    <w:bookmarkEnd w:id="47"/>
-    <w:bookmarkStart w:id="48" w:name="сторис-статусы-tg-3"/>
-    <w:p>
-      <w:pPr>
-        <w:pStyle w:val="Heading2"/>
-      </w:pPr>
-      <w:r>
-        <w:t xml:space="preserve">Сторис / статусы TG</w:t>
-      </w:r>
-    </w:p>
-    <w:p>
-      <w:pPr>
-        <w:pStyle w:val="FirstParagraph"/>
-      </w:pPr>
-      <w:r>
-        <w:rPr>
-          <w:b/>
-          <w:bCs/>
-        </w:rPr>
-        <w:t xml:space="preserve">Сб 03.10</w:t>
-      </w:r>
-      <w:r>
-        <w:t xml:space="preserve"> </w:t>
-      </w:r>
-      <w:r>
-        <w:t xml:space="preserve">1. Живое с выходных, без текста или одной фразой (семья, прогулка, еда).</w:t>
-      </w:r>
-    </w:p>
-    <w:p>
-      <w:pPr>
-        <w:pStyle w:val="BodyText"/>
-      </w:pPr>
-      <w:r>
-        <w:rPr>
-          <w:b/>
-          <w:bCs/>
-        </w:rPr>
-        <w:t xml:space="preserve">Вс 04.10</w:t>
-      </w:r>
-      <w:r>
-        <w:t xml:space="preserve"> </w:t>
-      </w:r>
-      <w:r>
-        <w:t xml:space="preserve">2. «Неделя 1: [4] поста вместо 0. Подробности в канале» + ссылка.</w:t>
-      </w:r>
-      <w:r>
-        <w:t xml:space="preserve"> </w:t>
-      </w:r>
-      <w:r>
-        <w:t xml:space="preserve">3. Ящик вопросов: «Что вы хотите, чтобы я попробовал автоматизировать?» — ответы пойдут в темы следующих недель.</w:t>
-      </w:r>
-    </w:p>
-    <w:p>
-      <w:pPr>
-        <w:pStyle w:val="BodyText"/>
-      </w:pPr>
-      <w:r>
-        <w:rPr>
-          <w:b/>
-          <w:bCs/>
-        </w:rPr>
-        <w:t xml:space="preserve">День защиты животных (4.10):</w:t>
-      </w:r>
-      <w:r>
-        <w:t xml:space="preserve"> </w:t>
-      </w:r>
-      <w:r>
-        <w:t xml:space="preserve">если осталось фото альпак — «Кстати, сегодня День защиты животных. Альпаки передают привет» 🦙</w:t>
-      </w:r>
-    </w:p>
-    <w:p>
-      <w:r>
-        <w:pict>
-          <v:rect style="width:0;height:1.5pt" o:hralign="center" o:hrstd="t" o:hr="t"/>
-        </w:pict>
-      </w:r>
-    </w:p>
-    <w:bookmarkEnd w:id="48"/>
-    <w:bookmarkStart w:id="49" w:name="что-нужно-от-вас-к-субботе"/>
-    <w:p>
-      <w:pPr>
-        <w:pStyle w:val="Heading2"/>
-      </w:pPr>
-      <w:r>
-        <w:t xml:space="preserve">Что нужно от вас к субботе</w:t>
-      </w:r>
-    </w:p>
-    <w:p>
-      <w:pPr>
-        <w:pStyle w:val="Compact"/>
-        <w:numPr>
-          <w:ilvl w:val="0"/>
-          <w:numId w:val="1017"/>
-        </w:numPr>
-      </w:pPr>
-      <w:r>
-        <w:t xml:space="preserve">Цифры: пост в среднем (время), экранное время, подписчики.</w:t>
-      </w:r>
-    </w:p>
-    <w:p>
-      <w:pPr>
-        <w:pStyle w:val="Compact"/>
-        <w:numPr>
-          <w:ilvl w:val="0"/>
-          <w:numId w:val="1017"/>
-        </w:numPr>
-      </w:pPr>
-      <w:r>
-        <w:t xml:space="preserve">Одно, что сработало, и одно, что нет.</w:t>
-      </w:r>
-    </w:p>
-    <w:p>
-      <w:pPr>
-        <w:pStyle w:val="Compact"/>
-        <w:numPr>
-          <w:ilvl w:val="0"/>
-          <w:numId w:val="1017"/>
-        </w:numPr>
-      </w:pPr>
-      <w:r>
-        <w:t xml:space="preserve">Голосовое 2–3 минуты про выходные.</w:t>
-      </w:r>
-    </w:p>
-    <w:p>
-      <w:r>
-        <w:br w:type="page"/>
-      </w:r>
-    </w:p>
-    <w:bookmarkEnd w:id="49"/>
-    <w:bookmarkEnd w:id="50"/>
-    <w:bookmarkStart w:id="55" w:name="ср-07.10-бот-задач"/>
-    <w:p>
-      <w:pPr>
-        <w:pStyle w:val="Heading1"/>
-      </w:pPr>
-      <w:r>
-        <w:t xml:space="preserve">05 · Ср 07.10 · Бот задач</w:t>
-      </w:r>
-    </w:p>
-    <w:p>
-      <w:pPr>
-        <w:pStyle w:val="FirstParagraph"/>
-      </w:pPr>
-      <w:r>
-        <w:t xml:space="preserve">Рубрика: #автоматизирую_себя · Форматы: TG (+ВК, MAX) · Reels · Карусель IG · Сторис</w:t>
-      </w:r>
-      <w:r>
-        <w:t xml:space="preserve"> </w:t>
-      </w:r>
-      <w:r>
-        <w:t xml:space="preserve">Время публикации: 12:30</w:t>
-      </w:r>
-      <w:r>
-        <w:t xml:space="preserve"> </w:t>
-      </w:r>
-      <w:r>
-        <w:t xml:space="preserve">Основа: слайд 11 презентации стартап-завтрака («Приём директора завода»), продукт «бот задач» с сайта (v3).</w:t>
-      </w:r>
-    </w:p>
-    <w:p>
-      <w:pPr>
-        <w:pStyle w:val="BodyText"/>
-      </w:pPr>
-      <w:r>
-        <w:t xml:space="preserve">❓ Проверить: у кого вы подсмотрели приём (можно назвать завод/директора или оставить анонимно), с какого числа бот работает у вас, сколько людей им пользуется («На месте (23)» на скрине).</w:t>
-      </w:r>
-    </w:p>
-    <w:p>
-      <w:r>
-        <w:pict>
-          <v:rect style="width:0;height:1.5pt" o:hralign="center" o:hrstd="t" o:hr="t"/>
-        </w:pict>
-      </w:r>
-    </w:p>
-    <w:bookmarkStart w:id="51" w:name="telegram-4"/>
-    <w:p>
-      <w:pPr>
-        <w:pStyle w:val="Heading2"/>
-      </w:pPr>
-      <w:r>
-        <w:t xml:space="preserve">Telegram</w:t>
-      </w:r>
-    </w:p>
-    <w:p>
-      <w:pPr>
-        <w:pStyle w:val="FirstParagraph"/>
-      </w:pPr>
-      <w:r>
-        <w:rPr>
-          <w:b/>
-          <w:bCs/>
-        </w:rPr>
-        <w:t xml:space="preserve">«Спрашивает механизм, а не я». Как один приём директора завода сэкономил мне часы</w:t>
-      </w:r>
-    </w:p>
-    <w:p>
-      <w:pPr>
-        <w:pStyle w:val="BodyText"/>
-      </w:pPr>
-      <w:r>
-        <w:t xml:space="preserve">Знаете, на что уходит больше всего времени руководителя? Не на решения. На вопросы «ну что, как там?».</w:t>
-      </w:r>
-    </w:p>
-    <w:p>
-      <w:pPr>
-        <w:pStyle w:val="BodyText"/>
-      </w:pPr>
-      <w:r>
-        <w:t xml:space="preserve">Как там отчёт, как там договор, как там подрядчик. Каждый такой вопрос — пять минут. Умножьте на команду и на рабочий день.</w:t>
-      </w:r>
-    </w:p>
-    <w:p>
-      <w:pPr>
-        <w:pStyle w:val="BodyText"/>
-      </w:pPr>
-      <w:r>
-        <w:t xml:space="preserve">Однажды я увидел, как это решил директор одного завода. Приём простой до неприличия:</w:t>
-      </w:r>
-      <w:r>
-        <w:t xml:space="preserve"> </w:t>
-      </w:r>
-      <w:r>
-        <w:t xml:space="preserve">▫️</w:t>
+        <w:t xml:space="preserve">Директор одного завода решил это просто:</w:t>
       </w:r>
       <w:r>
         <w:t xml:space="preserve"> </w:t>
@@ -7861,13 +7761,7 @@
         <w:t xml:space="preserve"> </w:t>
       </w:r>
       <w:r>
-        <w:t xml:space="preserve">каждый сотрудник пишет 3 задачи на день;</w:t>
-      </w:r>
-      <w:r>
-        <w:t xml:space="preserve"> </w:t>
-      </w:r>
-      <w:r>
-        <w:t xml:space="preserve">▫️</w:t>
+        <w:t xml:space="preserve">каждый пишет 3 задачи на день,</w:t>
       </w:r>
       <w:r>
         <w:t xml:space="preserve"> </w:t>
@@ -7883,7 +7777,7 @@
         <w:t xml:space="preserve"> </w:t>
       </w:r>
       <w:r>
-        <w:t xml:space="preserve">отмечает, что выполнено.</w:t>
+        <w:t xml:space="preserve">— что выполнено. Без планёрок.</w:t>
       </w:r>
     </w:p>
     <w:p>
@@ -7891,7 +7785,7 @@
         <w:pStyle w:val="BodyText"/>
       </w:pPr>
       <w:r>
-        <w:t xml:space="preserve">Всё. Никаких планёрок про «кто чем занят».</w:t>
+        <w:t xml:space="preserve">Я забрал приём себе и добавил ИИ. Теперь в Telegram работает бот задач: утром собирает задачи, вечером спрашивает результат. А если задача расплывчатая («поработать с документами»), ИИ подсказывает, как сделать её конкретной: что, к какому сроку, какой результат.</w:t>
       </w:r>
     </w:p>
     <w:p>
@@ -7899,33 +7793,7 @@
         <w:pStyle w:val="BodyText"/>
       </w:pPr>
       <w:r>
-        <w:t xml:space="preserve">Я забрал этот приём себе и добавил ИИ. Теперь у нас в Telegram работает бот задач:</w:t>
-      </w:r>
-      <w:r>
-        <w:t xml:space="preserve"> </w:t>
-      </w:r>
-      <w:r>
-        <w:t xml:space="preserve">1. Утром он здоровается и собирает задачи: кто на месте, кто что делает.</w:t>
-      </w:r>
-      <w:r>
-        <w:t xml:space="preserve"> </w:t>
-      </w:r>
-      <w:r>
-        <w:t xml:space="preserve">2. Если задача сформулирована расплывчато («поработать с документами»), ИИ подсказывает, как сделать её конкретной: что именно, к какому сроку, какой результат.</w:t>
-      </w:r>
-      <w:r>
-        <w:t xml:space="preserve"> </w:t>
-      </w:r>
-      <w:r>
-        <w:t xml:space="preserve">3. Вечером бот спрашивает, что сделано. Сотрудники видят результат своего дня. Я тоже.</w:t>
-      </w:r>
-    </w:p>
-    <w:p>
-      <w:pPr>
-        <w:pStyle w:val="BodyText"/>
-      </w:pPr>
-      <w:r>
-        <w:t xml:space="preserve">Главное изменение не в экономии времени, хотя и она есть.</w:t>
+        <w:t xml:space="preserve">Главное —</w:t>
       </w:r>
       <w:r>
         <w:t xml:space="preserve"> </w:t>
@@ -7935,13 +7803,13 @@
           <w:b/>
           <w:bCs/>
         </w:rPr>
-        <w:t xml:space="preserve">Спрашивает механизм, а не я.</w:t>
-      </w:r>
-      <w:r>
-        <w:t xml:space="preserve"> </w:t>
-      </w:r>
-      <w:r>
-        <w:t xml:space="preserve">Я перестал быть человеком, который «дёргает». Договорённость живёт в системе, а не в моей голове.</w:t>
+        <w:t xml:space="preserve">дёргает механизм, а не я.</w:t>
+      </w:r>
+      <w:r>
+        <w:t xml:space="preserve"> </w:t>
+      </w:r>
+      <w:r>
+        <w:t xml:space="preserve">Договорённость живёт в системе, а не в моей голове. А люди начали сами точнее формулировать задачи.</w:t>
       </w:r>
     </w:p>
     <w:p>
@@ -7949,15 +7817,7 @@
         <w:pStyle w:val="BodyText"/>
       </w:pPr>
       <w:r>
-        <w:t xml:space="preserve">И неожиданный эффект: люди начали сами лучше формулировать задачи. Когда каждый день пишешь «составить акты на списание до 15:00», а не «акты», голова работает иначе.</w:t>
-      </w:r>
-    </w:p>
-    <w:p>
-      <w:pPr>
-        <w:pStyle w:val="BodyText"/>
-      </w:pPr>
-      <w:r>
-        <w:t xml:space="preserve">А как у вас: планёрки, чаты, таблицы? Кто в вашей команде задаёт вопрос «ну что, как там?»</w:t>
+        <w:t xml:space="preserve">Кто в вашей команде задаёт вопрос «ну что, как там?»</w:t>
       </w:r>
     </w:p>
     <w:p>
@@ -8352,11 +8212,127 @@
         <w:pStyle w:val="Compact"/>
         <w:numPr>
           <w:ilvl w:val="0"/>
-          <w:numId w:val="1018"/>
+          <w:numId w:val="1017"/>
         </w:numPr>
       </w:pPr>
       <w:r>
         <w:t xml:space="preserve">«Бот задач: утром 3 задачи, вечером отчёт» + фото/скрин.</w:t>
+      </w:r>
+    </w:p>
+    <w:p>
+      <w:pPr>
+        <w:pStyle w:val="Compact"/>
+        <w:numPr>
+          <w:ilvl w:val="0"/>
+          <w:numId w:val="1017"/>
+        </w:numPr>
+      </w:pPr>
+      <w:r>
+        <w:t xml:space="preserve">«Проблема: руководитель тратит часы на</w:t>
+      </w:r>
+      <w:r>
+        <w:t xml:space="preserve"> </w:t>
+      </w:r>
+      <w:r>
+        <w:t xml:space="preserve">“ну что, как там?”</w:t>
+      </w:r>
+      <w:r>
+        <w:t xml:space="preserve">»</w:t>
+      </w:r>
+    </w:p>
+    <w:p>
+      <w:pPr>
+        <w:pStyle w:val="Compact"/>
+        <w:numPr>
+          <w:ilvl w:val="0"/>
+          <w:numId w:val="1017"/>
+        </w:numPr>
+      </w:pPr>
+      <w:r>
+        <w:t xml:space="preserve">«Приём директора завода: утром каждый пишет 3 задачи. Вечером отмечает, что выполнено.»</w:t>
+      </w:r>
+    </w:p>
+    <w:p>
+      <w:pPr>
+        <w:pStyle w:val="Compact"/>
+        <w:numPr>
+          <w:ilvl w:val="0"/>
+          <w:numId w:val="1017"/>
+        </w:numPr>
+      </w:pPr>
+      <w:r>
+        <w:t xml:space="preserve">«+ ИИ: помогает сформулировать задачу конкретно.</w:t>
+      </w:r>
+      <w:r>
+        <w:t xml:space="preserve"> </w:t>
+      </w:r>
+      <w:r>
+        <w:t xml:space="preserve">“Поработать с документами”</w:t>
+      </w:r>
+      <w:r>
+        <w:t xml:space="preserve"> </w:t>
+      </w:r>
+      <w:r>
+        <w:t xml:space="preserve">→</w:t>
+      </w:r>
+      <w:r>
+        <w:t xml:space="preserve"> </w:t>
+      </w:r>
+      <w:r>
+        <w:t xml:space="preserve">“Составить акты на списание до 15:00”</w:t>
+      </w:r>
+      <w:r>
+        <w:t xml:space="preserve">.»</w:t>
+      </w:r>
+    </w:p>
+    <w:p>
+      <w:pPr>
+        <w:pStyle w:val="Compact"/>
+        <w:numPr>
+          <w:ilvl w:val="0"/>
+          <w:numId w:val="1017"/>
+        </w:numPr>
+      </w:pPr>
+      <w:r>
+        <w:t xml:space="preserve">«Результат: спрашивает механизм, а не я. Люди видят результат своего дня.»</w:t>
+      </w:r>
+    </w:p>
+    <w:p>
+      <w:pPr>
+        <w:pStyle w:val="Compact"/>
+        <w:numPr>
+          <w:ilvl w:val="0"/>
+          <w:numId w:val="1017"/>
+        </w:numPr>
+      </w:pPr>
+      <w:r>
+        <w:t xml:space="preserve">«Хотите такой бот для своей команды? Напишите в директ</w:t>
+      </w:r>
+      <w:r>
+        <w:t xml:space="preserve"> </w:t>
+      </w:r>
+      <w:r>
+        <w:t xml:space="preserve">“БОТ”</w:t>
+      </w:r>
+      <w:r>
+        <w:t xml:space="preserve">.»</w:t>
+      </w:r>
+    </w:p>
+    <w:p>
+      <w:r>
+        <w:pict>
+          <v:rect style="width:0;height:1.5pt" o:hralign="center" o:hrstd="t" o:hr="t"/>
+        </w:pict>
+      </w:r>
+    </w:p>
+    <w:bookmarkEnd w:id="53"/>
+    <w:bookmarkStart w:id="54" w:name="сторис-статусы-tg-4"/>
+    <w:p>
+      <w:pPr>
+        <w:pStyle w:val="Heading2"/>
+      </w:pPr>
+      <w:r>
+        <w:t xml:space="preserve">Сторис / статусы TG</w:t>
       </w:r>
     </w:p>
     <w:p>
@@ -8368,16 +8344,7 @@
         </w:numPr>
       </w:pPr>
       <w:r>
-        <w:t xml:space="preserve">«Проблема: руководитель тратит часы на</w:t>
-      </w:r>
-      <w:r>
-        <w:t xml:space="preserve"> </w:t>
-      </w:r>
-      <w:r>
-        <w:t xml:space="preserve">“ну что, как там?”</w:t>
-      </w:r>
-      <w:r>
-        <w:t xml:space="preserve">»</w:t>
+        <w:t xml:space="preserve">Скрин утреннего сообщения бота (с размытыми именами) + «Каждое утро в 9:00».</w:t>
       </w:r>
     </w:p>
     <w:p>
@@ -8389,7 +8356,16 @@
         </w:numPr>
       </w:pPr>
       <w:r>
-        <w:t xml:space="preserve">«Приём директора завода: утром каждый пишет 3 задачи. Вечером отмечает, что выполнено.»</w:t>
+        <w:t xml:space="preserve">«Сколько раз в день вы спрашиваете</w:t>
+      </w:r>
+      <w:r>
+        <w:t xml:space="preserve"> </w:t>
+      </w:r>
+      <w:r>
+        <w:t xml:space="preserve">“как там?”</w:t>
+      </w:r>
+      <w:r>
+        <w:t xml:space="preserve">» — слайдер-эмодзи 😩.</w:t>
       </w:r>
     </w:p>
     <w:p>
@@ -8401,122 +8377,6 @@
         </w:numPr>
       </w:pPr>
       <w:r>
-        <w:t xml:space="preserve">«+ ИИ: помогает сформулировать задачу конкретно.</w:t>
-      </w:r>
-      <w:r>
-        <w:t xml:space="preserve"> </w:t>
-      </w:r>
-      <w:r>
-        <w:t xml:space="preserve">“Поработать с документами”</w:t>
-      </w:r>
-      <w:r>
-        <w:t xml:space="preserve"> </w:t>
-      </w:r>
-      <w:r>
-        <w:t xml:space="preserve">→</w:t>
-      </w:r>
-      <w:r>
-        <w:t xml:space="preserve"> </w:t>
-      </w:r>
-      <w:r>
-        <w:t xml:space="preserve">“Составить акты на списание до 15:00”</w:t>
-      </w:r>
-      <w:r>
-        <w:t xml:space="preserve">.»</w:t>
-      </w:r>
-    </w:p>
-    <w:p>
-      <w:pPr>
-        <w:pStyle w:val="Compact"/>
-        <w:numPr>
-          <w:ilvl w:val="0"/>
-          <w:numId w:val="1018"/>
-        </w:numPr>
-      </w:pPr>
-      <w:r>
-        <w:t xml:space="preserve">«Результат: спрашивает механизм, а не я. Люди видят результат своего дня.»</w:t>
-      </w:r>
-    </w:p>
-    <w:p>
-      <w:pPr>
-        <w:pStyle w:val="Compact"/>
-        <w:numPr>
-          <w:ilvl w:val="0"/>
-          <w:numId w:val="1018"/>
-        </w:numPr>
-      </w:pPr>
-      <w:r>
-        <w:t xml:space="preserve">«Хотите такой бот для своей команды? Напишите в директ</w:t>
-      </w:r>
-      <w:r>
-        <w:t xml:space="preserve"> </w:t>
-      </w:r>
-      <w:r>
-        <w:t xml:space="preserve">“БОТ”</w:t>
-      </w:r>
-      <w:r>
-        <w:t xml:space="preserve">.»</w:t>
-      </w:r>
-    </w:p>
-    <w:p>
-      <w:r>
-        <w:pict>
-          <v:rect style="width:0;height:1.5pt" o:hralign="center" o:hrstd="t" o:hr="t"/>
-        </w:pict>
-      </w:r>
-    </w:p>
-    <w:bookmarkEnd w:id="53"/>
-    <w:bookmarkStart w:id="54" w:name="сторис-статусы-tg-4"/>
-    <w:p>
-      <w:pPr>
-        <w:pStyle w:val="Heading2"/>
-      </w:pPr>
-      <w:r>
-        <w:t xml:space="preserve">Сторис / статусы TG</w:t>
-      </w:r>
-    </w:p>
-    <w:p>
-      <w:pPr>
-        <w:pStyle w:val="Compact"/>
-        <w:numPr>
-          <w:ilvl w:val="0"/>
-          <w:numId w:val="1019"/>
-        </w:numPr>
-      </w:pPr>
-      <w:r>
-        <w:t xml:space="preserve">Скрин утреннего сообщения бота (с размытыми именами) + «Каждое утро в 9:00».</w:t>
-      </w:r>
-    </w:p>
-    <w:p>
-      <w:pPr>
-        <w:pStyle w:val="Compact"/>
-        <w:numPr>
-          <w:ilvl w:val="0"/>
-          <w:numId w:val="1019"/>
-        </w:numPr>
-      </w:pPr>
-      <w:r>
-        <w:t xml:space="preserve">«Сколько раз в день вы спрашиваете</w:t>
-      </w:r>
-      <w:r>
-        <w:t xml:space="preserve"> </w:t>
-      </w:r>
-      <w:r>
-        <w:t xml:space="preserve">“как там?”</w:t>
-      </w:r>
-      <w:r>
-        <w:t xml:space="preserve">» — слайдер-эмодзи 😩.</w:t>
-      </w:r>
-    </w:p>
-    <w:p>
-      <w:pPr>
-        <w:pStyle w:val="Compact"/>
-        <w:numPr>
-          <w:ilvl w:val="0"/>
-          <w:numId w:val="1019"/>
-        </w:numPr>
-      </w:pPr>
-      <w:r>
         <w:t xml:space="preserve">Ссылка на пост.</w:t>
       </w:r>
     </w:p>
@@ -8597,7 +8457,7 @@
         <w:pStyle w:val="BodyText"/>
       </w:pPr>
       <w:r>
-        <w:t xml:space="preserve">Правило 1 из 5 бизнеса без ручного управления:</w:t>
+        <w:t xml:space="preserve">Правило 1 из 5:</w:t>
       </w:r>
       <w:r>
         <w:t xml:space="preserve"> </w:t>
@@ -8615,31 +8475,7 @@
         <w:pStyle w:val="BodyText"/>
       </w:pPr>
       <w:r>
-        <w:t xml:space="preserve">Начну с истории.</w:t>
-      </w:r>
-    </w:p>
-    <w:p>
-      <w:pPr>
-        <w:pStyle w:val="BodyText"/>
-      </w:pPr>
-      <w:r>
-        <w:t xml:space="preserve">В компании был комплектовщик. По цифрам — плохой: собирал вдвое меньше нормы. Любой нормальный руководитель в такой ситуации думает об увольнении.</w:t>
-      </w:r>
-    </w:p>
-    <w:p>
-      <w:pPr>
-        <w:pStyle w:val="BodyText"/>
-      </w:pPr>
-      <w:r>
-        <w:t xml:space="preserve">Но выяснилось другое. Он постоянно приводил людей: знакомых, знакомых знакомых. И они оставались. Год компания жила без HR и без найма силами собственника — его стараниями.</w:t>
-      </w:r>
-    </w:p>
-    <w:p>
-      <w:pPr>
-        <w:pStyle w:val="BodyText"/>
-      </w:pPr>
-      <w:r>
-        <w:t xml:space="preserve">Плохой комплектовщик. Гениальный рекрутер.</w:t>
+        <w:t xml:space="preserve">Был в компании комплектовщик — по цифрам плохой, вдвое ниже нормы. Но он постоянно приводил людей, и они оставались. Год компания жила без HR — его стараниями.</w:t>
       </w:r>
     </w:p>
     <w:p>
@@ -8651,7 +8487,7 @@
           <w:b/>
           <w:bCs/>
         </w:rPr>
-        <w:t xml:space="preserve">Не рубите человека по одной цифре. Займите его тем, в чём его сила работает на общую цель.</w:t>
+        <w:t xml:space="preserve">Не рубите человека по одной цифре. Займите тем, где его сила работает на общую цель.</w:t>
       </w:r>
     </w:p>
     <w:p>
@@ -8659,61 +8495,73 @@
         <w:pStyle w:val="BodyText"/>
       </w:pPr>
       <w:r>
-        <w:t xml:space="preserve">Теперь само правило. Три вещи, которые я для себя вывел:</w:t>
-      </w:r>
-    </w:p>
-    <w:p>
-      <w:pPr>
-        <w:pStyle w:val="BodyText"/>
-      </w:pPr>
+        <w:t xml:space="preserve">Что ещё я для себя вывел:</w:t>
+      </w:r>
+      <w:r>
+        <w:t xml:space="preserve"> </w:t>
+      </w:r>
+      <w:r>
+        <w:t xml:space="preserve">▫️</w:t>
+      </w:r>
+      <w:r>
+        <w:t xml:space="preserve"> </w:t>
+      </w:r>
       <w:r>
         <w:rPr>
           <w:b/>
           <w:bCs/>
         </w:rPr>
-        <w:t xml:space="preserve">1. Видеть цель.</w:t>
-      </w:r>
-      <w:r>
-        <w:t xml:space="preserve"> </w:t>
-      </w:r>
-      <w:r>
-        <w:t xml:space="preserve">Кто видит цель — сам находит задачи. Кто видит только задачи — ждёт следующую от вас.</w:t>
-      </w:r>
-    </w:p>
-    <w:p>
-      <w:pPr>
-        <w:pStyle w:val="BodyText"/>
-      </w:pPr>
+        <w:t xml:space="preserve">Кто видит цель — сам находит задачи.</w:t>
+      </w:r>
+      <w:r>
+        <w:t xml:space="preserve"> </w:t>
+      </w:r>
+      <w:r>
+        <w:t xml:space="preserve">Кто видит только задачи — ждёт следующую.</w:t>
+      </w:r>
+      <w:r>
+        <w:t xml:space="preserve"> </w:t>
+      </w:r>
+      <w:r>
+        <w:t xml:space="preserve">▫️</w:t>
+      </w:r>
+      <w:r>
+        <w:t xml:space="preserve"> </w:t>
+      </w:r>
       <w:r>
         <w:rPr>
           <w:b/>
           <w:bCs/>
         </w:rPr>
-        <w:t xml:space="preserve">2. Отбирать, а не мотивировать.</w:t>
-      </w:r>
-      <w:r>
-        <w:t xml:space="preserve"> </w:t>
-      </w:r>
-      <w:r>
-        <w:t xml:space="preserve">Берите тех, у кого горит, и не мешайте. Переделать человека почти невозможно, а тратить на это силы руководителя — дорого.</w:t>
-      </w:r>
-    </w:p>
-    <w:p>
-      <w:pPr>
-        <w:pStyle w:val="BodyText"/>
-      </w:pPr>
+        <w:t xml:space="preserve">Отбирать, а не мотивировать.</w:t>
+      </w:r>
+      <w:r>
+        <w:t xml:space="preserve"> </w:t>
+      </w:r>
+      <w:r>
+        <w:t xml:space="preserve">Берите тех, у кого горит, и не мешайте.</w:t>
+      </w:r>
+      <w:r>
+        <w:t xml:space="preserve"> </w:t>
+      </w:r>
+      <w:r>
+        <w:t xml:space="preserve">▫️</w:t>
+      </w:r>
+      <w:r>
+        <w:t xml:space="preserve"> </w:t>
+      </w:r>
       <w:r>
         <w:rPr>
           <w:b/>
           <w:bCs/>
         </w:rPr>
-        <w:t xml:space="preserve">3. Нематериальное важнее.</w:t>
-      </w:r>
-      <w:r>
-        <w:t xml:space="preserve"> </w:t>
-      </w:r>
-      <w:r>
-        <w:t xml:space="preserve">Деньги удерживают, но не зажигают. Зажигают смысл, признание и ощущение, что ты делаешь что-то стоящее.</w:t>
+        <w:t xml:space="preserve">Деньги удерживают, но не зажигают.</w:t>
+      </w:r>
+      <w:r>
+        <w:t xml:space="preserve"> </w:t>
+      </w:r>
+      <w:r>
+        <w:t xml:space="preserve">Зажигают смысл и признание.</w:t>
       </w:r>
     </w:p>
     <w:p>
@@ -8721,25 +8569,7 @@
         <w:pStyle w:val="BodyText"/>
       </w:pPr>
       <w:r>
-        <w:t xml:space="preserve">Вопрос, который я задал залу на стартап-завтраке, задам и вам:</w:t>
-      </w:r>
-      <w:r>
-        <w:t xml:space="preserve"> </w:t>
-      </w:r>
-      <w:r>
-        <w:rPr>
-          <w:b/>
-          <w:bCs/>
-        </w:rPr>
-        <w:t xml:space="preserve">кого вы последний раз уговаривали работать? И сколько это продлилось?</w:t>
-      </w:r>
-    </w:p>
-    <w:p>
-      <w:pPr>
-        <w:pStyle w:val="BodyText"/>
-      </w:pPr>
-      <w:r>
-        <w:t xml:space="preserve">Следующее правило — про механизм, который работает вместо вас.</w:t>
+        <w:t xml:space="preserve">Кого вы последний раз уговаривали работать? И сколько это продлилось?</w:t>
       </w:r>
     </w:p>
     <w:p>
@@ -9099,11 +8929,96 @@
         <w:pStyle w:val="Compact"/>
         <w:numPr>
           <w:ilvl w:val="0"/>
-          <w:numId w:val="1020"/>
+          <w:numId w:val="1019"/>
         </w:numPr>
       </w:pPr>
       <w:r>
         <w:t xml:space="preserve">«Правило 1 из 5» — обложка серии (единый стиль для всех 5).</w:t>
+      </w:r>
+    </w:p>
+    <w:p>
+      <w:pPr>
+        <w:pStyle w:val="Compact"/>
+        <w:numPr>
+          <w:ilvl w:val="0"/>
+          <w:numId w:val="1019"/>
+        </w:numPr>
+      </w:pPr>
+      <w:r>
+        <w:t xml:space="preserve">Опрос: «Что сильнее удерживает сотрудников?» — Деньги / Смысл и признание.</w:t>
+      </w:r>
+    </w:p>
+    <w:p>
+      <w:pPr>
+        <w:pStyle w:val="Compact"/>
+        <w:numPr>
+          <w:ilvl w:val="0"/>
+          <w:numId w:val="1019"/>
+        </w:numPr>
+      </w:pPr>
+      <w:r>
+        <w:t xml:space="preserve">Ссылка на пост.</w:t>
+      </w:r>
+    </w:p>
+    <w:p>
+      <w:r>
+        <w:br w:type="page"/>
+      </w:r>
+    </w:p>
+    <w:bookmarkEnd w:id="58"/>
+    <w:bookmarkEnd w:id="59"/>
+    <w:bookmarkStart w:id="64" w:name="сайт-текущая-версия-и-вариант-алины-v3"/>
+    <w:p>
+      <w:pPr>
+        <w:pStyle w:val="Heading1"/>
+      </w:pPr>
+      <w:r>
+        <w:t xml:space="preserve">Сайт: текущая версия и вариант Алины (v3)</w:t>
+      </w:r>
+    </w:p>
+    <w:p>
+      <w:pPr>
+        <w:pStyle w:val="FirstParagraph"/>
+      </w:pPr>
+      <w:r>
+        <w:t xml:space="preserve">Текущий: https://ayratsagdeev.ru/ · Вариант Алины: https://ayratsagdeev.ru/v3-db195455/</w:t>
+      </w:r>
+    </w:p>
+    <w:bookmarkStart w:id="60" w:name="вердикт"/>
+    <w:p>
+      <w:pPr>
+        <w:pStyle w:val="Heading2"/>
+      </w:pPr>
+      <w:r>
+        <w:t xml:space="preserve">Вердикт</w:t>
+      </w:r>
+    </w:p>
+    <w:p>
+      <w:pPr>
+        <w:pStyle w:val="FirstParagraph"/>
+      </w:pPr>
+      <w:r>
+        <w:rPr>
+          <w:b/>
+          <w:bCs/>
+        </w:rPr>
+        <w:t xml:space="preserve">v3 лучше, её стоит брать за основу.</w:t>
+      </w:r>
+      <w:r>
+        <w:t xml:space="preserve"> </w:t>
+      </w:r>
+      <w:r>
+        <w:t xml:space="preserve">Нужно поправить 6 пунктов ниже, в первую очередь обещание «минус 20 часов».</w:t>
+      </w:r>
+    </w:p>
+    <w:bookmarkEnd w:id="60"/>
+    <w:bookmarkStart w:id="61" w:name="что-в-v3-сильнее"/>
+    <w:p>
+      <w:pPr>
+        <w:pStyle w:val="Heading2"/>
+      </w:pPr>
+      <w:r>
+        <w:t xml:space="preserve">Что в v3 сильнее</w:t>
       </w:r>
     </w:p>
     <w:p>
@@ -9115,7 +9030,17 @@
         </w:numPr>
       </w:pPr>
       <w:r>
-        <w:t xml:space="preserve">Опрос: «Что сильнее удерживает сотрудников?» — Деньги / Смысл и признание.</w:t>
+        <w:rPr>
+          <w:b/>
+          <w:bCs/>
+        </w:rPr>
+        <w:t xml:space="preserve">Конкретный результат вместо абстракций.</w:t>
+      </w:r>
+      <w:r>
+        <w:t xml:space="preserve"> </w:t>
+      </w:r>
+      <w:r>
+        <w:t xml:space="preserve">Появились пункты «бот задач», «офис, который работает, пока вас нет», «карта, где теряются деньги». Их понятно, за что покупать.</w:t>
       </w:r>
     </w:p>
     <w:p>
@@ -9127,68 +9052,83 @@
         </w:numPr>
       </w:pPr>
       <w:r>
-        <w:t xml:space="preserve">Ссылка на пост.</w:t>
-      </w:r>
-    </w:p>
-    <w:p>
-      <w:r>
-        <w:br w:type="page"/>
-      </w:r>
-    </w:p>
-    <w:bookmarkEnd w:id="58"/>
-    <w:bookmarkEnd w:id="59"/>
-    <w:bookmarkStart w:id="64" w:name="сайт-текущая-версия-и-вариант-алины-v3"/>
-    <w:p>
-      <w:pPr>
-        <w:pStyle w:val="Heading1"/>
-      </w:pPr>
-      <w:r>
-        <w:t xml:space="preserve">Сайт: текущая версия и вариант Алины (v3)</w:t>
-      </w:r>
-    </w:p>
-    <w:p>
-      <w:pPr>
-        <w:pStyle w:val="FirstParagraph"/>
-      </w:pPr>
-      <w:r>
-        <w:t xml:space="preserve">Текущий: https://ayratsagdeev.ru/ · Вариант Алины: https://ayratsagdeev.ru/v3-db195455/</w:t>
-      </w:r>
-    </w:p>
-    <w:bookmarkStart w:id="60" w:name="вердикт"/>
-    <w:p>
-      <w:pPr>
-        <w:pStyle w:val="Heading2"/>
-      </w:pPr>
-      <w:r>
-        <w:t xml:space="preserve">Вердикт</w:t>
-      </w:r>
-    </w:p>
-    <w:p>
-      <w:pPr>
-        <w:pStyle w:val="FirstParagraph"/>
-      </w:pPr>
-      <w:r>
         <w:rPr>
           <w:b/>
           <w:bCs/>
         </w:rPr>
-        <w:t xml:space="preserve">v3 лучше, её стоит брать за основу.</w:t>
-      </w:r>
-      <w:r>
-        <w:t xml:space="preserve"> </w:t>
-      </w:r>
-      <w:r>
-        <w:t xml:space="preserve">Нужно поправить 6 пунктов ниже, в первую очередь обещание «минус 20 часов».</w:t>
-      </w:r>
-    </w:p>
-    <w:bookmarkEnd w:id="60"/>
-    <w:bookmarkStart w:id="61" w:name="что-в-v3-сильнее"/>
+        <w:t xml:space="preserve">Блок «Подход».</w:t>
+      </w:r>
+      <w:r>
+        <w:t xml:space="preserve"> </w:t>
+      </w:r>
+      <w:r>
+        <w:t xml:space="preserve">«Строить машину, а не быть её мотором», 10 часов в неделю, три опоры: люди, механизм, ритм. Он совпадает с контентом блога: человек читает серию «5 правил» и на сайте видит то же самое.</w:t>
+      </w:r>
+    </w:p>
+    <w:p>
+      <w:pPr>
+        <w:pStyle w:val="Compact"/>
+        <w:numPr>
+          <w:ilvl w:val="0"/>
+          <w:numId w:val="1020"/>
+        </w:numPr>
+      </w:pPr>
+      <w:r>
+        <w:rPr>
+          <w:b/>
+          <w:bCs/>
+        </w:rPr>
+        <w:t xml:space="preserve">Ответы на возражения в FAQ:</w:t>
+      </w:r>
+      <w:r>
+        <w:t xml:space="preserve"> </w:t>
+      </w:r>
+      <w:r>
+        <w:t xml:space="preserve">«почему не разобраться самому», «дорого», «а если не поможет», «оплата от юрлица». Это именно то, что останавливает руководителя перед записью.</w:t>
+      </w:r>
+    </w:p>
+    <w:p>
+      <w:pPr>
+        <w:pStyle w:val="Compact"/>
+        <w:numPr>
+          <w:ilvl w:val="0"/>
+          <w:numId w:val="1020"/>
+        </w:numPr>
+      </w:pPr>
+      <w:r>
+        <w:rPr>
+          <w:b/>
+          <w:bCs/>
+        </w:rPr>
+        <w:t xml:space="preserve">Один главный призыв</w:t>
+      </w:r>
+      <w:r>
+        <w:t xml:space="preserve"> </w:t>
+      </w:r>
+      <w:r>
+        <w:t xml:space="preserve">(«Записаться на разбор») вместо трёх кнопок.</w:t>
+      </w:r>
+    </w:p>
+    <w:p>
+      <w:pPr>
+        <w:pStyle w:val="Compact"/>
+        <w:numPr>
+          <w:ilvl w:val="0"/>
+          <w:numId w:val="1020"/>
+        </w:numPr>
+      </w:pPr>
+      <w:r>
+        <w:t xml:space="preserve">Длинные карточки аудитории свернули в четыре строки, и читать стало легче.</w:t>
+      </w:r>
+    </w:p>
+    <w:bookmarkEnd w:id="61"/>
+    <w:bookmarkStart w:id="62" w:name="что-поправить"/>
     <w:p>
       <w:pPr>
         <w:pStyle w:val="Heading2"/>
       </w:pPr>
       <w:r>
-        <w:t xml:space="preserve">Что в v3 сильнее</w:t>
+        <w:t xml:space="preserve">Что поправить</w:t>
       </w:r>
     </w:p>
     <w:p>
@@ -9204,13 +9144,13 @@
           <w:b/>
           <w:bCs/>
         </w:rPr>
-        <w:t xml:space="preserve">Конкретный результат вместо абстракций.</w:t>
-      </w:r>
-      <w:r>
-        <w:t xml:space="preserve"> </w:t>
-      </w:r>
-      <w:r>
-        <w:t xml:space="preserve">Появились пункты «бот задач», «офис, который работает, пока вас нет», «карта, где теряются деньги». Их понятно, за что покупать.</w:t>
+        <w:t xml:space="preserve">«Минус 20 часов в неделю»</w:t>
+      </w:r>
+      <w:r>
+        <w:t xml:space="preserve"> </w:t>
+      </w:r>
+      <w:r>
+        <w:t xml:space="preserve">— это обещание, которое спорит с FAQ «гарантировать результат не может никто». Лучше «Список того, что можно снять с вас на систему. У меня это позволило сократить управление до ~10 часов в неделю». Или оставить цифру, но с оговоркой «до».</w:t>
       </w:r>
     </w:p>
     <w:p>
@@ -9226,13 +9166,13 @@
           <w:b/>
           <w:bCs/>
         </w:rPr>
-        <w:t xml:space="preserve">Блок «Подход».</w:t>
-      </w:r>
-      <w:r>
-        <w:t xml:space="preserve"> </w:t>
-      </w:r>
-      <w:r>
-        <w:t xml:space="preserve">«Строить машину, а не быть её мотором», 10 часов в неделю, три опоры: люди, механизм, ритм. Он совпадает с контентом блога: человек читает серию «5 правил» и на сайте видит то же самое.</w:t>
+        <w:t xml:space="preserve">«10+ лет» → «13 лет в управлении».</w:t>
+      </w:r>
+      <w:r>
+        <w:t xml:space="preserve"> </w:t>
+      </w:r>
+      <w:r>
+        <w:t xml:space="preserve">Так сказано в презентации, и это сходится с таймлайном (2013, «Форпост»). Цифры на сайте, в блоге и на слайдах должны совпадать.</w:t>
       </w:r>
     </w:p>
     <w:p>
@@ -9248,13 +9188,13 @@
           <w:b/>
           <w:bCs/>
         </w:rPr>
-        <w:t xml:space="preserve">Ответы на возражения в FAQ:</w:t>
-      </w:r>
-      <w:r>
-        <w:t xml:space="preserve"> </w:t>
-      </w:r>
-      <w:r>
-        <w:t xml:space="preserve">«почему не разобраться самому», «дорого», «а если не поможет», «оплата от юрлица». Это именно то, что останавливает руководителя перед записью.</w:t>
+        <w:t xml:space="preserve">Нет ссылки на блог.</w:t>
+      </w:r>
+      <w:r>
+        <w:t xml:space="preserve"> </w:t>
+      </w:r>
+      <w:r>
+        <w:t xml:space="preserve">Добавить «Читать блог» (TG, дальше IG/VK/MAX) в шапку или подвал. Тёплый человек, который пока не готов записаться, должен иметь куда уйти, не теряясь.</w:t>
       </w:r>
     </w:p>
     <w:p>
@@ -9270,13 +9210,13 @@
           <w:b/>
           <w:bCs/>
         </w:rPr>
-        <w:t xml:space="preserve">Один главный призыв</w:t>
-      </w:r>
-      <w:r>
-        <w:t xml:space="preserve"> </w:t>
-      </w:r>
-      <w:r>
-        <w:t xml:space="preserve">(«Записаться на разбор») вместо трёх кнопок.</w:t>
+        <w:t xml:space="preserve">Цена экспресс-разбора.</w:t>
+      </w:r>
+      <w:r>
+        <w:t xml:space="preserve"> </w:t>
+      </w:r>
+      <w:r>
+        <w:t xml:space="preserve">«По запросу» — лишний барьер для входного продукта. Лучше указать цену или «от N ₽». Полную сессию можно оставить по запросу.</w:t>
       </w:r>
     </w:p>
     <w:p>
@@ -9288,116 +9228,6 @@
         </w:numPr>
       </w:pPr>
       <w:r>
-        <w:t xml:space="preserve">Длинные карточки аудитории свернули в четыре строки, и читать стало легче.</w:t>
-      </w:r>
-    </w:p>
-    <w:bookmarkEnd w:id="61"/>
-    <w:bookmarkStart w:id="62" w:name="что-поправить"/>
-    <w:p>
-      <w:pPr>
-        <w:pStyle w:val="Heading2"/>
-      </w:pPr>
-      <w:r>
-        <w:t xml:space="preserve">Что поправить</w:t>
-      </w:r>
-    </w:p>
-    <w:p>
-      <w:pPr>
-        <w:pStyle w:val="Compact"/>
-        <w:numPr>
-          <w:ilvl w:val="0"/>
-          <w:numId w:val="1022"/>
-        </w:numPr>
-      </w:pPr>
-      <w:r>
-        <w:rPr>
-          <w:b/>
-          <w:bCs/>
-        </w:rPr>
-        <w:t xml:space="preserve">«Минус 20 часов в неделю»</w:t>
-      </w:r>
-      <w:r>
-        <w:t xml:space="preserve"> </w:t>
-      </w:r>
-      <w:r>
-        <w:t xml:space="preserve">— это обещание, которое спорит с FAQ «гарантировать результат не может никто». Лучше «Список того, что можно снять с вас на систему. У меня это позволило сократить управление до ~10 часов в неделю». Или оставить цифру, но с оговоркой «до».</w:t>
-      </w:r>
-    </w:p>
-    <w:p>
-      <w:pPr>
-        <w:pStyle w:val="Compact"/>
-        <w:numPr>
-          <w:ilvl w:val="0"/>
-          <w:numId w:val="1022"/>
-        </w:numPr>
-      </w:pPr>
-      <w:r>
-        <w:rPr>
-          <w:b/>
-          <w:bCs/>
-        </w:rPr>
-        <w:t xml:space="preserve">«10+ лет» → «13 лет в управлении».</w:t>
-      </w:r>
-      <w:r>
-        <w:t xml:space="preserve"> </w:t>
-      </w:r>
-      <w:r>
-        <w:t xml:space="preserve">Так сказано в презентации, и это сходится с таймлайном (2013, «Форпост»). Цифры на сайте, в блоге и на слайдах должны совпадать.</w:t>
-      </w:r>
-    </w:p>
-    <w:p>
-      <w:pPr>
-        <w:pStyle w:val="Compact"/>
-        <w:numPr>
-          <w:ilvl w:val="0"/>
-          <w:numId w:val="1022"/>
-        </w:numPr>
-      </w:pPr>
-      <w:r>
-        <w:rPr>
-          <w:b/>
-          <w:bCs/>
-        </w:rPr>
-        <w:t xml:space="preserve">Нет ссылки на блог.</w:t>
-      </w:r>
-      <w:r>
-        <w:t xml:space="preserve"> </w:t>
-      </w:r>
-      <w:r>
-        <w:t xml:space="preserve">Добавить «Читать блог» (TG, дальше IG/VK/MAX) в шапку или подвал. Тёплый человек, который пока не готов записаться, должен иметь куда уйти, не теряясь.</w:t>
-      </w:r>
-    </w:p>
-    <w:p>
-      <w:pPr>
-        <w:pStyle w:val="Compact"/>
-        <w:numPr>
-          <w:ilvl w:val="0"/>
-          <w:numId w:val="1022"/>
-        </w:numPr>
-      </w:pPr>
-      <w:r>
-        <w:rPr>
-          <w:b/>
-          <w:bCs/>
-        </w:rPr>
-        <w:t xml:space="preserve">Цена экспресс-разбора.</w:t>
-      </w:r>
-      <w:r>
-        <w:t xml:space="preserve"> </w:t>
-      </w:r>
-      <w:r>
-        <w:t xml:space="preserve">«По запросу» — лишний барьер для входного продукта. Лучше указать цену или «от N ₽». Полную сессию можно оставить по запросу.</w:t>
-      </w:r>
-    </w:p>
-    <w:p>
-      <w:pPr>
-        <w:pStyle w:val="Compact"/>
-        <w:numPr>
-          <w:ilvl w:val="0"/>
-          <w:numId w:val="1022"/>
-        </w:numPr>
-      </w:pPr>
-      <w:r>
         <w:rPr>
           <w:b/>
           <w:bCs/>
@@ -9416,7 +9246,7 @@
         <w:pStyle w:val="Compact"/>
         <w:numPr>
           <w:ilvl w:val="0"/>
-          <w:numId w:val="1022"/>
+          <w:numId w:val="1021"/>
         </w:numPr>
       </w:pPr>
       <w:r>
@@ -9448,7 +9278,7 @@
         <w:pStyle w:val="Compact"/>
         <w:numPr>
           <w:ilvl w:val="0"/>
-          <w:numId w:val="1023"/>
+          <w:numId w:val="1022"/>
         </w:numPr>
       </w:pPr>
       <w:r>
@@ -9939,6 +9769,9 @@
     </w:lvlOverride>
   </w:num>
   <w:num w:numId="1016">
+    <w:abstractNumId w:val="991"/>
+  </w:num>
+  <w:num w:numId="1017">
     <w:abstractNumId w:val="99411"/>
     <w:lvlOverride w:ilvl="0">
       <w:startOverride w:val="1"/>
@@ -9967,9 +9800,6 @@
     <w:lvlOverride w:ilvl="8">
       <w:startOverride w:val="1"/>
     </w:lvlOverride>
-  </w:num>
-  <w:num w:numId="1017">
-    <w:abstractNumId w:val="991"/>
   </w:num>
   <w:num w:numId="1018">
     <w:abstractNumId w:val="99411"/>
@@ -10032,6 +9862,9 @@
     </w:lvlOverride>
   </w:num>
   <w:num w:numId="1020">
+    <w:abstractNumId w:val="991"/>
+  </w:num>
+  <w:num w:numId="1021">
     <w:abstractNumId w:val="99411"/>
     <w:lvlOverride w:ilvl="0">
       <w:startOverride w:val="1"/>
@@ -10061,40 +9894,7 @@
       <w:startOverride w:val="1"/>
     </w:lvlOverride>
   </w:num>
-  <w:num w:numId="1021">
-    <w:abstractNumId w:val="991"/>
-  </w:num>
   <w:num w:numId="1022">
-    <w:abstractNumId w:val="99411"/>
-    <w:lvlOverride w:ilvl="0">
-      <w:startOverride w:val="1"/>
-    </w:lvlOverride>
-    <w:lvlOverride w:ilvl="1">
-      <w:startOverride w:val="1"/>
-    </w:lvlOverride>
-    <w:lvlOverride w:ilvl="2">
-      <w:startOverride w:val="1"/>
-    </w:lvlOverride>
-    <w:lvlOverride w:ilvl="3">
-      <w:startOverride w:val="1"/>
-    </w:lvlOverride>
-    <w:lvlOverride w:ilvl="4">
-      <w:startOverride w:val="1"/>
-    </w:lvlOverride>
-    <w:lvlOverride w:ilvl="5">
-      <w:startOverride w:val="1"/>
-    </w:lvlOverride>
-    <w:lvlOverride w:ilvl="6">
-      <w:startOverride w:val="1"/>
-    </w:lvlOverride>
-    <w:lvlOverride w:ilvl="7">
-      <w:startOverride w:val="1"/>
-    </w:lvlOverride>
-    <w:lvlOverride w:ilvl="8">
-      <w:startOverride w:val="1"/>
-    </w:lvlOverride>
-  </w:num>
-  <w:num w:numId="1023">
     <w:abstractNumId w:val="991"/>
   </w:num>
 </w:numbering>

</xml_diff>

<commit_message>
Rewrite post 02 on Alina's verified capabilities, add autopublishing checklist
Co-Authored-By: Claude Opus 5.5 <noreply@anthropic.com>
Claude-Session: https://claude.ai/code/session_01DZfKE2Qbh1BJBTBdA16C3f
</commit_message>
<xml_diff>
--- a/content/Kontent-plan_Ayrat_oktyabr-2026.docx
+++ b/content/Kontent-plan_Ayrat_oktyabr-2026.docx
@@ -1230,7 +1230,7 @@
     </w:p>
     <w:bookmarkEnd w:id="15"/>
     <w:bookmarkEnd w:id="16"/>
-    <w:bookmarkStart w:id="26" w:name="стратегия-на-месяц-28.09-27.10.2026"/>
+    <w:bookmarkStart w:id="27" w:name="стратегия-на-месяц-28.09-27.10.2026"/>
     <w:p>
       <w:pPr>
         <w:pStyle w:val="Heading1"/>
@@ -2750,13 +2750,13 @@
           <w:b/>
           <w:bCs/>
         </w:rPr>
-        <w:t xml:space="preserve">Gemini через Vertex (у Алины):</w:t>
-      </w:r>
-      <w:r>
-        <w:t xml:space="preserve"> </w:t>
-      </w:r>
-      <w:r>
-        <w:t xml:space="preserve">Imagen — обложки, иллюстрации к постам и каруселям; Veo — короткие видео-вставки (b-roll) для рилсов. Бонусы Google стоит тратить именно на это.</w:t>
+        <w:t xml:space="preserve">Картинки — через Алину:</w:t>
+      </w:r>
+      <w:r>
+        <w:t xml:space="preserve"> </w:t>
+      </w:r>
+      <w:r>
+        <w:t xml:space="preserve">Gemini на Vertex (Nano Banana 2 и Pro) работает ✅. Бонус Google Cloud примерно до 20.12, тратим на обложки, иллюстрации и карточки каруселей.</w:t>
       </w:r>
     </w:p>
     <w:p>
@@ -2772,13 +2772,13 @@
           <w:b/>
           <w:bCs/>
         </w:rPr>
-        <w:t xml:space="preserve">Claude</w:t>
-      </w:r>
-      <w:r>
-        <w:t xml:space="preserve"> </w:t>
-      </w:r>
-      <w:r>
-        <w:t xml:space="preserve">сам картинки и видео не рисует, но может: писать промпты для Imagen/Veo, вызывать их API прямо из этого репозитория, собирать карусели (текст на шаблон), резать и монтировать видео, накладывать субтитры (ffmpeg), делать обложки из ваших фото. Это закроем отдельной задачей.</w:t>
+        <w:t xml:space="preserve">Видео:</w:t>
+      </w:r>
+      <w:r>
+        <w:t xml:space="preserve"> </w:t>
+      </w:r>
+      <w:r>
+        <w:t xml:space="preserve">генерация Veo ⚠️ не проверена, попробуем на b-roll для рилсов. Нарезать, склеить, сжать и наложить субтитры можно через ffmpeg (Алина или Claude). Полноценный монтаж — CapCut.</w:t>
       </w:r>
     </w:p>
     <w:p>
@@ -2803,14 +2803,294 @@
         <w:t xml:space="preserve">лицо в кадре — настоящее. ИИ только для фона, иллюстраций и обложек, иначе пропадает «ближе».</w:t>
       </w:r>
     </w:p>
+    <w:bookmarkEnd w:id="25"/>
+    <w:bookmarkStart w:id="26" w:name="Xc923b023a2d29ed472ee36ccc81ebbc26e65901"/>
+    <w:p>
+      <w:pPr>
+        <w:pStyle w:val="Heading2"/>
+      </w:pPr>
+      <w:r>
+        <w:t xml:space="preserve">Автопубликация через Алину: что нужно сделать</w:t>
+      </w:r>
+    </w:p>
+    <w:tbl>
+      <w:tblPr>
+        <w:tblStyle w:val="Table"/>
+        <w:tblW w:type="pct" w:w="5000"/>
+        <w:tblBorders>
+          <w:top w:val="single" w:sz="4" w:space="0" w:color="BFBFBF"/>
+          <w:left w:val="single" w:sz="4" w:space="0" w:color="BFBFBF"/>
+          <w:bottom w:val="single" w:sz="4" w:space="0" w:color="BFBFBF"/>
+          <w:right w:val="single" w:sz="4" w:space="0" w:color="BFBFBF"/>
+          <w:insideH w:val="single" w:sz="4" w:space="0" w:color="BFBFBF"/>
+          <w:insideV w:val="single" w:sz="4" w:space="0" w:color="BFBFBF"/>
+        </w:tblBorders>
+        <w:tblLayout w:type="fixed"/>
+        <w:tblLook w:firstRow="1" w:lastRow="0" w:firstColumn="0" w:lastColumn="0" w:noHBand="0" w:noVBand="0" w:val="0020"/>
+      </w:tblPr>
+      <w:tblGrid>
+        <w:gridCol w:w="2640"/>
+        <w:gridCol w:w="2640"/>
+        <w:gridCol w:w="2640"/>
+      </w:tblGrid>
+      <w:tr>
+        <w:trPr>
+          <w:tblHeader w:val="on"/>
+        </w:trPr>
+        <w:tc>
+          <w:tcPr>
+            <w:shd w:val="clear" w:color="auto" w:fill="F3E3D6"/>
+          </w:tcPr>
+          <w:p>
+            <w:pPr>
+              <w:pStyle w:val="Compact"/>
+            </w:pPr>
+            <w:r>
+              <w:rPr>
+                <w:sz w:val="19"/>
+              </w:rPr>
+              <w:t xml:space="preserve">Площадка</w:t>
+            </w:r>
+          </w:p>
+        </w:tc>
+        <w:tc>
+          <w:tcPr>
+            <w:shd w:val="clear" w:color="auto" w:fill="F3E3D6"/>
+          </w:tcPr>
+          <w:p>
+            <w:pPr>
+              <w:pStyle w:val="Compact"/>
+            </w:pPr>
+            <w:r>
+              <w:rPr>
+                <w:sz w:val="19"/>
+              </w:rPr>
+              <w:t xml:space="preserve">Статус</w:t>
+            </w:r>
+          </w:p>
+        </w:tc>
+        <w:tc>
+          <w:tcPr>
+            <w:shd w:val="clear" w:color="auto" w:fill="F3E3D6"/>
+          </w:tcPr>
+          <w:p>
+            <w:pPr>
+              <w:pStyle w:val="Compact"/>
+            </w:pPr>
+            <w:r>
+              <w:rPr>
+                <w:sz w:val="19"/>
+              </w:rPr>
+              <w:t xml:space="preserve">Что сделать</w:t>
+            </w:r>
+          </w:p>
+        </w:tc>
+      </w:tr>
+      <w:tr>
+        <w:tc>
+          <w:tcPr/>
+          <w:p>
+            <w:pPr>
+              <w:pStyle w:val="Compact"/>
+            </w:pPr>
+            <w:r>
+              <w:rPr>
+                <w:sz w:val="19"/>
+              </w:rPr>
+              <w:t xml:space="preserve">Telegram-канал t.me/Ayrat_blizhe</w:t>
+            </w:r>
+          </w:p>
+        </w:tc>
+        <w:tc>
+          <w:tcPr/>
+          <w:p>
+            <w:pPr>
+              <w:pStyle w:val="Compact"/>
+            </w:pPr>
+            <w:r>
+              <w:rPr>
+                <w:sz w:val="19"/>
+              </w:rPr>
+              <w:t xml:space="preserve">⚠️</w:t>
+            </w:r>
+          </w:p>
+        </w:tc>
+        <w:tc>
+          <w:tcPr/>
+          <w:p>
+            <w:pPr>
+              <w:pStyle w:val="Compact"/>
+            </w:pPr>
+            <w:r>
+              <w:rPr>
+                <w:sz w:val="19"/>
+              </w:rPr>
+              <w:t xml:space="preserve">Добавить бота Алины админом канала (с правом публикации). Алина думает, что канала нет, — сообщить ей адрес</w:t>
+            </w:r>
+          </w:p>
+        </w:tc>
+      </w:tr>
+      <w:tr>
+        <w:tc>
+          <w:tcPr/>
+          <w:p>
+            <w:pPr>
+              <w:pStyle w:val="Compact"/>
+            </w:pPr>
+            <w:r>
+              <w:rPr>
+                <w:sz w:val="19"/>
+              </w:rPr>
+              <w:t xml:space="preserve">Instagram</w:t>
+            </w:r>
+            <w:r>
+              <w:rPr>
+                <w:sz w:val="19"/>
+              </w:rPr>
+              <w:t xml:space="preserve"> </w:t>
+            </w:r>
+            <w:r>
+              <w:rPr>
+                <w:sz w:val="19"/>
+              </w:rPr>
+              <w:t xml:space="preserve">@airat.sagdeev</w:t>
+            </w:r>
+          </w:p>
+        </w:tc>
+        <w:tc>
+          <w:tcPr/>
+          <w:p>
+            <w:pPr>
+              <w:pStyle w:val="Compact"/>
+            </w:pPr>
+            <w:r>
+              <w:rPr>
+                <w:sz w:val="19"/>
+              </w:rPr>
+              <w:t xml:space="preserve">⚠️</w:t>
+            </w:r>
+          </w:p>
+        </w:tc>
+        <w:tc>
+          <w:tcPr/>
+          <w:p>
+            <w:pPr>
+              <w:pStyle w:val="Compact"/>
+            </w:pPr>
+            <w:r>
+              <w:rPr>
+                <w:sz w:val="19"/>
+              </w:rPr>
+              <w:t xml:space="preserve">Обновить ключ API (истёк 02.09)</w:t>
+            </w:r>
+          </w:p>
+        </w:tc>
+      </w:tr>
+      <w:tr>
+        <w:tc>
+          <w:tcPr/>
+          <w:p>
+            <w:pPr>
+              <w:pStyle w:val="Compact"/>
+            </w:pPr>
+            <w:r>
+              <w:rPr>
+                <w:sz w:val="19"/>
+              </w:rPr>
+              <w:t xml:space="preserve">ВК vk.ru/a.sagdeev (личная страница)</w:t>
+            </w:r>
+          </w:p>
+        </w:tc>
+        <w:tc>
+          <w:tcPr/>
+          <w:p>
+            <w:pPr>
+              <w:pStyle w:val="Compact"/>
+            </w:pPr>
+            <w:r>
+              <w:rPr>
+                <w:sz w:val="19"/>
+              </w:rPr>
+              <w:t xml:space="preserve">⚠️</w:t>
+            </w:r>
+          </w:p>
+        </w:tc>
+        <w:tc>
+          <w:tcPr/>
+          <w:p>
+            <w:pPr>
+              <w:pStyle w:val="Compact"/>
+            </w:pPr>
+            <w:r>
+              <w:rPr>
+                <w:sz w:val="19"/>
+              </w:rPr>
+              <w:t xml:space="preserve">Выдать Алине личный ключ ВК для постов на стену. Группа vk.com/club240044508 уже подключена — решить, куда постим: страница или группа</w:t>
+            </w:r>
+          </w:p>
+        </w:tc>
+      </w:tr>
+      <w:tr>
+        <w:tc>
+          <w:tcPr/>
+          <w:p>
+            <w:pPr>
+              <w:pStyle w:val="Compact"/>
+            </w:pPr>
+            <w:r>
+              <w:rPr>
+                <w:sz w:val="19"/>
+              </w:rPr>
+              <w:t xml:space="preserve">MAX</w:t>
+            </w:r>
+          </w:p>
+        </w:tc>
+        <w:tc>
+          <w:tcPr/>
+          <w:p>
+            <w:pPr>
+              <w:pStyle w:val="Compact"/>
+            </w:pPr>
+            <w:r>
+              <w:rPr>
+                <w:sz w:val="19"/>
+              </w:rPr>
+              <w:t xml:space="preserve">❓</w:t>
+            </w:r>
+          </w:p>
+        </w:tc>
+        <w:tc>
+          <w:tcPr/>
+          <w:p>
+            <w:pPr>
+              <w:pStyle w:val="Compact"/>
+            </w:pPr>
+            <w:r>
+              <w:rPr>
+                <w:sz w:val="19"/>
+              </w:rPr>
+              <w:t xml:space="preserve">Уточнить у Алины, есть ли доступ</w:t>
+            </w:r>
+          </w:p>
+        </w:tc>
+      </w:tr>
+    </w:tbl>
+    <w:p>
+      <w:pPr>
+        <w:pStyle w:val="BodyText"/>
+      </w:pPr>
+      <w:r>
+        <w:t xml:space="preserve">Правило остаётся: всё публикуется только после вашего просмотра (полуавтомат: Алина присылает готовый пост → вы жмёте «ок»).</w:t>
+      </w:r>
+    </w:p>
     <w:p>
       <w:r>
         <w:br w:type="page"/>
       </w:r>
     </w:p>
-    <w:bookmarkEnd w:id="25"/>
     <w:bookmarkEnd w:id="26"/>
-    <w:bookmarkStart w:id="32" w:name="календарь-28.09-27.10.2026"/>
+    <w:bookmarkEnd w:id="27"/>
+    <w:bookmarkStart w:id="33" w:name="календарь-28.09-27.10.2026"/>
     <w:p>
       <w:pPr>
         <w:pStyle w:val="Heading1"/>
@@ -2937,7 +3217,7 @@
         <w:t xml:space="preserve">(малый бизнес).</w:t>
       </w:r>
     </w:p>
-    <w:bookmarkStart w:id="27" w:name="неделя-1-возвращаюсь-старт"/>
+    <w:bookmarkStart w:id="28" w:name="неделя-1-возвращаюсь-старт"/>
     <w:p>
       <w:pPr>
         <w:pStyle w:val="Heading2"/>
@@ -3486,8 +3766,8 @@
         </w:tc>
       </w:tr>
     </w:tbl>
-    <w:bookmarkEnd w:id="27"/>
-    <w:bookmarkStart w:id="28" w:name="неделя-2-показываю-механизм"/>
+    <w:bookmarkEnd w:id="28"/>
+    <w:bookmarkStart w:id="29" w:name="неделя-2-показываю-механизм"/>
     <w:p>
       <w:pPr>
         <w:pStyle w:val="Heading2"/>
@@ -3964,8 +4244,8 @@
         </w:tc>
       </w:tr>
     </w:tbl>
-    <w:bookmarkEnd w:id="28"/>
-    <w:bookmarkStart w:id="29" w:name="неделя-3-кейсы-выходим-на-целевой-ритм"/>
+    <w:bookmarkEnd w:id="29"/>
+    <w:bookmarkStart w:id="30" w:name="неделя-3-кейсы-выходим-на-целевой-ритм"/>
     <w:p>
       <w:pPr>
         <w:pStyle w:val="Heading2"/>
@@ -4586,8 +4866,8 @@
         </w:tc>
       </w:tr>
     </w:tbl>
-    <w:bookmarkEnd w:id="29"/>
-    <w:bookmarkStart w:id="30" w:name="неделя-4-предложение"/>
+    <w:bookmarkEnd w:id="30"/>
+    <w:bookmarkStart w:id="31" w:name="неделя-4-предложение"/>
     <w:p>
       <w:pPr>
         <w:pStyle w:val="Heading2"/>
@@ -5280,8 +5560,8 @@
         </w:tc>
       </w:tr>
     </w:tbl>
-    <w:bookmarkEnd w:id="30"/>
-    <w:bookmarkStart w:id="31" w:name="резерв-свежий-повод-или-выпал-день"/>
+    <w:bookmarkEnd w:id="31"/>
+    <w:bookmarkStart w:id="32" w:name="резерв-свежий-повод-или-выпал-день"/>
     <w:p>
       <w:pPr>
         <w:pStyle w:val="Heading2"/>
@@ -5292,7 +5572,69 @@
     </w:p>
     <w:p>
       <w:pPr>
-        <w:pStyle w:val="Compact"/>
+        <w:numPr>
+          <w:ilvl w:val="0"/>
+          <w:numId w:val="1011"/>
+        </w:numPr>
+      </w:pPr>
+      <w:r>
+        <w:rPr>
+          <w:b/>
+          <w:bCs/>
+        </w:rPr>
+        <w:t xml:space="preserve">Кейс Полины:</w:t>
+      </w:r>
+      <w:r>
+        <w:t xml:space="preserve"> </w:t>
+      </w:r>
+      <w:r>
+        <w:t xml:space="preserve">ИИ-бот для компании — контроль телефонии, Битрикс, гранты. ❓ согласие Полины, цифры.</w:t>
+      </w:r>
+    </w:p>
+    <w:p>
+      <w:pPr>
+        <w:numPr>
+          <w:ilvl w:val="0"/>
+          <w:numId w:val="1011"/>
+        </w:numPr>
+      </w:pPr>
+      <w:r>
+        <w:rPr>
+          <w:b/>
+          <w:bCs/>
+        </w:rPr>
+        <w:t xml:space="preserve">«Моя ИИ-помощница расшифровывает часовые совещания»:</w:t>
+      </w:r>
+      <w:r>
+        <w:t xml:space="preserve"> </w:t>
+      </w:r>
+      <w:r>
+        <w:t xml:space="preserve">протокол и задачи сразу после встречи (готовый ✅ навык Алины).</w:t>
+      </w:r>
+    </w:p>
+    <w:p>
+      <w:pPr>
+        <w:numPr>
+          <w:ilvl w:val="0"/>
+          <w:numId w:val="1011"/>
+        </w:numPr>
+      </w:pPr>
+      <w:r>
+        <w:rPr>
+          <w:b/>
+          <w:bCs/>
+        </w:rPr>
+        <w:t xml:space="preserve">«Утренняя сводка по почте»:</w:t>
+      </w:r>
+      <w:r>
+        <w:t xml:space="preserve"> </w:t>
+      </w:r>
+      <w:r>
+        <w:t xml:space="preserve">как Алина разбирает рабочую почту (дебиторка и др.).</w:t>
+      </w:r>
+    </w:p>
+    <w:p>
+      <w:pPr>
         <w:numPr>
           <w:ilvl w:val="0"/>
           <w:numId w:val="1011"/>
@@ -5314,7 +5656,6 @@
     </w:p>
     <w:p>
       <w:pPr>
-        <w:pStyle w:val="Compact"/>
         <w:numPr>
           <w:ilvl w:val="0"/>
           <w:numId w:val="1011"/>
@@ -5336,7 +5677,6 @@
     </w:p>
     <w:p>
       <w:pPr>
-        <w:pStyle w:val="Compact"/>
         <w:numPr>
           <w:ilvl w:val="0"/>
           <w:numId w:val="1011"/>
@@ -5358,7 +5698,6 @@
     </w:p>
     <w:p>
       <w:pPr>
-        <w:pStyle w:val="Compact"/>
         <w:numPr>
           <w:ilvl w:val="0"/>
           <w:numId w:val="1011"/>
@@ -5392,7 +5731,6 @@
     </w:p>
     <w:p>
       <w:pPr>
-        <w:pStyle w:val="Compact"/>
         <w:numPr>
           <w:ilvl w:val="0"/>
           <w:numId w:val="1011"/>
@@ -5414,7 +5752,6 @@
     </w:p>
     <w:p>
       <w:pPr>
-        <w:pStyle w:val="Compact"/>
         <w:numPr>
           <w:ilvl w:val="0"/>
           <w:numId w:val="1011"/>
@@ -5426,7 +5763,6 @@
     </w:p>
     <w:p>
       <w:pPr>
-        <w:pStyle w:val="Compact"/>
         <w:numPr>
           <w:ilvl w:val="0"/>
           <w:numId w:val="1011"/>
@@ -5441,9 +5777,9 @@
         <w:br w:type="page"/>
       </w:r>
     </w:p>
-    <w:bookmarkEnd w:id="31"/>
     <w:bookmarkEnd w:id="32"/>
-    <w:bookmarkStart w:id="37" w:name="пн-28.09-старт-эксперимента"/>
+    <w:bookmarkEnd w:id="33"/>
+    <w:bookmarkStart w:id="38" w:name="пн-28.09-старт-эксперимента"/>
     <w:p>
       <w:pPr>
         <w:pStyle w:val="Heading1"/>
@@ -5473,7 +5809,7 @@
         </w:pict>
       </w:r>
     </w:p>
-    <w:bookmarkStart w:id="33" w:name="telegram"/>
+    <w:bookmarkStart w:id="34" w:name="telegram"/>
     <w:p>
       <w:pPr>
         <w:pStyle w:val="Heading2"/>
@@ -5591,8 +5927,8 @@
         </w:pict>
       </w:r>
     </w:p>
-    <w:bookmarkEnd w:id="33"/>
-    <w:bookmarkStart w:id="34" w:name="reels-3040-сек-говорящая-голова"/>
+    <w:bookmarkEnd w:id="34"/>
+    <w:bookmarkStart w:id="35" w:name="reels-3040-сек-говорящая-голова"/>
     <w:p>
       <w:pPr>
         <w:pStyle w:val="Heading2"/>
@@ -5936,8 +6272,8 @@
         </w:pict>
       </w:r>
     </w:p>
-    <w:bookmarkEnd w:id="34"/>
-    <w:bookmarkStart w:id="35" w:name="сторис-статусы-tg"/>
+    <w:bookmarkEnd w:id="35"/>
+    <w:bookmarkStart w:id="36" w:name="сторис-статусы-tg"/>
     <w:p>
       <w:pPr>
         <w:pStyle w:val="Heading2"/>
@@ -6001,8 +6337,8 @@
         </w:pict>
       </w:r>
     </w:p>
-    <w:bookmarkEnd w:id="35"/>
-    <w:bookmarkStart w:id="36" w:name="что-нужно-от-вас"/>
+    <w:bookmarkEnd w:id="36"/>
+    <w:bookmarkStart w:id="37" w:name="что-нужно-от-вас"/>
     <w:p>
       <w:pPr>
         <w:pStyle w:val="Heading2"/>
@@ -6052,9 +6388,9 @@
         <w:br w:type="page"/>
       </w:r>
     </w:p>
-    <w:bookmarkEnd w:id="36"/>
     <w:bookmarkEnd w:id="37"/>
-    <w:bookmarkStart w:id="41" w:name="ср-30.09-помощница-алина"/>
+    <w:bookmarkEnd w:id="38"/>
+    <w:bookmarkStart w:id="42" w:name="ср-30.09-помощница-алина"/>
     <w:p>
       <w:pPr>
         <w:pStyle w:val="Heading1"/>
@@ -6082,7 +6418,7 @@
         <w:pStyle w:val="BodyText"/>
       </w:pPr>
       <w:r>
-        <w:t xml:space="preserve">❓ Проверить факты: что Алина реально умеет уже сейчас, оставить в тексте только правду. Ниже вариант исходя из текущей настройки (ChatPlace, Instagram, генерация фото через Gemini) и того, что она подготовила новую версию сайта.</w:t>
+        <w:t xml:space="preserve">Факты сверены со списком возможностей Алины (materials/text/alina-vozmozhnosti.md). Переписку показывать можно.</w:t>
       </w:r>
     </w:p>
     <w:p>
@@ -6092,7 +6428,7 @@
         </w:pict>
       </w:r>
     </w:p>
-    <w:bookmarkStart w:id="38" w:name="telegram-1"/>
+    <w:bookmarkStart w:id="39" w:name="telegram-1"/>
     <w:p>
       <w:pPr>
         <w:pStyle w:val="Heading2"/>
@@ -6126,7 +6462,37 @@
         <w:pStyle w:val="BodyText"/>
       </w:pPr>
       <w:r>
-        <w:t xml:space="preserve">Алина — ИИ-ассистент, которого я собрал сам. Отвечает на типовые сообщения, пишет черновики постов из моих голосовых, делает картинки, публикует по расписанию. И даже предложила переделать мой сайт. Смелая.</w:t>
+        <w:t xml:space="preserve">Алина — ИИ-ассистент в Telegram, который я собрал сам. Работает на своём сервере круглосуточно. Что она уже делает:</w:t>
+      </w:r>
+      <w:r>
+        <w:t xml:space="preserve"> </w:t>
+      </w:r>
+      <w:r>
+        <w:t xml:space="preserve">▫️ расшифровывает часовые записи встреч и делает выжимку;</w:t>
+      </w:r>
+      <w:r>
+        <w:t xml:space="preserve"> </w:t>
+      </w:r>
+      <w:r>
+        <w:t xml:space="preserve">▫️ каждое утро собирает задачи у 23 сотрудников, вечером — отчёт;</w:t>
+      </w:r>
+      <w:r>
+        <w:t xml:space="preserve"> </w:t>
+      </w:r>
+      <w:r>
+        <w:t xml:space="preserve">▫️ присылает сводки по рабочей почте;</w:t>
+      </w:r>
+      <w:r>
+        <w:t xml:space="preserve"> </w:t>
+      </w:r>
+      <w:r>
+        <w:t xml:space="preserve">▫️ пишет черновики постов из моих голосовых и рисует к ним картинки;</w:t>
+      </w:r>
+      <w:r>
+        <w:t xml:space="preserve"> </w:t>
+      </w:r>
+      <w:r>
+        <w:t xml:space="preserve">▫️ правит мой сайт. И даже предложила его переделать. Смелая.</w:t>
       </w:r>
     </w:p>
     <w:p>
@@ -6134,73 +6500,7 @@
         <w:pStyle w:val="BodyText"/>
       </w:pPr>
       <w:r>
-        <w:t xml:space="preserve">Первые выводы:</w:t>
-      </w:r>
-      <w:r>
-        <w:t xml:space="preserve"> </w:t>
-      </w:r>
-      <w:r>
-        <w:t xml:space="preserve">1.</w:t>
-      </w:r>
-      <w:r>
-        <w:t xml:space="preserve"> </w:t>
-      </w:r>
-      <w:r>
-        <w:rPr>
-          <w:b/>
-          <w:bCs/>
-        </w:rPr>
-        <w:t xml:space="preserve">ИИ не думает за вас.</w:t>
-      </w:r>
-      <w:r>
-        <w:t xml:space="preserve"> </w:t>
-      </w:r>
-      <w:r>
-        <w:t xml:space="preserve">Без вашего «а у меня было так» выходит гладкий текст ни о чём.</w:t>
-      </w:r>
-      <w:r>
-        <w:t xml:space="preserve"> </w:t>
-      </w:r>
-      <w:r>
-        <w:t xml:space="preserve">2.</w:t>
-      </w:r>
-      <w:r>
-        <w:t xml:space="preserve"> </w:t>
-      </w:r>
-      <w:r>
-        <w:rPr>
-          <w:b/>
-          <w:bCs/>
-        </w:rPr>
-        <w:t xml:space="preserve">Чтобы отдать задачу машине, надо самому понять, как вы её делаете.</w:t>
-      </w:r>
-      <w:r>
-        <w:t xml:space="preserve"> </w:t>
-      </w:r>
-      <w:r>
-        <w:t xml:space="preserve">Половина пользы — в этом.</w:t>
-      </w:r>
-      <w:r>
-        <w:t xml:space="preserve"> </w:t>
-      </w:r>
-      <w:r>
-        <w:t xml:space="preserve">3.</w:t>
-      </w:r>
-      <w:r>
-        <w:t xml:space="preserve"> </w:t>
-      </w:r>
-      <w:r>
-        <w:rPr>
-          <w:b/>
-          <w:bCs/>
-        </w:rPr>
-        <w:t xml:space="preserve">Начинайте с того, что бесит,</w:t>
-      </w:r>
-      <w:r>
-        <w:t xml:space="preserve"> </w:t>
-      </w:r>
-      <w:r>
-        <w:t xml:space="preserve">а не с того, что модно.</w:t>
+        <w:t xml:space="preserve">Правило одно: всё, что уходит от моего имени, я сначала читаю сам.</w:t>
       </w:r>
     </w:p>
     <w:p>
@@ -6208,7 +6508,7 @@
         <w:pStyle w:val="BodyText"/>
       </w:pPr>
       <w:r>
-        <w:t xml:space="preserve">Этот пост тоже начался с голосового на 4 минуты. Сколько времени экономит — посчитаю к воскресенью.</w:t>
+        <w:t xml:space="preserve">Главный вывод: чтобы отдать задачу машине, надо самому понять, как вы её делаете. Половина пользы — в этом.</w:t>
       </w:r>
     </w:p>
     <w:p>
@@ -6216,7 +6516,7 @@
         <w:pStyle w:val="BodyText"/>
       </w:pPr>
       <w:r>
-        <w:t xml:space="preserve">У вас уже есть ИИ-помощник?</w:t>
+        <w:t xml:space="preserve">Сколько времени экономит — посчитаю к воскресенью. А у вас уже есть ИИ-помощник?</w:t>
       </w:r>
     </w:p>
     <w:p>
@@ -6234,8 +6534,8 @@
         </w:pict>
       </w:r>
     </w:p>
-    <w:bookmarkEnd w:id="38"/>
-    <w:bookmarkStart w:id="39" w:name="reels-2535-сек"/>
+    <w:bookmarkEnd w:id="39"/>
+    <w:bookmarkStart w:id="40" w:name="reels-2535-сек"/>
     <w:p>
       <w:pPr>
         <w:pStyle w:val="Heading2"/>
@@ -6480,7 +6780,7 @@
               <w:rPr>
                 <w:sz w:val="19"/>
               </w:rPr>
-              <w:t xml:space="preserve">«Она отвечает на типовые сообщения, пишет черновики из моих голосовых, делает картинки и публикует посты. А я занимаюсь тем, что за меня никто не сделает.»</w:t>
+              <w:t xml:space="preserve">«Она расшифровывает встречи, собирает задачи с команды, разбирает почту и пишет черновики постов. А я занимаюсь тем, что за меня никто не сделает.»</w:t>
             </w:r>
           </w:p>
         </w:tc>
@@ -6545,7 +6845,7 @@
         <w:t xml:space="preserve"> </w:t>
       </w:r>
       <w:r>
-        <w:t xml:space="preserve">&gt; Собрал себе ИИ-помощницу. Главное открытие не про технологии: чтобы отдать задачу машине, сначала надо самому понять, как вы её делаете.</w:t>
+        <w:t xml:space="preserve">&gt; Собрал себе ИИ-помощницу: встречи, задачи команды, почта, черновики постов. Главное открытие не про технологии: чтобы отдать задачу машине, сначала надо самому понять, как вы её делаете.</w:t>
       </w:r>
       <w:r>
         <w:t xml:space="preserve"> </w:t>
@@ -6597,8 +6897,8 @@
         </w:pict>
       </w:r>
     </w:p>
-    <w:bookmarkEnd w:id="39"/>
-    <w:bookmarkStart w:id="40" w:name="сторис-статусы-tg-1"/>
+    <w:bookmarkEnd w:id="40"/>
+    <w:bookmarkStart w:id="41" w:name="сторис-статусы-tg-1"/>
     <w:p>
       <w:pPr>
         <w:pStyle w:val="Heading2"/>
@@ -6666,9 +6966,9 @@
         <w:br w:type="page"/>
       </w:r>
     </w:p>
-    <w:bookmarkEnd w:id="40"/>
     <w:bookmarkEnd w:id="41"/>
-    <w:bookmarkStart w:id="46" w:name="пт-02.10-10-часов-в-неделю"/>
+    <w:bookmarkEnd w:id="42"/>
+    <w:bookmarkStart w:id="47" w:name="пт-02.10-10-часов-в-неделю"/>
     <w:p>
       <w:pPr>
         <w:pStyle w:val="Heading1"/>
@@ -6704,7 +7004,7 @@
         </w:pict>
       </w:r>
     </w:p>
-    <w:bookmarkStart w:id="42" w:name="telegram-2"/>
+    <w:bookmarkStart w:id="43" w:name="telegram-2"/>
     <w:p>
       <w:pPr>
         <w:pStyle w:val="Heading2"/>
@@ -6808,8 +7108,8 @@
         </w:pict>
       </w:r>
     </w:p>
-    <w:bookmarkEnd w:id="42"/>
-    <w:bookmarkStart w:id="43" w:name="карусель-instagram-7-слайдов"/>
+    <w:bookmarkEnd w:id="43"/>
+    <w:bookmarkStart w:id="44" w:name="карусель-instagram-7-слайдов"/>
     <w:p>
       <w:pPr>
         <w:pStyle w:val="Heading2"/>
@@ -6979,8 +7279,8 @@
         </w:pict>
       </w:r>
     </w:p>
-    <w:bookmarkEnd w:id="43"/>
-    <w:bookmarkStart w:id="44" w:name="reels-сб-10.10-2535-сек"/>
+    <w:bookmarkEnd w:id="44"/>
+    <w:bookmarkStart w:id="45" w:name="reels-сб-10.10-2535-сек"/>
     <w:p>
       <w:pPr>
         <w:pStyle w:val="Heading2"/>
@@ -7272,8 +7572,8 @@
         </w:pict>
       </w:r>
     </w:p>
-    <w:bookmarkEnd w:id="44"/>
-    <w:bookmarkStart w:id="45" w:name="сторис-статусы-tg-2"/>
+    <w:bookmarkEnd w:id="45"/>
+    <w:bookmarkStart w:id="46" w:name="сторис-статусы-tg-2"/>
     <w:p>
       <w:pPr>
         <w:pStyle w:val="Heading2"/>
@@ -7323,9 +7623,9 @@
         <w:br w:type="page"/>
       </w:r>
     </w:p>
-    <w:bookmarkEnd w:id="45"/>
     <w:bookmarkEnd w:id="46"/>
-    <w:bookmarkStart w:id="50" w:name="вс-04.10-итоги-первой-недели"/>
+    <w:bookmarkEnd w:id="47"/>
+    <w:bookmarkStart w:id="51" w:name="вс-04.10-итоги-первой-недели"/>
     <w:p>
       <w:pPr>
         <w:pStyle w:val="Heading1"/>
@@ -7363,7 +7663,7 @@
         </w:pict>
       </w:r>
     </w:p>
-    <w:bookmarkStart w:id="47" w:name="telegram-3"/>
+    <w:bookmarkStart w:id="48" w:name="telegram-3"/>
     <w:p>
       <w:pPr>
         <w:pStyle w:val="Heading2"/>
@@ -7537,8 +7837,8 @@
         </w:pict>
       </w:r>
     </w:p>
-    <w:bookmarkEnd w:id="47"/>
-    <w:bookmarkStart w:id="48" w:name="сторис-статусы-tg-3"/>
+    <w:bookmarkEnd w:id="48"/>
+    <w:bookmarkStart w:id="49" w:name="сторис-статусы-tg-3"/>
     <w:p>
       <w:pPr>
         <w:pStyle w:val="Heading2"/>
@@ -7614,8 +7914,8 @@
         </w:pict>
       </w:r>
     </w:p>
-    <w:bookmarkEnd w:id="48"/>
-    <w:bookmarkStart w:id="49" w:name="что-нужно-от-вас-к-субботе"/>
+    <w:bookmarkEnd w:id="49"/>
+    <w:bookmarkStart w:id="50" w:name="что-нужно-от-вас-к-субботе"/>
     <w:p>
       <w:pPr>
         <w:pStyle w:val="Heading2"/>
@@ -7665,9 +7965,9 @@
         <w:br w:type="page"/>
       </w:r>
     </w:p>
-    <w:bookmarkEnd w:id="49"/>
     <w:bookmarkEnd w:id="50"/>
-    <w:bookmarkStart w:id="55" w:name="ср-07.10-бот-задач"/>
+    <w:bookmarkEnd w:id="51"/>
+    <w:bookmarkStart w:id="56" w:name="ср-07.10-бот-задач"/>
     <w:p>
       <w:pPr>
         <w:pStyle w:val="Heading1"/>
@@ -7701,7 +8001,7 @@
         <w:pStyle w:val="BodyText"/>
       </w:pPr>
       <w:r>
-        <w:t xml:space="preserve">❓ Проверить: у кого вы подсмотрели приём (можно назвать завод/директора или оставить анонимно), с какого числа бот работает у вас, сколько людей им пользуется («На месте (23)» на скрине).</w:t>
+        <w:t xml:space="preserve">Факт: бот работает в ИТ-парке НЧ, 23 сотрудника, ведёт его Алина. ❓ Осталось: называем директора завода или анонимно.</w:t>
       </w:r>
     </w:p>
     <w:p>
@@ -7711,7 +8011,7 @@
         </w:pict>
       </w:r>
     </w:p>
-    <w:bookmarkStart w:id="51" w:name="telegram-4"/>
+    <w:bookmarkStart w:id="52" w:name="telegram-4"/>
     <w:p>
       <w:pPr>
         <w:pStyle w:val="Heading2"/>
@@ -7785,7 +8085,7 @@
         <w:pStyle w:val="BodyText"/>
       </w:pPr>
       <w:r>
-        <w:t xml:space="preserve">Я забрал приём себе и добавил ИИ. Теперь в Telegram работает бот задач: утром собирает задачи, вечером спрашивает результат. А если задача расплывчатая («поработать с документами»), ИИ подсказывает, как сделать её конкретной: что, к какому сроку, какой результат.</w:t>
+        <w:t xml:space="preserve">Я забрал приём себе и добавил ИИ. Теперь у 23 сотрудников площадки в Telegram работает бот задач: утром собирает задачи, вечером спрашивает результат. А если задача расплывчатая («поработать с документами»), ИИ подсказывает, как сделать её конкретной: что, к какому сроку, какой результат.</w:t>
       </w:r>
     </w:p>
     <w:p>
@@ -7835,8 +8135,8 @@
         </w:pict>
       </w:r>
     </w:p>
-    <w:bookmarkEnd w:id="51"/>
-    <w:bookmarkStart w:id="52" w:name="reels-3040-сек"/>
+    <w:bookmarkEnd w:id="52"/>
+    <w:bookmarkStart w:id="53" w:name="reels-3040-сек"/>
     <w:p>
       <w:pPr>
         <w:pStyle w:val="Heading2"/>
@@ -8197,8 +8497,8 @@
         </w:pict>
       </w:r>
     </w:p>
-    <w:bookmarkEnd w:id="52"/>
-    <w:bookmarkStart w:id="53" w:name="карусель-instagram-6-слайдов"/>
+    <w:bookmarkEnd w:id="53"/>
+    <w:bookmarkStart w:id="54" w:name="карусель-instagram-6-слайдов"/>
     <w:p>
       <w:pPr>
         <w:pStyle w:val="Heading2"/>
@@ -8325,8 +8625,8 @@
         </w:pict>
       </w:r>
     </w:p>
-    <w:bookmarkEnd w:id="53"/>
-    <w:bookmarkStart w:id="54" w:name="сторис-статусы-tg-4"/>
+    <w:bookmarkEnd w:id="54"/>
+    <w:bookmarkStart w:id="55" w:name="сторис-статусы-tg-4"/>
     <w:p>
       <w:pPr>
         <w:pStyle w:val="Heading2"/>
@@ -8385,9 +8685,9 @@
         <w:br w:type="page"/>
       </w:r>
     </w:p>
-    <w:bookmarkEnd w:id="54"/>
     <w:bookmarkEnd w:id="55"/>
-    <w:bookmarkStart w:id="59" w:name="пт-09.10-правило-1-мотивированные-люди"/>
+    <w:bookmarkEnd w:id="56"/>
+    <w:bookmarkStart w:id="60" w:name="пт-09.10-правило-1-мотивированные-люди"/>
     <w:p>
       <w:pPr>
         <w:pStyle w:val="Heading1"/>
@@ -8431,7 +8731,7 @@
         </w:pict>
       </w:r>
     </w:p>
-    <w:bookmarkStart w:id="56" w:name="telegram-5"/>
+    <w:bookmarkStart w:id="57" w:name="telegram-5"/>
     <w:p>
       <w:pPr>
         <w:pStyle w:val="Heading2"/>
@@ -8587,8 +8887,8 @@
         </w:pict>
       </w:r>
     </w:p>
-    <w:bookmarkEnd w:id="56"/>
-    <w:bookmarkStart w:id="57" w:name="reels-2535-сек-1"/>
+    <w:bookmarkEnd w:id="57"/>
+    <w:bookmarkStart w:id="58" w:name="reels-2535-сек-1"/>
     <w:p>
       <w:pPr>
         <w:pStyle w:val="Heading2"/>
@@ -8914,8 +9214,8 @@
         </w:pict>
       </w:r>
     </w:p>
-    <w:bookmarkEnd w:id="57"/>
-    <w:bookmarkStart w:id="58" w:name="сторис-статусы-tg-5"/>
+    <w:bookmarkEnd w:id="58"/>
+    <w:bookmarkStart w:id="59" w:name="сторис-статусы-tg-5"/>
     <w:p>
       <w:pPr>
         <w:pStyle w:val="Heading2"/>
@@ -8965,9 +9265,9 @@
         <w:br w:type="page"/>
       </w:r>
     </w:p>
-    <w:bookmarkEnd w:id="58"/>
     <w:bookmarkEnd w:id="59"/>
-    <w:bookmarkStart w:id="64" w:name="сайт-текущая-версия-и-вариант-алины-v3"/>
+    <w:bookmarkEnd w:id="60"/>
+    <w:bookmarkStart w:id="65" w:name="сайт-текущая-версия-и-вариант-алины-v3"/>
     <w:p>
       <w:pPr>
         <w:pStyle w:val="Heading1"/>
@@ -8984,7 +9284,7 @@
         <w:t xml:space="preserve">Текущий: https://ayratsagdeev.ru/ · Вариант Алины: https://ayratsagdeev.ru/v3-db195455/</w:t>
       </w:r>
     </w:p>
-    <w:bookmarkStart w:id="60" w:name="вердикт"/>
+    <w:bookmarkStart w:id="61" w:name="вердикт"/>
     <w:p>
       <w:pPr>
         <w:pStyle w:val="Heading2"/>
@@ -9011,8 +9311,8 @@
         <w:t xml:space="preserve">Нужно поправить 6 пунктов ниже, в первую очередь обещание «минус 20 часов».</w:t>
       </w:r>
     </w:p>
-    <w:bookmarkEnd w:id="60"/>
-    <w:bookmarkStart w:id="61" w:name="что-в-v3-сильнее"/>
+    <w:bookmarkEnd w:id="61"/>
+    <w:bookmarkStart w:id="62" w:name="что-в-v3-сильнее"/>
     <w:p>
       <w:pPr>
         <w:pStyle w:val="Heading2"/>
@@ -9121,8 +9421,8 @@
         <w:t xml:space="preserve">Длинные карточки аудитории свернули в четыре строки, и читать стало легче.</w:t>
       </w:r>
     </w:p>
-    <w:bookmarkEnd w:id="61"/>
-    <w:bookmarkStart w:id="62" w:name="что-поправить"/>
+    <w:bookmarkEnd w:id="62"/>
+    <w:bookmarkStart w:id="63" w:name="что-поправить"/>
     <w:p>
       <w:pPr>
         <w:pStyle w:val="Heading2"/>
@@ -9263,8 +9563,8 @@
         <w:t xml:space="preserve">Это другая аудитория и другой чек. Лучше отдельная страница (например, /pomoshnik) или PDF-оффер, а в блоге для него свой призыв «ПОМОЩНИК».</w:t>
       </w:r>
     </w:p>
-    <w:bookmarkEnd w:id="62"/>
-    <w:bookmarkStart w:id="63" w:name="мелочи"/>
+    <w:bookmarkEnd w:id="63"/>
+    <w:bookmarkStart w:id="64" w:name="мелочи"/>
     <w:p>
       <w:pPr>
         <w:pStyle w:val="Heading2"/>
@@ -9285,8 +9585,8 @@
         <w:t xml:space="preserve">В сниппете для поиска/соцсетей (title/description) стоит добавить «ИИ» и «бизнес без ручного управления». Именно это люди из блога будут искать.</w:t>
       </w:r>
     </w:p>
-    <w:bookmarkEnd w:id="63"/>
     <w:bookmarkEnd w:id="64"/>
+    <w:bookmarkEnd w:id="65"/>
     <w:sectPr>
       <w:footnotePr>
         <w:numRestart w:val="eachSect"/>

</xml_diff>

<commit_message>
Credit Kvantor-M in task-bot post, add metrics how-to, VK personal page
Co-Authored-By: Claude Opus 5.5 <noreply@anthropic.com>
Claude-Session: https://claude.ai/code/session_01DZfKE2Qbh1BJBTBdA16C3f
</commit_message>
<xml_diff>
--- a/content/Kontent-plan_Ayrat_oktyabr-2026.docx
+++ b/content/Kontent-plan_Ayrat_oktyabr-2026.docx
@@ -3025,7 +3025,7 @@
               <w:rPr>
                 <w:sz w:val="19"/>
               </w:rPr>
-              <w:t xml:space="preserve">Выдать Алине личный ключ ВК для постов на стену. Группа vk.com/club240044508 уже подключена — решить, куда постим: страница или группа</w:t>
+              <w:t xml:space="preserve">Выдать Алине личный ключ ВК. Постим на личную страницу (решено 27.09); группа vk.com/club240044508 остаётся для бота-консультанта</w:t>
             </w:r>
           </w:p>
         </w:tc>
@@ -7625,7 +7625,7 @@
     </w:p>
     <w:bookmarkEnd w:id="46"/>
     <w:bookmarkEnd w:id="47"/>
-    <w:bookmarkStart w:id="51" w:name="вс-04.10-итоги-первой-недели"/>
+    <w:bookmarkStart w:id="52" w:name="вс-04.10-итоги-первой-недели"/>
     <w:p>
       <w:pPr>
         <w:pStyle w:val="Heading1"/>
@@ -7915,7 +7915,393 @@
       </w:r>
     </w:p>
     <w:bookmarkEnd w:id="49"/>
-    <w:bookmarkStart w:id="50" w:name="что-нужно-от-вас-к-субботе"/>
+    <w:bookmarkStart w:id="50" w:name="как-считать-5-минут"/>
+    <w:p>
+      <w:pPr>
+        <w:pStyle w:val="Heading2"/>
+      </w:pPr>
+      <w:r>
+        <w:t xml:space="preserve">Как считать (5 минут)</w:t>
+      </w:r>
+    </w:p>
+    <w:p>
+      <w:pPr>
+        <w:pStyle w:val="FirstParagraph"/>
+      </w:pPr>
+      <w:r>
+        <w:t xml:space="preserve">Точка «до» — снять</w:t>
+      </w:r>
+      <w:r>
+        <w:t xml:space="preserve"> </w:t>
+      </w:r>
+      <w:r>
+        <w:rPr>
+          <w:b/>
+          <w:bCs/>
+        </w:rPr>
+        <w:t xml:space="preserve">завтра утром, до первого поста</w:t>
+      </w:r>
+      <w:r>
+        <w:t xml:space="preserve">. Точка «после» — в субботу.</w:t>
+      </w:r>
+    </w:p>
+    <w:tbl>
+      <w:tblPr>
+        <w:tblStyle w:val="Table"/>
+        <w:tblW w:type="pct" w:w="5000"/>
+        <w:tblBorders>
+          <w:top w:val="single" w:sz="4" w:space="0" w:color="BFBFBF"/>
+          <w:left w:val="single" w:sz="4" w:space="0" w:color="BFBFBF"/>
+          <w:bottom w:val="single" w:sz="4" w:space="0" w:color="BFBFBF"/>
+          <w:right w:val="single" w:sz="4" w:space="0" w:color="BFBFBF"/>
+          <w:insideH w:val="single" w:sz="4" w:space="0" w:color="BFBFBF"/>
+          <w:insideV w:val="single" w:sz="4" w:space="0" w:color="BFBFBF"/>
+        </w:tblBorders>
+        <w:tblLayout w:type="fixed"/>
+        <w:tblLook w:firstRow="1" w:lastRow="0" w:firstColumn="0" w:lastColumn="0" w:noHBand="0" w:noVBand="0" w:val="0020"/>
+      </w:tblPr>
+      <w:tblGrid>
+        <w:gridCol w:w="1980"/>
+        <w:gridCol w:w="1980"/>
+        <w:gridCol w:w="1980"/>
+        <w:gridCol w:w="1980"/>
+      </w:tblGrid>
+      <w:tr>
+        <w:trPr>
+          <w:tblHeader w:val="on"/>
+        </w:trPr>
+        <w:tc>
+          <w:tcPr>
+            <w:shd w:val="clear" w:color="auto" w:fill="F3E3D6"/>
+          </w:tcPr>
+          <w:p>
+            <w:pPr>
+              <w:pStyle w:val="Compact"/>
+            </w:pPr>
+            <w:r>
+              <w:rPr>
+                <w:sz w:val="19"/>
+              </w:rPr>
+              <w:t xml:space="preserve">Метрика</w:t>
+            </w:r>
+          </w:p>
+        </w:tc>
+        <w:tc>
+          <w:tcPr>
+            <w:shd w:val="clear" w:color="auto" w:fill="F3E3D6"/>
+          </w:tcPr>
+          <w:p>
+            <w:pPr>
+              <w:pStyle w:val="Compact"/>
+            </w:pPr>
+            <w:r>
+              <w:rPr>
+                <w:sz w:val="19"/>
+              </w:rPr>
+              <w:t xml:space="preserve">Где взять</w:t>
+            </w:r>
+          </w:p>
+        </w:tc>
+        <w:tc>
+          <w:tcPr>
+            <w:shd w:val="clear" w:color="auto" w:fill="F3E3D6"/>
+          </w:tcPr>
+          <w:p>
+            <w:pPr>
+              <w:pStyle w:val="Compact"/>
+            </w:pPr>
+            <w:r>
+              <w:rPr>
+                <w:sz w:val="19"/>
+              </w:rPr>
+              <w:t xml:space="preserve">До (28.09 утро)</w:t>
+            </w:r>
+          </w:p>
+        </w:tc>
+        <w:tc>
+          <w:tcPr>
+            <w:shd w:val="clear" w:color="auto" w:fill="F3E3D6"/>
+          </w:tcPr>
+          <w:p>
+            <w:pPr>
+              <w:pStyle w:val="Compact"/>
+            </w:pPr>
+            <w:r>
+              <w:rPr>
+                <w:sz w:val="19"/>
+              </w:rPr>
+              <w:t xml:space="preserve">После (03.10)</w:t>
+            </w:r>
+          </w:p>
+        </w:tc>
+      </w:tr>
+      <w:tr>
+        <w:tc>
+          <w:tcPr/>
+          <w:p>
+            <w:pPr>
+              <w:pStyle w:val="Compact"/>
+            </w:pPr>
+            <w:r>
+              <w:rPr>
+                <w:sz w:val="19"/>
+              </w:rPr>
+              <w:t xml:space="preserve">Подписчики TG</w:t>
+            </w:r>
+          </w:p>
+        </w:tc>
+        <w:tc>
+          <w:tcPr/>
+          <w:p>
+            <w:pPr>
+              <w:pStyle w:val="Compact"/>
+            </w:pPr>
+            <w:r>
+              <w:rPr>
+                <w:sz w:val="19"/>
+              </w:rPr>
+              <w:t xml:space="preserve">Шапка канала</w:t>
+            </w:r>
+          </w:p>
+        </w:tc>
+        <w:tc>
+          <w:tcPr/>
+          <w:p>
+            <w:pPr>
+              <w:pStyle w:val="Compact"/>
+            </w:pPr>
+            <w:r>
+              <w:rPr>
+                <w:sz w:val="19"/>
+              </w:rPr>
+              <w:t xml:space="preserve">131</w:t>
+            </w:r>
+          </w:p>
+        </w:tc>
+        <w:tc>
+          <w:tcPr/>
+          <w:p>
+            <w:pPr>
+              <w:pStyle w:val="Compact"/>
+            </w:pPr>
+          </w:p>
+        </w:tc>
+      </w:tr>
+      <w:tr>
+        <w:tc>
+          <w:tcPr/>
+          <w:p>
+            <w:pPr>
+              <w:pStyle w:val="Compact"/>
+            </w:pPr>
+            <w:r>
+              <w:rPr>
+                <w:sz w:val="19"/>
+              </w:rPr>
+              <w:t xml:space="preserve">Подписчики IG / ВК</w:t>
+            </w:r>
+          </w:p>
+        </w:tc>
+        <w:tc>
+          <w:tcPr/>
+          <w:p>
+            <w:pPr>
+              <w:pStyle w:val="Compact"/>
+            </w:pPr>
+            <w:r>
+              <w:rPr>
+                <w:sz w:val="19"/>
+              </w:rPr>
+              <w:t xml:space="preserve">Профиль</w:t>
+            </w:r>
+          </w:p>
+        </w:tc>
+        <w:tc>
+          <w:tcPr/>
+          <w:p>
+            <w:pPr>
+              <w:pStyle w:val="Compact"/>
+            </w:pPr>
+          </w:p>
+        </w:tc>
+        <w:tc>
+          <w:tcPr/>
+          <w:p>
+            <w:pPr>
+              <w:pStyle w:val="Compact"/>
+            </w:pPr>
+          </w:p>
+        </w:tc>
+      </w:tr>
+      <w:tr>
+        <w:tc>
+          <w:tcPr/>
+          <w:p>
+            <w:pPr>
+              <w:pStyle w:val="Compact"/>
+            </w:pPr>
+            <w:r>
+              <w:rPr>
+                <w:sz w:val="19"/>
+              </w:rPr>
+              <w:t xml:space="preserve">Просмотры постов TG</w:t>
+            </w:r>
+          </w:p>
+        </w:tc>
+        <w:tc>
+          <w:tcPr/>
+          <w:p>
+            <w:pPr>
+              <w:pStyle w:val="Compact"/>
+            </w:pPr>
+            <w:r>
+              <w:rPr>
+                <w:sz w:val="19"/>
+              </w:rPr>
+              <w:t xml:space="preserve">👁 под каждым постом</w:t>
+            </w:r>
+          </w:p>
+        </w:tc>
+        <w:tc>
+          <w:tcPr/>
+          <w:p>
+            <w:pPr>
+              <w:pStyle w:val="Compact"/>
+            </w:pPr>
+            <w:r>
+              <w:rPr>
+                <w:sz w:val="19"/>
+              </w:rPr>
+              <w:t xml:space="preserve">—</w:t>
+            </w:r>
+          </w:p>
+        </w:tc>
+        <w:tc>
+          <w:tcPr/>
+          <w:p>
+            <w:pPr>
+              <w:pStyle w:val="Compact"/>
+            </w:pPr>
+          </w:p>
+        </w:tc>
+      </w:tr>
+      <w:tr>
+        <w:tc>
+          <w:tcPr/>
+          <w:p>
+            <w:pPr>
+              <w:pStyle w:val="Compact"/>
+            </w:pPr>
+            <w:r>
+              <w:rPr>
+                <w:sz w:val="19"/>
+              </w:rPr>
+              <w:t xml:space="preserve">Время на один пост</w:t>
+            </w:r>
+          </w:p>
+        </w:tc>
+        <w:tc>
+          <w:tcPr/>
+          <w:p>
+            <w:pPr>
+              <w:pStyle w:val="Compact"/>
+            </w:pPr>
+            <w:r>
+              <w:rPr>
+                <w:sz w:val="19"/>
+              </w:rPr>
+              <w:t xml:space="preserve">Таймер на телефоне: от голосового до публикации</w:t>
+            </w:r>
+          </w:p>
+        </w:tc>
+        <w:tc>
+          <w:tcPr/>
+          <w:p>
+            <w:pPr>
+              <w:pStyle w:val="Compact"/>
+            </w:pPr>
+            <w:r>
+              <w:rPr>
+                <w:sz w:val="19"/>
+              </w:rPr>
+              <w:t xml:space="preserve">по памяти, честно (~1,5 ч?)</w:t>
+            </w:r>
+          </w:p>
+        </w:tc>
+        <w:tc>
+          <w:tcPr/>
+          <w:p>
+            <w:pPr>
+              <w:pStyle w:val="Compact"/>
+            </w:pPr>
+          </w:p>
+        </w:tc>
+      </w:tr>
+      <w:tr>
+        <w:tc>
+          <w:tcPr/>
+          <w:p>
+            <w:pPr>
+              <w:pStyle w:val="Compact"/>
+            </w:pPr>
+            <w:r>
+              <w:rPr>
+                <w:sz w:val="19"/>
+              </w:rPr>
+              <w:t xml:space="preserve">Экранное время, ч/день</w:t>
+            </w:r>
+          </w:p>
+        </w:tc>
+        <w:tc>
+          <w:tcPr/>
+          <w:p>
+            <w:pPr>
+              <w:pStyle w:val="Compact"/>
+            </w:pPr>
+            <w:r>
+              <w:rPr>
+                <w:sz w:val="19"/>
+              </w:rPr>
+              <w:t xml:space="preserve">Настройки → Экранное время (Android: Цифровое благополучие), среднее за неделю</w:t>
+            </w:r>
+          </w:p>
+        </w:tc>
+        <w:tc>
+          <w:tcPr/>
+          <w:p>
+            <w:pPr>
+              <w:pStyle w:val="Compact"/>
+            </w:pPr>
+          </w:p>
+        </w:tc>
+        <w:tc>
+          <w:tcPr/>
+          <w:p>
+            <w:pPr>
+              <w:pStyle w:val="Compact"/>
+            </w:pPr>
+          </w:p>
+        </w:tc>
+      </w:tr>
+    </w:tbl>
+    <w:p>
+      <w:pPr>
+        <w:pStyle w:val="BodyText"/>
+      </w:pPr>
+      <w:r>
+        <w:t xml:space="preserve">Экранное время за первую неделю может почти не измениться, это нормально. Так и пишем: честность — главный приём эксперимента. Настоящие изменения видны на 3–4 неделе.</w:t>
+      </w:r>
+    </w:p>
+    <w:p>
+      <w:pPr>
+        <w:pStyle w:val="BodyText"/>
+      </w:pPr>
+      <w:r>
+        <w:t xml:space="preserve">Можно поручить Алине: каждую субботу в 18:00 собирать подписчиков и просмотры открытого TG-канала и присылать таблицу.</w:t>
+      </w:r>
+    </w:p>
+    <w:bookmarkEnd w:id="50"/>
+    <w:bookmarkStart w:id="51" w:name="что-нужно-от-вас-к-субботе"/>
     <w:p>
       <w:pPr>
         <w:pStyle w:val="Heading2"/>
@@ -7965,9 +8351,9 @@
         <w:br w:type="page"/>
       </w:r>
     </w:p>
-    <w:bookmarkEnd w:id="50"/>
     <w:bookmarkEnd w:id="51"/>
-    <w:bookmarkStart w:id="56" w:name="ср-07.10-бот-задач"/>
+    <w:bookmarkEnd w:id="52"/>
+    <w:bookmarkStart w:id="57" w:name="ср-07.10-бот-задач"/>
     <w:p>
       <w:pPr>
         <w:pStyle w:val="Heading1"/>
@@ -8001,7 +8387,7 @@
         <w:pStyle w:val="BodyText"/>
       </w:pPr>
       <w:r>
-        <w:t xml:space="preserve">Факт: бот работает в ИТ-парке НЧ, 23 сотрудника, ведёт его Алина. ❓ Осталось: называем директора завода или анонимно.</w:t>
+        <w:t xml:space="preserve">Факт: бот работает в ИТ-парке НЧ, 23 сотрудника, ведёт его Алина. Директор завода — анонимно (имя в открытых источниках не нашлось). Приём услышан на стратсессии у резидента ИТ-парка — центра бизнес-образования «Квантор-М» (quantorm.ru); упоминаем их, это плюс резиденту. ❓ Если «Квантор-М» подскажет имя директора и он не против — добавим.</w:t>
       </w:r>
     </w:p>
     <w:p>
@@ -8011,7 +8397,7 @@
         </w:pict>
       </w:r>
     </w:p>
-    <w:bookmarkStart w:id="52" w:name="telegram-4"/>
+    <w:bookmarkStart w:id="53" w:name="telegram-4"/>
     <w:p>
       <w:pPr>
         <w:pStyle w:val="Heading2"/>
@@ -8045,7 +8431,7 @@
         <w:pStyle w:val="BodyText"/>
       </w:pPr>
       <w:r>
-        <w:t xml:space="preserve">Директор одного завода решил это просто:</w:t>
+        <w:t xml:space="preserve">На стратсессии у нашего резидента, центра бизнес-образования «Квантор-М», я услышал, как это решил директор одного завода:</w:t>
       </w:r>
       <w:r>
         <w:t xml:space="preserve"> </w:t>
@@ -8135,8 +8521,8 @@
         </w:pict>
       </w:r>
     </w:p>
-    <w:bookmarkEnd w:id="52"/>
-    <w:bookmarkStart w:id="53" w:name="reels-3040-сек"/>
+    <w:bookmarkEnd w:id="53"/>
+    <w:bookmarkStart w:id="54" w:name="reels-3040-сек"/>
     <w:p>
       <w:pPr>
         <w:pStyle w:val="Heading2"/>
@@ -8497,8 +8883,8 @@
         </w:pict>
       </w:r>
     </w:p>
-    <w:bookmarkEnd w:id="53"/>
-    <w:bookmarkStart w:id="54" w:name="карусель-instagram-6-слайдов"/>
+    <w:bookmarkEnd w:id="54"/>
+    <w:bookmarkStart w:id="55" w:name="карусель-instagram-6-слайдов"/>
     <w:p>
       <w:pPr>
         <w:pStyle w:val="Heading2"/>
@@ -8625,8 +9011,8 @@
         </w:pict>
       </w:r>
     </w:p>
-    <w:bookmarkEnd w:id="54"/>
-    <w:bookmarkStart w:id="55" w:name="сторис-статусы-tg-4"/>
+    <w:bookmarkEnd w:id="55"/>
+    <w:bookmarkStart w:id="56" w:name="сторис-статусы-tg-4"/>
     <w:p>
       <w:pPr>
         <w:pStyle w:val="Heading2"/>
@@ -8685,9 +9071,9 @@
         <w:br w:type="page"/>
       </w:r>
     </w:p>
-    <w:bookmarkEnd w:id="55"/>
     <w:bookmarkEnd w:id="56"/>
-    <w:bookmarkStart w:id="60" w:name="пт-09.10-правило-1-мотивированные-люди"/>
+    <w:bookmarkEnd w:id="57"/>
+    <w:bookmarkStart w:id="61" w:name="пт-09.10-правило-1-мотивированные-люди"/>
     <w:p>
       <w:pPr>
         <w:pStyle w:val="Heading1"/>
@@ -8731,7 +9117,7 @@
         </w:pict>
       </w:r>
     </w:p>
-    <w:bookmarkStart w:id="57" w:name="telegram-5"/>
+    <w:bookmarkStart w:id="58" w:name="telegram-5"/>
     <w:p>
       <w:pPr>
         <w:pStyle w:val="Heading2"/>
@@ -8887,8 +9273,8 @@
         </w:pict>
       </w:r>
     </w:p>
-    <w:bookmarkEnd w:id="57"/>
-    <w:bookmarkStart w:id="58" w:name="reels-2535-сек-1"/>
+    <w:bookmarkEnd w:id="58"/>
+    <w:bookmarkStart w:id="59" w:name="reels-2535-сек-1"/>
     <w:p>
       <w:pPr>
         <w:pStyle w:val="Heading2"/>
@@ -9214,8 +9600,8 @@
         </w:pict>
       </w:r>
     </w:p>
-    <w:bookmarkEnd w:id="58"/>
-    <w:bookmarkStart w:id="59" w:name="сторис-статусы-tg-5"/>
+    <w:bookmarkEnd w:id="59"/>
+    <w:bookmarkStart w:id="60" w:name="сторис-статусы-tg-5"/>
     <w:p>
       <w:pPr>
         <w:pStyle w:val="Heading2"/>
@@ -9265,9 +9651,9 @@
         <w:br w:type="page"/>
       </w:r>
     </w:p>
-    <w:bookmarkEnd w:id="59"/>
     <w:bookmarkEnd w:id="60"/>
-    <w:bookmarkStart w:id="65" w:name="сайт-текущая-версия-и-вариант-алины-v3"/>
+    <w:bookmarkEnd w:id="61"/>
+    <w:bookmarkStart w:id="66" w:name="сайт-текущая-версия-и-вариант-алины-v3"/>
     <w:p>
       <w:pPr>
         <w:pStyle w:val="Heading1"/>
@@ -9284,7 +9670,7 @@
         <w:t xml:space="preserve">Текущий: https://ayratsagdeev.ru/ · Вариант Алины: https://ayratsagdeev.ru/v3-db195455/</w:t>
       </w:r>
     </w:p>
-    <w:bookmarkStart w:id="61" w:name="вердикт"/>
+    <w:bookmarkStart w:id="62" w:name="вердикт"/>
     <w:p>
       <w:pPr>
         <w:pStyle w:val="Heading2"/>
@@ -9311,8 +9697,8 @@
         <w:t xml:space="preserve">Нужно поправить 6 пунктов ниже, в первую очередь обещание «минус 20 часов».</w:t>
       </w:r>
     </w:p>
-    <w:bookmarkEnd w:id="61"/>
-    <w:bookmarkStart w:id="62" w:name="что-в-v3-сильнее"/>
+    <w:bookmarkEnd w:id="62"/>
+    <w:bookmarkStart w:id="63" w:name="что-в-v3-сильнее"/>
     <w:p>
       <w:pPr>
         <w:pStyle w:val="Heading2"/>
@@ -9421,8 +9807,8 @@
         <w:t xml:space="preserve">Длинные карточки аудитории свернули в четыре строки, и читать стало легче.</w:t>
       </w:r>
     </w:p>
-    <w:bookmarkEnd w:id="62"/>
-    <w:bookmarkStart w:id="63" w:name="что-поправить"/>
+    <w:bookmarkEnd w:id="63"/>
+    <w:bookmarkStart w:id="64" w:name="что-поправить"/>
     <w:p>
       <w:pPr>
         <w:pStyle w:val="Heading2"/>
@@ -9563,8 +9949,8 @@
         <w:t xml:space="preserve">Это другая аудитория и другой чек. Лучше отдельная страница (например, /pomoshnik) или PDF-оффер, а в блоге для него свой призыв «ПОМОЩНИК».</w:t>
       </w:r>
     </w:p>
-    <w:bookmarkEnd w:id="63"/>
-    <w:bookmarkStart w:id="64" w:name="мелочи"/>
+    <w:bookmarkEnd w:id="64"/>
+    <w:bookmarkStart w:id="65" w:name="мелочи"/>
     <w:p>
       <w:pPr>
         <w:pStyle w:val="Heading2"/>
@@ -9585,8 +9971,8 @@
         <w:t xml:space="preserve">В сниппете для поиска/соцсетей (title/description) стоит добавить «ИИ» и «бизнес без ручного управления». Именно это люди из блога будут искать.</w:t>
       </w:r>
     </w:p>
-    <w:bookmarkEnd w:id="64"/>
     <w:bookmarkEnd w:id="65"/>
+    <w:bookmarkEnd w:id="66"/>
     <w:sectPr>
       <w:footnotePr>
         <w:numRestart w:val="eachSect"/>

</xml_diff>

<commit_message>
Add task list for Alina, include it and questions in Word export
Co-Authored-By: Claude Opus 5.5 <noreply@anthropic.com>
Claude-Session: https://claude.ai/code/session_01DZfKE2Qbh1BJBTBdA16C3f
</commit_message>
<xml_diff>
--- a/content/Kontent-plan_Ayrat_oktyabr-2026.docx
+++ b/content/Kontent-plan_Ayrat_oktyabr-2026.docx
@@ -9971,8 +9971,1975 @@
         <w:t xml:space="preserve">В сниппете для поиска/соцсетей (title/description) стоит добавить «ИИ» и «бизнес без ручного управления». Именно это люди из блога будут искать.</w:t>
       </w:r>
     </w:p>
+    <w:p>
+      <w:r>
+        <w:br w:type="page"/>
+      </w:r>
+    </w:p>
     <w:bookmarkEnd w:id="65"/>
     <w:bookmarkEnd w:id="66"/>
+    <w:bookmarkStart w:id="74" w:name="задачи-для-алины"/>
+    <w:p>
+      <w:pPr>
+        <w:pStyle w:val="Heading1"/>
+      </w:pPr>
+      <w:r>
+        <w:t xml:space="preserve">Задачи для Алины</w:t>
+      </w:r>
+    </w:p>
+    <w:p>
+      <w:pPr>
+        <w:pStyle w:val="BlockText"/>
+      </w:pPr>
+      <w:r>
+        <w:t xml:space="preserve">Можно целиком переслать Алине. Порядок = приоритет.</w:t>
+      </w:r>
+      <w:r>
+        <w:t xml:space="preserve"> </w:t>
+      </w:r>
+      <w:r>
+        <w:t xml:space="preserve">Правило прежнее: всё от имени Айрата публикуется только после его «ок».</w:t>
+      </w:r>
+    </w:p>
+    <w:p>
+      <w:pPr>
+        <w:pStyle w:val="FirstParagraph"/>
+      </w:pPr>
+      <w:r>
+        <w:t xml:space="preserve">Алина, привет! Запускаем блог Айрата по контент-плану на 28.09 — 27.10. Ниже — что нужно от тебя.</w:t>
+      </w:r>
+    </w:p>
+    <w:bookmarkStart w:id="67" w:name="контекст-сегодня"/>
+    <w:p>
+      <w:pPr>
+        <w:pStyle w:val="Heading2"/>
+      </w:pPr>
+      <w:r>
+        <w:t xml:space="preserve">0. Контекст (сегодня)</w:t>
+      </w:r>
+    </w:p>
+    <w:p>
+      <w:pPr>
+        <w:pStyle w:val="Compact"/>
+        <w:numPr>
+          <w:ilvl w:val="0"/>
+          <w:numId w:val="1023"/>
+        </w:numPr>
+      </w:pPr>
+      <w:r>
+        <w:t xml:space="preserve">Запомни: Telegram-канал</w:t>
+      </w:r>
+      <w:r>
+        <w:t xml:space="preserve"> </w:t>
+      </w:r>
+      <w:r>
+        <w:rPr>
+          <w:b/>
+          <w:bCs/>
+        </w:rPr>
+        <w:t xml:space="preserve">существует</w:t>
+      </w:r>
+      <w:r>
+        <w:t xml:space="preserve"> </w:t>
+      </w:r>
+      <w:r>
+        <w:t xml:space="preserve">— t.me/Ayrat_blizhe («Ближе к Айрату»), 131 подписчик.</w:t>
+      </w:r>
+    </w:p>
+    <w:p>
+      <w:pPr>
+        <w:pStyle w:val="Compact"/>
+        <w:numPr>
+          <w:ilvl w:val="0"/>
+          <w:numId w:val="1023"/>
+        </w:numPr>
+      </w:pPr>
+      <w:r>
+        <w:t xml:space="preserve">Площадки: Instagram</w:t>
+      </w:r>
+      <w:r>
+        <w:t xml:space="preserve"> </w:t>
+      </w:r>
+      <w:r>
+        <w:t xml:space="preserve">@airat.sagdeev</w:t>
+      </w:r>
+      <w:r>
+        <w:t xml:space="preserve">, ВК —</w:t>
+      </w:r>
+      <w:r>
+        <w:t xml:space="preserve"> </w:t>
+      </w:r>
+      <w:r>
+        <w:rPr>
+          <w:b/>
+          <w:bCs/>
+        </w:rPr>
+        <w:t xml:space="preserve">личная страница</w:t>
+      </w:r>
+      <w:r>
+        <w:t xml:space="preserve"> </w:t>
+      </w:r>
+      <w:r>
+        <w:t xml:space="preserve">vk.ru/a.sagdeev (не группа club240044508, она остаётся за ботом-консультантом), MAX web.max.ru/-79479061387301.</w:t>
+      </w:r>
+    </w:p>
+    <w:p>
+      <w:pPr>
+        <w:pStyle w:val="Compact"/>
+        <w:numPr>
+          <w:ilvl w:val="0"/>
+          <w:numId w:val="1023"/>
+        </w:numPr>
+      </w:pPr>
+      <w:r>
+        <w:t xml:space="preserve">Запомни правила текста: на «вы», лично, с экспертизой и юмором;</w:t>
+      </w:r>
+      <w:r>
+        <w:t xml:space="preserve"> </w:t>
+      </w:r>
+      <w:r>
+        <w:rPr>
+          <w:b/>
+          <w:bCs/>
+        </w:rPr>
+        <w:t xml:space="preserve">пост TG — до ~1000 знаков, одна мысль</w:t>
+      </w:r>
+      <w:r>
+        <w:t xml:space="preserve">; рубрики #автоматизирую_себя, #управленческое, #из_ИТпарка, #ближе.</w:t>
+      </w:r>
+    </w:p>
+    <w:p>
+      <w:pPr>
+        <w:pStyle w:val="Compact"/>
+        <w:numPr>
+          <w:ilvl w:val="0"/>
+          <w:numId w:val="1023"/>
+        </w:numPr>
+      </w:pPr>
+      <w:r>
+        <w:t xml:space="preserve">Сюжет месяца: эксперимент «30 дней автоматизирую себя». Серия «5 правил бизнеса без ручного управления» по стартап-завтраку 23.09.</w:t>
+      </w:r>
+    </w:p>
+    <w:p>
+      <w:pPr>
+        <w:pStyle w:val="Compact"/>
+        <w:numPr>
+          <w:ilvl w:val="0"/>
+          <w:numId w:val="1023"/>
+        </w:numPr>
+      </w:pPr>
+      <w:r>
+        <w:t xml:space="preserve">Готовые тексты постов 01–06 лежат в Word-файле «Контент-план»: Айрат пришлёт.</w:t>
+      </w:r>
+    </w:p>
+    <w:bookmarkEnd w:id="67"/>
+    <w:bookmarkStart w:id="68" w:name="публикация-до-среды-30.09"/>
+    <w:p>
+      <w:pPr>
+        <w:pStyle w:val="Heading2"/>
+      </w:pPr>
+      <w:r>
+        <w:t xml:space="preserve">1. Публикация — до среды 30.09</w:t>
+      </w:r>
+    </w:p>
+    <w:tbl>
+      <w:tblPr>
+        <w:tblStyle w:val="Table"/>
+        <w:tblW w:type="pct" w:w="5000"/>
+        <w:tblBorders>
+          <w:top w:val="single" w:sz="4" w:space="0" w:color="BFBFBF"/>
+          <w:left w:val="single" w:sz="4" w:space="0" w:color="BFBFBF"/>
+          <w:bottom w:val="single" w:sz="4" w:space="0" w:color="BFBFBF"/>
+          <w:right w:val="single" w:sz="4" w:space="0" w:color="BFBFBF"/>
+          <w:insideH w:val="single" w:sz="4" w:space="0" w:color="BFBFBF"/>
+          <w:insideV w:val="single" w:sz="4" w:space="0" w:color="BFBFBF"/>
+        </w:tblBorders>
+        <w:tblLayout w:type="fixed"/>
+        <w:tblLook w:firstRow="1" w:lastRow="0" w:firstColumn="0" w:lastColumn="0" w:noHBand="0" w:noVBand="0" w:val="0020"/>
+      </w:tblPr>
+      <w:tblGrid>
+        <w:gridCol w:w="1980"/>
+        <w:gridCol w:w="1980"/>
+        <w:gridCol w:w="1980"/>
+        <w:gridCol w:w="1980"/>
+      </w:tblGrid>
+      <w:tr>
+        <w:trPr>
+          <w:tblHeader w:val="on"/>
+        </w:trPr>
+        <w:tc>
+          <w:tcPr>
+            <w:shd w:val="clear" w:color="auto" w:fill="F3E3D6"/>
+          </w:tcPr>
+          <w:p>
+            <w:pPr>
+              <w:pStyle w:val="Compact"/>
+            </w:pPr>
+            <w:r>
+              <w:rPr>
+                <w:sz w:val="19"/>
+              </w:rPr>
+              <w:t xml:space="preserve">#</w:t>
+            </w:r>
+          </w:p>
+        </w:tc>
+        <w:tc>
+          <w:tcPr>
+            <w:shd w:val="clear" w:color="auto" w:fill="F3E3D6"/>
+          </w:tcPr>
+          <w:p>
+            <w:pPr>
+              <w:pStyle w:val="Compact"/>
+            </w:pPr>
+            <w:r>
+              <w:rPr>
+                <w:sz w:val="19"/>
+              </w:rPr>
+              <w:t xml:space="preserve">Площадка</w:t>
+            </w:r>
+          </w:p>
+        </w:tc>
+        <w:tc>
+          <w:tcPr>
+            <w:shd w:val="clear" w:color="auto" w:fill="F3E3D6"/>
+          </w:tcPr>
+          <w:p>
+            <w:pPr>
+              <w:pStyle w:val="Compact"/>
+            </w:pPr>
+            <w:r>
+              <w:rPr>
+                <w:sz w:val="19"/>
+              </w:rPr>
+              <w:t xml:space="preserve">Что сделать</w:t>
+            </w:r>
+          </w:p>
+        </w:tc>
+        <w:tc>
+          <w:tcPr>
+            <w:shd w:val="clear" w:color="auto" w:fill="F3E3D6"/>
+          </w:tcPr>
+          <w:p>
+            <w:pPr>
+              <w:pStyle w:val="Compact"/>
+            </w:pPr>
+            <w:r>
+              <w:rPr>
+                <w:sz w:val="19"/>
+              </w:rPr>
+              <w:t xml:space="preserve">Что нужно от Айрата</w:t>
+            </w:r>
+          </w:p>
+        </w:tc>
+      </w:tr>
+      <w:tr>
+        <w:tc>
+          <w:tcPr/>
+          <w:p>
+            <w:pPr>
+              <w:pStyle w:val="Compact"/>
+            </w:pPr>
+            <w:r>
+              <w:rPr>
+                <w:sz w:val="19"/>
+              </w:rPr>
+              <w:t xml:space="preserve">1.1</w:t>
+            </w:r>
+          </w:p>
+        </w:tc>
+        <w:tc>
+          <w:tcPr/>
+          <w:p>
+            <w:pPr>
+              <w:pStyle w:val="Compact"/>
+            </w:pPr>
+            <w:r>
+              <w:rPr>
+                <w:sz w:val="19"/>
+              </w:rPr>
+              <w:t xml:space="preserve">Telegram</w:t>
+            </w:r>
+          </w:p>
+        </w:tc>
+        <w:tc>
+          <w:tcPr/>
+          <w:p>
+            <w:pPr>
+              <w:pStyle w:val="Compact"/>
+            </w:pPr>
+            <w:r>
+              <w:rPr>
+                <w:sz w:val="19"/>
+              </w:rPr>
+              <w:t xml:space="preserve">Публикация в канал через твоего бота. Режим: присылаешь Айрату готовый пост → кнопка «Опубликовать» / «Править» / «Отложить на время»</w:t>
+            </w:r>
+          </w:p>
+        </w:tc>
+        <w:tc>
+          <w:tcPr/>
+          <w:p>
+            <w:pPr>
+              <w:pStyle w:val="Compact"/>
+            </w:pPr>
+            <w:r>
+              <w:rPr>
+                <w:sz w:val="19"/>
+              </w:rPr>
+              <w:t xml:space="preserve">Добавить бота админом канала с правом публикации</w:t>
+            </w:r>
+          </w:p>
+        </w:tc>
+      </w:tr>
+      <w:tr>
+        <w:tc>
+          <w:tcPr/>
+          <w:p>
+            <w:pPr>
+              <w:pStyle w:val="Compact"/>
+            </w:pPr>
+            <w:r>
+              <w:rPr>
+                <w:sz w:val="19"/>
+              </w:rPr>
+              <w:t xml:space="preserve">1.2</w:t>
+            </w:r>
+          </w:p>
+        </w:tc>
+        <w:tc>
+          <w:tcPr/>
+          <w:p>
+            <w:pPr>
+              <w:pStyle w:val="Compact"/>
+            </w:pPr>
+            <w:r>
+              <w:rPr>
+                <w:sz w:val="19"/>
+              </w:rPr>
+              <w:t xml:space="preserve">Instagram</w:t>
+            </w:r>
+          </w:p>
+        </w:tc>
+        <w:tc>
+          <w:tcPr/>
+          <w:p>
+            <w:pPr>
+              <w:pStyle w:val="Compact"/>
+            </w:pPr>
+            <w:r>
+              <w:rPr>
+                <w:sz w:val="19"/>
+              </w:rPr>
+              <w:t xml:space="preserve">Обновить ключ API (истёк 02.09). Проверить публикацию рилса и карусели.</w:t>
+            </w:r>
+            <w:r>
+              <w:rPr>
+                <w:sz w:val="19"/>
+              </w:rPr>
+              <w:t xml:space="preserve"> </w:t>
+            </w:r>
+            <w:r>
+              <w:rPr>
+                <w:b/>
+                <w:bCs/>
+                <w:sz w:val="19"/>
+              </w:rPr>
+              <w:t xml:space="preserve">Поставь себе напоминание за 7 дней до следующего истечения ключа</w:t>
+            </w:r>
+          </w:p>
+        </w:tc>
+        <w:tc>
+          <w:tcPr/>
+          <w:p>
+            <w:pPr>
+              <w:pStyle w:val="Compact"/>
+            </w:pPr>
+            <w:r>
+              <w:rPr>
+                <w:sz w:val="19"/>
+              </w:rPr>
+              <w:t xml:space="preserve">Войти и подтвердить доступ</w:t>
+            </w:r>
+          </w:p>
+        </w:tc>
+      </w:tr>
+      <w:tr>
+        <w:tc>
+          <w:tcPr/>
+          <w:p>
+            <w:pPr>
+              <w:pStyle w:val="Compact"/>
+            </w:pPr>
+            <w:r>
+              <w:rPr>
+                <w:sz w:val="19"/>
+              </w:rPr>
+              <w:t xml:space="preserve">1.3</w:t>
+            </w:r>
+          </w:p>
+        </w:tc>
+        <w:tc>
+          <w:tcPr/>
+          <w:p>
+            <w:pPr>
+              <w:pStyle w:val="Compact"/>
+            </w:pPr>
+            <w:r>
+              <w:rPr>
+                <w:sz w:val="19"/>
+              </w:rPr>
+              <w:t xml:space="preserve">ВК</w:t>
+            </w:r>
+          </w:p>
+        </w:tc>
+        <w:tc>
+          <w:tcPr/>
+          <w:p>
+            <w:pPr>
+              <w:pStyle w:val="Compact"/>
+            </w:pPr>
+            <w:r>
+              <w:rPr>
+                <w:sz w:val="19"/>
+              </w:rPr>
+              <w:t xml:space="preserve">Посты и клипы на личную страницу</w:t>
+            </w:r>
+          </w:p>
+        </w:tc>
+        <w:tc>
+          <w:tcPr/>
+          <w:p>
+            <w:pPr>
+              <w:pStyle w:val="Compact"/>
+            </w:pPr>
+            <w:r>
+              <w:rPr>
+                <w:sz w:val="19"/>
+              </w:rPr>
+              <w:t xml:space="preserve">Выдать личный ключ ВК (стена, фото, видео)</w:t>
+            </w:r>
+          </w:p>
+        </w:tc>
+      </w:tr>
+      <w:tr>
+        <w:tc>
+          <w:tcPr/>
+          <w:p>
+            <w:pPr>
+              <w:pStyle w:val="Compact"/>
+            </w:pPr>
+            <w:r>
+              <w:rPr>
+                <w:sz w:val="19"/>
+              </w:rPr>
+              <w:t xml:space="preserve">1.4</w:t>
+            </w:r>
+          </w:p>
+        </w:tc>
+        <w:tc>
+          <w:tcPr/>
+          <w:p>
+            <w:pPr>
+              <w:pStyle w:val="Compact"/>
+            </w:pPr>
+            <w:r>
+              <w:rPr>
+                <w:sz w:val="19"/>
+              </w:rPr>
+              <w:t xml:space="preserve">MAX</w:t>
+            </w:r>
+          </w:p>
+        </w:tc>
+        <w:tc>
+          <w:tcPr/>
+          <w:p>
+            <w:pPr>
+              <w:pStyle w:val="Compact"/>
+            </w:pPr>
+            <w:r>
+              <w:rPr>
+                <w:sz w:val="19"/>
+              </w:rPr>
+              <w:t xml:space="preserve">Выяснить, можно ли публиковать в канал через бота/API. Если нет — присылать готовый текст для ручной вставки</w:t>
+            </w:r>
+          </w:p>
+        </w:tc>
+        <w:tc>
+          <w:tcPr/>
+          <w:p>
+            <w:pPr>
+              <w:pStyle w:val="Compact"/>
+            </w:pPr>
+            <w:r>
+              <w:rPr>
+                <w:sz w:val="19"/>
+              </w:rPr>
+              <w:t xml:space="preserve">—</w:t>
+            </w:r>
+          </w:p>
+        </w:tc>
+      </w:tr>
+      <w:tr>
+        <w:tc>
+          <w:tcPr/>
+          <w:p>
+            <w:pPr>
+              <w:pStyle w:val="Compact"/>
+            </w:pPr>
+            <w:r>
+              <w:rPr>
+                <w:sz w:val="19"/>
+              </w:rPr>
+              <w:t xml:space="preserve">1.5</w:t>
+            </w:r>
+          </w:p>
+        </w:tc>
+        <w:tc>
+          <w:tcPr/>
+          <w:p>
+            <w:pPr>
+              <w:pStyle w:val="Compact"/>
+            </w:pPr>
+            <w:r>
+              <w:rPr>
+                <w:sz w:val="19"/>
+              </w:rPr>
+              <w:t xml:space="preserve">Кросспостинг</w:t>
+            </w:r>
+          </w:p>
+        </w:tc>
+        <w:tc>
+          <w:tcPr/>
+          <w:p>
+            <w:pPr>
+              <w:pStyle w:val="Compact"/>
+            </w:pPr>
+            <w:r>
+              <w:rPr>
+                <w:sz w:val="19"/>
+              </w:rPr>
+              <w:t xml:space="preserve">Один одобренный пост → TG + ВК + MAX. В Instagram — отдельная подпись из плана</w:t>
+            </w:r>
+          </w:p>
+        </w:tc>
+        <w:tc>
+          <w:tcPr/>
+          <w:p>
+            <w:pPr>
+              <w:pStyle w:val="Compact"/>
+            </w:pPr>
+            <w:r>
+              <w:rPr>
+                <w:sz w:val="19"/>
+              </w:rPr>
+              <w:t xml:space="preserve">—</w:t>
+            </w:r>
+          </w:p>
+        </w:tc>
+      </w:tr>
+    </w:tbl>
+    <w:bookmarkEnd w:id="68"/>
+    <w:bookmarkStart w:id="69" w:name="контент-завод-с-этой-недели"/>
+    <w:p>
+      <w:pPr>
+        <w:pStyle w:val="Heading2"/>
+      </w:pPr>
+      <w:r>
+        <w:t xml:space="preserve">2. Контент-завод — с этой недели</w:t>
+      </w:r>
+    </w:p>
+    <w:p>
+      <w:pPr>
+        <w:pStyle w:val="Compact"/>
+        <w:numPr>
+          <w:ilvl w:val="0"/>
+          <w:numId w:val="1024"/>
+        </w:numPr>
+      </w:pPr>
+      <w:r>
+        <w:rPr>
+          <w:b/>
+          <w:bCs/>
+        </w:rPr>
+        <w:t xml:space="preserve">Голосовое → пакет.</w:t>
+      </w:r>
+      <w:r>
+        <w:t xml:space="preserve"> </w:t>
+      </w:r>
+      <w:r>
+        <w:t xml:space="preserve">Айрат присылает голосовое с пометкой даты («пост 07.10»). Ты делаешь: текст TG (до 1000 знаков) + сценарий рилса 30–40 сек (таблица «время / в кадре / текст») + подпись IG с хэштегами + 2–3 сторис. Формат — как в посте 01 плана.</w:t>
+      </w:r>
+    </w:p>
+    <w:p>
+      <w:pPr>
+        <w:pStyle w:val="Compact"/>
+        <w:numPr>
+          <w:ilvl w:val="0"/>
+          <w:numId w:val="1024"/>
+        </w:numPr>
+      </w:pPr>
+      <w:r>
+        <w:rPr>
+          <w:b/>
+          <w:bCs/>
+        </w:rPr>
+        <w:t xml:space="preserve">Обложки и карусели</w:t>
+      </w:r>
+      <w:r>
+        <w:t xml:space="preserve"> </w:t>
+      </w:r>
+      <w:r>
+        <w:t xml:space="preserve">через Nano Banana на Vertex (бонус до ~20.12). Шаблон в стиле презентации стартап-завтрака: тёмный фон, оранжевый акцент (#E86A1C), крупный шрифт. Лицо Айрата — только настоящие фото, ИИ — фон и иллюстрации.</w:t>
+      </w:r>
+    </w:p>
+    <w:p>
+      <w:pPr>
+        <w:pStyle w:val="Compact"/>
+        <w:numPr>
+          <w:ilvl w:val="1"/>
+          <w:numId w:val="1025"/>
+        </w:numPr>
+      </w:pPr>
+      <w:r>
+        <w:rPr>
+          <w:b/>
+          <w:bCs/>
+        </w:rPr>
+        <w:t xml:space="preserve">Первое:</w:t>
+      </w:r>
+      <w:r>
+        <w:t xml:space="preserve"> </w:t>
+      </w:r>
+      <w:r>
+        <w:t xml:space="preserve">карусель 7 слайдов к посту 03 «10 часов в неделю» — нужна к</w:t>
+      </w:r>
+      <w:r>
+        <w:t xml:space="preserve"> </w:t>
+      </w:r>
+      <w:r>
+        <w:rPr>
+          <w:b/>
+          <w:bCs/>
+        </w:rPr>
+        <w:t xml:space="preserve">четвергу 01.10</w:t>
+      </w:r>
+      <w:r>
+        <w:t xml:space="preserve">.</w:t>
+      </w:r>
+    </w:p>
+    <w:p>
+      <w:pPr>
+        <w:pStyle w:val="Compact"/>
+        <w:numPr>
+          <w:ilvl w:val="0"/>
+          <w:numId w:val="1024"/>
+        </w:numPr>
+      </w:pPr>
+      <w:r>
+        <w:rPr>
+          <w:b/>
+          <w:bCs/>
+        </w:rPr>
+        <w:t xml:space="preserve">Рилсы:</w:t>
+      </w:r>
+      <w:r>
+        <w:t xml:space="preserve"> </w:t>
+      </w:r>
+      <w:r>
+        <w:t xml:space="preserve">нарезка, субтитры, сжатие через ffmpeg. Попробовать Veo для коротких вставок (b-roll) — отчитаться, работает ли.</w:t>
+      </w:r>
+    </w:p>
+    <w:p>
+      <w:pPr>
+        <w:pStyle w:val="Compact"/>
+        <w:numPr>
+          <w:ilvl w:val="0"/>
+          <w:numId w:val="1024"/>
+        </w:numPr>
+      </w:pPr>
+      <w:r>
+        <w:rPr>
+          <w:b/>
+          <w:bCs/>
+        </w:rPr>
+        <w:t xml:space="preserve">Скрин бота задач для поста 05 (07.10):</w:t>
+      </w:r>
+      <w:r>
+        <w:t xml:space="preserve"> </w:t>
+      </w:r>
+      <w:r>
+        <w:t xml:space="preserve">демо-версия или скрин с</w:t>
+      </w:r>
+      <w:r>
+        <w:t xml:space="preserve"> </w:t>
+      </w:r>
+      <w:r>
+        <w:rPr>
+          <w:b/>
+          <w:bCs/>
+        </w:rPr>
+        <w:t xml:space="preserve">размытыми ФИО и задачами</w:t>
+      </w:r>
+      <w:r>
+        <w:t xml:space="preserve"> </w:t>
+      </w:r>
+      <w:r>
+        <w:t xml:space="preserve">сотрудников — к</w:t>
+      </w:r>
+      <w:r>
+        <w:t xml:space="preserve"> </w:t>
+      </w:r>
+      <w:r>
+        <w:rPr>
+          <w:b/>
+          <w:bCs/>
+        </w:rPr>
+        <w:t xml:space="preserve">06.10</w:t>
+      </w:r>
+      <w:r>
+        <w:t xml:space="preserve">.</w:t>
+      </w:r>
+    </w:p>
+    <w:bookmarkEnd w:id="69"/>
+    <w:bookmarkStart w:id="70" w:name="метрики-с-28.09"/>
+    <w:p>
+      <w:pPr>
+        <w:pStyle w:val="Heading2"/>
+      </w:pPr>
+      <w:r>
+        <w:t xml:space="preserve">3. Метрики — с 28.09</w:t>
+      </w:r>
+    </w:p>
+    <w:p>
+      <w:pPr>
+        <w:pStyle w:val="Compact"/>
+        <w:numPr>
+          <w:ilvl w:val="0"/>
+          <w:numId w:val="1026"/>
+        </w:numPr>
+      </w:pPr>
+      <w:r>
+        <w:rPr>
+          <w:b/>
+          <w:bCs/>
+        </w:rPr>
+        <w:t xml:space="preserve">28.09 утром</w:t>
+      </w:r>
+      <w:r>
+        <w:t xml:space="preserve"> </w:t>
+      </w:r>
+      <w:r>
+        <w:t xml:space="preserve">зафиксировать точку «до»: подписчики TG, IG, ВК.</w:t>
+      </w:r>
+    </w:p>
+    <w:p>
+      <w:pPr>
+        <w:pStyle w:val="Compact"/>
+        <w:numPr>
+          <w:ilvl w:val="0"/>
+          <w:numId w:val="1026"/>
+        </w:numPr>
+      </w:pPr>
+      <w:r>
+        <w:rPr>
+          <w:b/>
+          <w:bCs/>
+        </w:rPr>
+        <w:t xml:space="preserve">Каждую субботу в 18:00:</w:t>
+      </w:r>
+      <w:r>
+        <w:t xml:space="preserve"> </w:t>
+      </w:r>
+      <w:r>
+        <w:t xml:space="preserve">собрать подписчиков, просмотры постов TG за неделю (из t.me/s/Ayrat_blizhe), по возможности IG и ВК → короткая таблица Айрату + сравнение с прошлой неделей.</w:t>
+      </w:r>
+    </w:p>
+    <w:p>
+      <w:pPr>
+        <w:pStyle w:val="Compact"/>
+        <w:numPr>
+          <w:ilvl w:val="0"/>
+          <w:numId w:val="1026"/>
+        </w:numPr>
+      </w:pPr>
+      <w:r>
+        <w:t xml:space="preserve">Вести учёт «30 дней»: что автоматизировали, сколько времени сэкономили (со слов Айрата).</w:t>
+      </w:r>
+    </w:p>
+    <w:bookmarkEnd w:id="70"/>
+    <w:bookmarkStart w:id="71" w:name="напоминания-айрату"/>
+    <w:p>
+      <w:pPr>
+        <w:pStyle w:val="Heading2"/>
+      </w:pPr>
+      <w:r>
+        <w:t xml:space="preserve">4. Напоминания Айрату</w:t>
+      </w:r>
+    </w:p>
+    <w:p>
+      <w:pPr>
+        <w:pStyle w:val="Compact"/>
+        <w:numPr>
+          <w:ilvl w:val="0"/>
+          <w:numId w:val="1027"/>
+        </w:numPr>
+      </w:pPr>
+      <w:r>
+        <w:rPr>
+          <w:b/>
+          <w:bCs/>
+        </w:rPr>
+        <w:t xml:space="preserve">Пн 28.09, 8:00</w:t>
+      </w:r>
+      <w:r>
+        <w:t xml:space="preserve"> </w:t>
+      </w:r>
+      <w:r>
+        <w:t xml:space="preserve">— снять рилс к посту 01 (15 мин), снять цифры «до».</w:t>
+      </w:r>
+    </w:p>
+    <w:p>
+      <w:pPr>
+        <w:pStyle w:val="Compact"/>
+        <w:numPr>
+          <w:ilvl w:val="0"/>
+          <w:numId w:val="1027"/>
+        </w:numPr>
+      </w:pPr>
+      <w:r>
+        <w:rPr>
+          <w:b/>
+          <w:bCs/>
+        </w:rPr>
+        <w:t xml:space="preserve">Каждую субботу 17:00</w:t>
+      </w:r>
+      <w:r>
+        <w:t xml:space="preserve"> </w:t>
+      </w:r>
+      <w:r>
+        <w:t xml:space="preserve">— прислать цифры недели, одно «сработало» и одно «не сработало», голосовое про выходные.</w:t>
+      </w:r>
+    </w:p>
+    <w:p>
+      <w:pPr>
+        <w:pStyle w:val="Compact"/>
+        <w:numPr>
+          <w:ilvl w:val="0"/>
+          <w:numId w:val="1027"/>
+        </w:numPr>
+      </w:pPr>
+      <w:r>
+        <w:rPr>
+          <w:b/>
+          <w:bCs/>
+        </w:rPr>
+        <w:t xml:space="preserve">Каждое воскресенье 19:00</w:t>
+      </w:r>
+      <w:r>
+        <w:t xml:space="preserve"> </w:t>
+      </w:r>
+      <w:r>
+        <w:t xml:space="preserve">— надиктовать голосовые по темам следующей недели (темы из календаря присылай списком).</w:t>
+      </w:r>
+    </w:p>
+    <w:p>
+      <w:pPr>
+        <w:pStyle w:val="Compact"/>
+        <w:numPr>
+          <w:ilvl w:val="0"/>
+          <w:numId w:val="1027"/>
+        </w:numPr>
+      </w:pPr>
+      <w:r>
+        <w:rPr>
+          <w:b/>
+          <w:bCs/>
+        </w:rPr>
+        <w:t xml:space="preserve">За день до каждого рилса</w:t>
+      </w:r>
+      <w:r>
+        <w:t xml:space="preserve"> </w:t>
+      </w:r>
+      <w:r>
+        <w:t xml:space="preserve">— напоминание о съёмке.</w:t>
+      </w:r>
+    </w:p>
+    <w:bookmarkEnd w:id="71"/>
+    <w:bookmarkStart w:id="72" w:name="позже-октябрь"/>
+    <w:p>
+      <w:pPr>
+        <w:pStyle w:val="Heading2"/>
+      </w:pPr>
+      <w:r>
+        <w:t xml:space="preserve">5. Позже (октябрь)</w:t>
+      </w:r>
+    </w:p>
+    <w:p>
+      <w:pPr>
+        <w:pStyle w:val="Compact"/>
+        <w:numPr>
+          <w:ilvl w:val="0"/>
+          <w:numId w:val="1028"/>
+        </w:numPr>
+      </w:pPr>
+      <w:r>
+        <w:rPr>
+          <w:b/>
+          <w:bCs/>
+        </w:rPr>
+        <w:t xml:space="preserve">Сайт ayratsagdeev.ru:</w:t>
+      </w:r>
+      <w:r>
+        <w:t xml:space="preserve"> </w:t>
+      </w:r>
+      <w:r>
+        <w:t xml:space="preserve">внести правки по разбору (стаж «13 лет», ссылка на блог, цена экспресс-разбора, «минус 20 часов» с оговоркой) —</w:t>
+      </w:r>
+      <w:r>
+        <w:t xml:space="preserve"> </w:t>
+      </w:r>
+      <w:r>
+        <w:rPr>
+          <w:b/>
+          <w:bCs/>
+        </w:rPr>
+        <w:t xml:space="preserve">после согласования с Айратом</w:t>
+      </w:r>
+      <w:r>
+        <w:t xml:space="preserve">. Отдельная страница для ИИ-помощника (/pomoshnik) — обсудить.</w:t>
+      </w:r>
+    </w:p>
+    <w:p>
+      <w:pPr>
+        <w:pStyle w:val="Compact"/>
+        <w:numPr>
+          <w:ilvl w:val="0"/>
+          <w:numId w:val="1028"/>
+        </w:numPr>
+      </w:pPr>
+      <w:r>
+        <w:rPr>
+          <w:b/>
+          <w:bCs/>
+        </w:rPr>
+        <w:t xml:space="preserve">Лид-магнит к 22.10:</w:t>
+      </w:r>
+      <w:r>
+        <w:t xml:space="preserve"> </w:t>
+      </w:r>
+      <w:r>
+        <w:t xml:space="preserve">PDF-чек-лист «5 правил бизнеса без ручного управления» по слайдам стартап-завтрака, в стиле презентации.</w:t>
+      </w:r>
+    </w:p>
+    <w:p>
+      <w:pPr>
+        <w:pStyle w:val="Compact"/>
+        <w:numPr>
+          <w:ilvl w:val="0"/>
+          <w:numId w:val="1028"/>
+        </w:numPr>
+      </w:pPr>
+      <w:r>
+        <w:rPr>
+          <w:b/>
+          <w:bCs/>
+        </w:rPr>
+        <w:t xml:space="preserve">Ответ на слово «МАШИНА»</w:t>
+      </w:r>
+      <w:r>
+        <w:t xml:space="preserve"> </w:t>
+      </w:r>
+      <w:r>
+        <w:t xml:space="preserve">в комментариях (22.10) и «ПОМОЩНИК» (26.10): отправлять чек-лист / оффер, собирать заявки Айрату.</w:t>
+      </w:r>
+    </w:p>
+    <w:p>
+      <w:pPr>
+        <w:pStyle w:val="Compact"/>
+        <w:numPr>
+          <w:ilvl w:val="0"/>
+          <w:numId w:val="1028"/>
+        </w:numPr>
+      </w:pPr>
+      <w:r>
+        <w:rPr>
+          <w:b/>
+          <w:bCs/>
+        </w:rPr>
+        <w:t xml:space="preserve">Кейсы для постов:</w:t>
+      </w:r>
+      <w:r>
+        <w:t xml:space="preserve"> </w:t>
+      </w:r>
+      <w:r>
+        <w:t xml:space="preserve">собрать цифры по ботам Полины (телефония, Битрикс) и Елены (Instagram, маркетплейсы) — сколько времени экономят. Спросить согласие на упоминание.</w:t>
+      </w:r>
+    </w:p>
+    <w:bookmarkEnd w:id="72"/>
+    <w:bookmarkStart w:id="73" w:name="безопасность"/>
+    <w:p>
+      <w:pPr>
+        <w:pStyle w:val="Heading2"/>
+      </w:pPr>
+      <w:r>
+        <w:t xml:space="preserve">6. Безопасность</w:t>
+      </w:r>
+    </w:p>
+    <w:p>
+      <w:pPr>
+        <w:pStyle w:val="Compact"/>
+        <w:numPr>
+          <w:ilvl w:val="0"/>
+          <w:numId w:val="1029"/>
+        </w:numPr>
+      </w:pPr>
+      <w:r>
+        <w:t xml:space="preserve">Все ключи (Instagram, ВК, Telegram, Vertex, fal.ai, почта) — только на сервере, не в git и не в чатах.</w:t>
+      </w:r>
+    </w:p>
+    <w:p>
+      <w:pPr>
+        <w:pStyle w:val="Compact"/>
+        <w:numPr>
+          <w:ilvl w:val="0"/>
+          <w:numId w:val="1029"/>
+        </w:numPr>
+      </w:pPr>
+      <w:r>
+        <w:t xml:space="preserve">В репозитории alina-instagram в .env.example лежит похожий на настоящий ключ ChatPlace — проверить и при необходимости перевыпустить.</w:t>
+      </w:r>
+    </w:p>
+    <w:p>
+      <w:r>
+        <w:br w:type="page"/>
+      </w:r>
+    </w:p>
+    <w:bookmarkEnd w:id="73"/>
+    <w:bookmarkEnd w:id="74"/>
+    <w:bookmarkStart w:id="83" w:name="вопросы-и-замечания"/>
+    <w:p>
+      <w:pPr>
+        <w:pStyle w:val="Heading1"/>
+      </w:pPr>
+      <w:r>
+        <w:t xml:space="preserve">Вопросы и замечания</w:t>
+      </w:r>
+    </w:p>
+    <w:p>
+      <w:pPr>
+        <w:pStyle w:val="FirstParagraph"/>
+      </w:pPr>
+      <w:r>
+        <w:t xml:space="preserve">Сгруппированы по срочности. Можно отвечать номерами, коротко или голосовыми.</w:t>
+      </w:r>
+    </w:p>
+    <w:bookmarkStart w:id="75" w:name="до-завтра-старт-28.09"/>
+    <w:p>
+      <w:pPr>
+        <w:pStyle w:val="Heading2"/>
+      </w:pPr>
+      <w:r>
+        <w:t xml:space="preserve">🔴 До завтра (старт 28.09)</w:t>
+      </w:r>
+    </w:p>
+    <w:p>
+      <w:pPr>
+        <w:pStyle w:val="Compact"/>
+        <w:numPr>
+          <w:ilvl w:val="0"/>
+          <w:numId w:val="1030"/>
+        </w:numPr>
+      </w:pPr>
+      <w:r>
+        <w:t xml:space="preserve">✅ Тон ок, делаем короче.</w:t>
+      </w:r>
+      <w:r>
+        <w:t xml:space="preserve"> </w:t>
+      </w:r>
+      <w:r>
+        <w:rPr>
+          <w:b/>
+          <w:bCs/>
+        </w:rPr>
+        <w:t xml:space="preserve">Тон и длина постов 01–03.</w:t>
+      </w:r>
+      <w:r>
+        <w:t xml:space="preserve"> </w:t>
+      </w:r>
+      <w:r>
+        <w:t xml:space="preserve">Подходят или правим (короче, больше юмора, меньше смайлов)?</w:t>
+      </w:r>
+    </w:p>
+    <w:p>
+      <w:pPr>
+        <w:pStyle w:val="Compact"/>
+        <w:numPr>
+          <w:ilvl w:val="0"/>
+          <w:numId w:val="1030"/>
+        </w:numPr>
+      </w:pPr>
+      <w:r>
+        <w:t xml:space="preserve">✅ Снимете в понедельник.</w:t>
+      </w:r>
+      <w:r>
+        <w:t xml:space="preserve"> </w:t>
+      </w:r>
+      <w:r>
+        <w:rPr>
+          <w:b/>
+          <w:bCs/>
+        </w:rPr>
+        <w:t xml:space="preserve">Рилс к посту 01.</w:t>
+      </w:r>
+      <w:r>
+        <w:t xml:space="preserve"> </w:t>
+      </w:r>
+      <w:r>
+        <w:t xml:space="preserve">Успеете снять в понедельник утром (15 минут, говорящая голова)? Если нет, первый день выходит только текстом.</w:t>
+      </w:r>
+    </w:p>
+    <w:p>
+      <w:pPr>
+        <w:pStyle w:val="Compact"/>
+        <w:numPr>
+          <w:ilvl w:val="0"/>
+          <w:numId w:val="1030"/>
+        </w:numPr>
+      </w:pPr>
+      <w:r>
+        <w:t xml:space="preserve">✅ IG</w:t>
+      </w:r>
+      <w:r>
+        <w:t xml:space="preserve"> </w:t>
+      </w:r>
+      <w:r>
+        <w:t xml:space="preserve">@airat.sagdeev</w:t>
+      </w:r>
+      <w:r>
+        <w:t xml:space="preserve">, ВК vk.ru/a.sagdeev, MAX добавлены; ссылки стоят в конце поста 01.</w:t>
+      </w:r>
+      <w:r>
+        <w:t xml:space="preserve"> </w:t>
+      </w:r>
+      <w:r>
+        <w:rPr>
+          <w:b/>
+          <w:bCs/>
+        </w:rPr>
+        <w:t xml:space="preserve">Новые аккаунты.</w:t>
+      </w:r>
+      <w:r>
+        <w:t xml:space="preserve"> </w:t>
+      </w:r>
+      <w:r>
+        <w:t xml:space="preserve">Instagram, ВК, MAX уже заведены? Нужны ссылки для поста 01 («ссылки в комментариях»). Если аккаунтов пока нет, уберу эту строку.</w:t>
+      </w:r>
+    </w:p>
+    <w:p>
+      <w:pPr>
+        <w:pStyle w:val="Compact"/>
+        <w:numPr>
+          <w:ilvl w:val="0"/>
+          <w:numId w:val="1030"/>
+        </w:numPr>
+      </w:pPr>
+      <w:r>
+        <w:t xml:space="preserve">✅ Разберётесь сами.</w:t>
+      </w:r>
+      <w:r>
+        <w:t xml:space="preserve"> </w:t>
+      </w:r>
+      <w:r>
+        <w:rPr>
+          <w:b/>
+          <w:bCs/>
+        </w:rPr>
+        <w:t xml:space="preserve">Экранное время.</w:t>
+      </w:r>
+      <w:r>
+        <w:t xml:space="preserve"> </w:t>
+      </w:r>
+      <w:r>
+        <w:t xml:space="preserve">Скрин экранного времени телефона за неделю — для сторис 29.09 и итогов недели.</w:t>
+      </w:r>
+    </w:p>
+    <w:bookmarkEnd w:id="75"/>
+    <w:bookmarkStart w:id="76" w:name="до-30.09-пост-про-алину"/>
+    <w:p>
+      <w:pPr>
+        <w:pStyle w:val="Heading2"/>
+      </w:pPr>
+      <w:r>
+        <w:t xml:space="preserve">🟠 До 30.09 (пост про Алину)</w:t>
+      </w:r>
+    </w:p>
+    <w:p>
+      <w:pPr>
+        <w:pStyle w:val="Compact"/>
+        <w:numPr>
+          <w:ilvl w:val="0"/>
+          <w:numId w:val="1031"/>
+        </w:numPr>
+      </w:pPr>
+      <w:r>
+        <w:t xml:space="preserve">✅ Список получен, пост 02 переписан.</w:t>
+      </w:r>
+      <w:r>
+        <w:t xml:space="preserve"> </w:t>
+      </w:r>
+      <w:r>
+        <w:rPr>
+          <w:b/>
+          <w:bCs/>
+        </w:rPr>
+        <w:t xml:space="preserve">Что Алина реально умеет сейчас?</w:t>
+      </w:r>
+      <w:r>
+        <w:t xml:space="preserve"> </w:t>
+      </w:r>
+      <w:r>
+        <w:t xml:space="preserve">Отвечает на сообщения, пишет черновики из голосовых, делает картинки, публикует по расписанию, сделала сайт v3. Оставлю в посте только то, что правда.</w:t>
+      </w:r>
+    </w:p>
+    <w:p>
+      <w:pPr>
+        <w:pStyle w:val="Compact"/>
+        <w:numPr>
+          <w:ilvl w:val="0"/>
+          <w:numId w:val="1031"/>
+        </w:numPr>
+      </w:pPr>
+      <w:r>
+        <w:t xml:space="preserve">✅ Можно.</w:t>
+      </w:r>
+      <w:r>
+        <w:t xml:space="preserve"> </w:t>
+      </w:r>
+      <w:r>
+        <w:rPr>
+          <w:b/>
+          <w:bCs/>
+        </w:rPr>
+        <w:t xml:space="preserve">Можно ли показывать переписку с Алиной</w:t>
+      </w:r>
+      <w:r>
+        <w:t xml:space="preserve"> </w:t>
+      </w:r>
+      <w:r>
+        <w:t xml:space="preserve">в рилсе и сторис?</w:t>
+      </w:r>
+    </w:p>
+    <w:bookmarkEnd w:id="76"/>
+    <w:bookmarkStart w:id="77" w:name="до-04.10-итоги-недели"/>
+    <w:p>
+      <w:pPr>
+        <w:pStyle w:val="Heading2"/>
+      </w:pPr>
+      <w:r>
+        <w:t xml:space="preserve">🟡 До 04.10 (итоги недели)</w:t>
+      </w:r>
+    </w:p>
+    <w:p>
+      <w:pPr>
+        <w:pStyle w:val="Compact"/>
+        <w:numPr>
+          <w:ilvl w:val="0"/>
+          <w:numId w:val="1032"/>
+        </w:numPr>
+      </w:pPr>
+      <w:r>
+        <w:t xml:space="preserve">⏳ Как считать — в посте 04.</w:t>
+      </w:r>
+      <w:r>
+        <w:t xml:space="preserve"> </w:t>
+      </w:r>
+      <w:r>
+        <w:rPr>
+          <w:b/>
+          <w:bCs/>
+        </w:rPr>
+        <w:t xml:space="preserve">Цифры недели</w:t>
+      </w:r>
+      <w:r>
+        <w:t xml:space="preserve"> </w:t>
+      </w:r>
+      <w:r>
+        <w:t xml:space="preserve">к субботе: время на один пост до и после, экранное время, подписчики.</w:t>
+      </w:r>
+    </w:p>
+    <w:p>
+      <w:pPr>
+        <w:pStyle w:val="Compact"/>
+        <w:numPr>
+          <w:ilvl w:val="0"/>
+          <w:numId w:val="1032"/>
+        </w:numPr>
+      </w:pPr>
+      <w:r>
+        <w:rPr>
+          <w:b/>
+          <w:bCs/>
+        </w:rPr>
+        <w:t xml:space="preserve">Что сработало и что нет</w:t>
+      </w:r>
+      <w:r>
+        <w:t xml:space="preserve"> </w:t>
+      </w:r>
+      <w:r>
+        <w:t xml:space="preserve">— по одному примеру.</w:t>
+      </w:r>
+    </w:p>
+    <w:p>
+      <w:pPr>
+        <w:pStyle w:val="Compact"/>
+        <w:numPr>
+          <w:ilvl w:val="0"/>
+          <w:numId w:val="1032"/>
+        </w:numPr>
+      </w:pPr>
+      <w:r>
+        <w:rPr>
+          <w:b/>
+          <w:bCs/>
+        </w:rPr>
+        <w:t xml:space="preserve">Голосовое на 2–3 минуты про выходные</w:t>
+      </w:r>
+      <w:r>
+        <w:t xml:space="preserve"> </w:t>
+      </w:r>
+      <w:r>
+        <w:t xml:space="preserve">для личной части.</w:t>
+      </w:r>
+    </w:p>
+    <w:bookmarkEnd w:id="77"/>
+    <w:bookmarkStart w:id="78" w:name="до-0709.10-бот-задач-правило-1"/>
+    <w:p>
+      <w:pPr>
+        <w:pStyle w:val="Heading2"/>
+      </w:pPr>
+      <w:r>
+        <w:t xml:space="preserve">🟡 До 07–09.10 (бот задач, правило 1)</w:t>
+      </w:r>
+    </w:p>
+    <w:p>
+      <w:pPr>
+        <w:pStyle w:val="Compact"/>
+        <w:numPr>
+          <w:ilvl w:val="0"/>
+          <w:numId w:val="1033"/>
+        </w:numPr>
+      </w:pPr>
+      <w:r>
+        <w:t xml:space="preserve">✅ Работает, 23 сотрудника.</w:t>
+      </w:r>
+      <w:r>
+        <w:t xml:space="preserve"> </w:t>
+      </w:r>
+      <w:r>
+        <w:rPr>
+          <w:b/>
+          <w:bCs/>
+        </w:rPr>
+        <w:t xml:space="preserve">Бот задач.</w:t>
+      </w:r>
+      <w:r>
+        <w:t xml:space="preserve"> </w:t>
+      </w:r>
+      <w:r>
+        <w:t xml:space="preserve">Работает у вас на площадке? С какого числа, сколько людей пользуется (на скрине «На месте (23)»)?</w:t>
+      </w:r>
+    </w:p>
+    <w:p>
+      <w:pPr>
+        <w:pStyle w:val="Compact"/>
+        <w:numPr>
+          <w:ilvl w:val="0"/>
+          <w:numId w:val="1033"/>
+        </w:numPr>
+      </w:pPr>
+      <w:r>
+        <w:t xml:space="preserve">✅ Анонимно, со ссылкой на «Квантор-М».</w:t>
+      </w:r>
+      <w:r>
+        <w:t xml:space="preserve"> </w:t>
+      </w:r>
+      <w:r>
+        <w:rPr>
+          <w:b/>
+          <w:bCs/>
+        </w:rPr>
+        <w:t xml:space="preserve">Директор завода.</w:t>
+      </w:r>
+      <w:r>
+        <w:t xml:space="preserve"> </w:t>
+      </w:r>
+      <w:r>
+        <w:t xml:space="preserve">Называем его или оставляем анонимно?</w:t>
+      </w:r>
+    </w:p>
+    <w:p>
+      <w:pPr>
+        <w:pStyle w:val="Compact"/>
+        <w:numPr>
+          <w:ilvl w:val="0"/>
+          <w:numId w:val="1033"/>
+        </w:numPr>
+      </w:pPr>
+      <w:r>
+        <w:rPr>
+          <w:b/>
+          <w:bCs/>
+        </w:rPr>
+        <w:t xml:space="preserve">Скрин бота.</w:t>
+      </w:r>
+      <w:r>
+        <w:t xml:space="preserve"> </w:t>
+      </w:r>
+      <w:r>
+        <w:t xml:space="preserve">В презентации видны ФИО и задачи сотрудника. Для публикации размыть или снять демо — кто сделает?</w:t>
+      </w:r>
+    </w:p>
+    <w:p>
+      <w:pPr>
+        <w:pStyle w:val="Compact"/>
+        <w:numPr>
+          <w:ilvl w:val="0"/>
+          <w:numId w:val="1033"/>
+        </w:numPr>
+      </w:pPr>
+      <w:r>
+        <w:rPr>
+          <w:b/>
+          <w:bCs/>
+        </w:rPr>
+        <w:t xml:space="preserve">Комплектовщик.</w:t>
+      </w:r>
+      <w:r>
+        <w:t xml:space="preserve"> </w:t>
+      </w:r>
+      <w:r>
+        <w:t xml:space="preserve">Это ваша история? Детали: где, когда, как поняли, что он рекрутер.</w:t>
+      </w:r>
+    </w:p>
+    <w:p>
+      <w:pPr>
+        <w:pStyle w:val="Compact"/>
+        <w:numPr>
+          <w:ilvl w:val="0"/>
+          <w:numId w:val="1033"/>
+        </w:numPr>
+      </w:pPr>
+      <w:r>
+        <w:rPr>
+          <w:b/>
+          <w:bCs/>
+        </w:rPr>
+        <w:t xml:space="preserve">Учитель (05.10).</w:t>
+      </w:r>
+      <w:r>
+        <w:t xml:space="preserve"> </w:t>
+      </w:r>
+      <w:r>
+        <w:t xml:space="preserve">Учитель или наставник, после которого вы иначе руководите — история голосом.</w:t>
+      </w:r>
+    </w:p>
+    <w:p>
+      <w:pPr>
+        <w:pStyle w:val="Compact"/>
+        <w:numPr>
+          <w:ilvl w:val="0"/>
+          <w:numId w:val="1033"/>
+        </w:numPr>
+      </w:pPr>
+      <w:r>
+        <w:rPr>
+          <w:b/>
+          <w:bCs/>
+        </w:rPr>
+        <w:t xml:space="preserve">Видео со стартап-завтрака.</w:t>
+      </w:r>
+      <w:r>
+        <w:t xml:space="preserve"> </w:t>
+      </w:r>
+      <w:r>
+        <w:t xml:space="preserve">Есть ли, где вы задаёте залу вопрос «кто может уехать на две недели без телефона»? Нужно для рилса 10.10.</w:t>
+      </w:r>
+    </w:p>
+    <w:bookmarkEnd w:id="78"/>
+    <w:bookmarkStart w:id="79" w:name="до-1219.10-кейсы"/>
+    <w:p>
+      <w:pPr>
+        <w:pStyle w:val="Heading2"/>
+      </w:pPr>
+      <w:r>
+        <w:t xml:space="preserve">🟢 До 12–19.10 (кейсы)</w:t>
+      </w:r>
+    </w:p>
+    <w:p>
+      <w:pPr>
+        <w:pStyle w:val="Compact"/>
+        <w:numPr>
+          <w:ilvl w:val="0"/>
+          <w:numId w:val="1034"/>
+        </w:numPr>
+      </w:pPr>
+      <w:r>
+        <w:rPr>
+          <w:b/>
+          <w:bCs/>
+        </w:rPr>
+        <w:t xml:space="preserve">Пассажиропоток для Горкоммунхоза.</w:t>
+      </w:r>
+      <w:r>
+        <w:t xml:space="preserve"> </w:t>
+      </w:r>
+      <w:r>
+        <w:t xml:space="preserve">Можно ли писать публично, есть ли цифры и картинки?</w:t>
+      </w:r>
+    </w:p>
+    <w:p>
+      <w:pPr>
+        <w:pStyle w:val="Compact"/>
+        <w:numPr>
+          <w:ilvl w:val="0"/>
+          <w:numId w:val="1034"/>
+        </w:numPr>
+      </w:pPr>
+      <w:r>
+        <w:rPr>
+          <w:b/>
+          <w:bCs/>
+        </w:rPr>
+        <w:t xml:space="preserve">Помощник селлера WB.</w:t>
+      </w:r>
+      <w:r>
+        <w:t xml:space="preserve"> </w:t>
+      </w:r>
+      <w:r>
+        <w:t xml:space="preserve">Скрины, отзыв владельца магазина одежды, цифры (сколько времени экономит). Можно ли назвать магазин?</w:t>
+      </w:r>
+    </w:p>
+    <w:p>
+      <w:pPr>
+        <w:pStyle w:val="Compact"/>
+        <w:numPr>
+          <w:ilvl w:val="0"/>
+          <w:numId w:val="1034"/>
+        </w:numPr>
+      </w:pPr>
+      <w:r>
+        <w:rPr>
+          <w:b/>
+          <w:bCs/>
+        </w:rPr>
+        <w:t xml:space="preserve">Помощник «Что ответить клиенту?».</w:t>
+      </w:r>
+      <w:r>
+        <w:t xml:space="preserve"> </w:t>
+      </w:r>
+      <w:r>
+        <w:t xml:space="preserve">Та же информация по консалтинговой практике.</w:t>
+      </w:r>
+    </w:p>
+    <w:p>
+      <w:pPr>
+        <w:pStyle w:val="Compact"/>
+        <w:numPr>
+          <w:ilvl w:val="0"/>
+          <w:numId w:val="1034"/>
+        </w:numPr>
+      </w:pPr>
+      <w:r>
+        <w:rPr>
+          <w:b/>
+          <w:bCs/>
+        </w:rPr>
+        <w:t xml:space="preserve">Андрей Хворов и НейроStart.</w:t>
+      </w:r>
+      <w:r>
+        <w:t xml:space="preserve"> </w:t>
+      </w:r>
+      <w:r>
+        <w:t xml:space="preserve">Согласен ли он, чтобы о нём писали? Есть ли фото?</w:t>
+      </w:r>
+    </w:p>
+    <w:bookmarkEnd w:id="79"/>
+    <w:bookmarkStart w:id="80" w:name="Xf95adb128c5c4f3be25e35d8f75db692f9d6263"/>
+    <w:p>
+      <w:pPr>
+        <w:pStyle w:val="Heading2"/>
+      </w:pPr>
+      <w:r>
+        <w:t xml:space="preserve">🟢 До 23.10 (предложение) — важно решить заранее</w:t>
+      </w:r>
+    </w:p>
+    <w:p>
+      <w:pPr>
+        <w:pStyle w:val="Compact"/>
+        <w:numPr>
+          <w:ilvl w:val="0"/>
+          <w:numId w:val="1035"/>
+        </w:numPr>
+      </w:pPr>
+      <w:r>
+        <w:rPr>
+          <w:b/>
+          <w:bCs/>
+        </w:rPr>
+        <w:t xml:space="preserve">Цена экспресс-разбора</w:t>
+      </w:r>
+      <w:r>
+        <w:t xml:space="preserve"> </w:t>
+      </w:r>
+      <w:r>
+        <w:t xml:space="preserve">(или «от N ₽») и цена стратегической сессии.</w:t>
+      </w:r>
+    </w:p>
+    <w:p>
+      <w:pPr>
+        <w:pStyle w:val="Compact"/>
+        <w:numPr>
+          <w:ilvl w:val="0"/>
+          <w:numId w:val="1035"/>
+        </w:numPr>
+      </w:pPr>
+      <w:r>
+        <w:rPr>
+          <w:b/>
+          <w:bCs/>
+        </w:rPr>
+        <w:t xml:space="preserve">Сколько мест на разборы</w:t>
+      </w:r>
+      <w:r>
+        <w:t xml:space="preserve"> </w:t>
+      </w:r>
+      <w:r>
+        <w:t xml:space="preserve">в конце октября — ноябре.</w:t>
+      </w:r>
+    </w:p>
+    <w:p>
+      <w:pPr>
+        <w:pStyle w:val="Compact"/>
+        <w:numPr>
+          <w:ilvl w:val="0"/>
+          <w:numId w:val="1035"/>
+        </w:numPr>
+      </w:pPr>
+      <w:r>
+        <w:rPr>
+          <w:b/>
+          <w:bCs/>
+        </w:rPr>
+        <w:t xml:space="preserve">Бот задач как продукт.</w:t>
+      </w:r>
+      <w:r>
+        <w:t xml:space="preserve"> </w:t>
+      </w:r>
+      <w:r>
+        <w:t xml:space="preserve">Продаём отдельно (цена?) или это бонус к сессии?</w:t>
+      </w:r>
+    </w:p>
+    <w:p>
+      <w:pPr>
+        <w:pStyle w:val="Compact"/>
+        <w:numPr>
+          <w:ilvl w:val="0"/>
+          <w:numId w:val="1035"/>
+        </w:numPr>
+      </w:pPr>
+      <w:r>
+        <w:rPr>
+          <w:b/>
+          <w:bCs/>
+        </w:rPr>
+        <w:t xml:space="preserve">ИИ-агент для fashion и маркетплейсов</w:t>
+      </w:r>
+      <w:r>
+        <w:t xml:space="preserve"> </w:t>
+      </w:r>
+      <w:r>
+        <w:t xml:space="preserve">— чей продукт? Продвигаем его в этом блоге или нет?</w:t>
+      </w:r>
+    </w:p>
+    <w:p>
+      <w:pPr>
+        <w:pStyle w:val="Compact"/>
+        <w:numPr>
+          <w:ilvl w:val="0"/>
+          <w:numId w:val="1035"/>
+        </w:numPr>
+      </w:pPr>
+      <w:r>
+        <w:rPr>
+          <w:b/>
+          <w:bCs/>
+        </w:rPr>
+        <w:t xml:space="preserve">ИИ-помощник вместе с Еленой Багановой.</w:t>
+      </w:r>
+      <w:r>
+        <w:t xml:space="preserve"> </w:t>
+      </w:r>
+      <w:r>
+        <w:t xml:space="preserve">Как упоминаем Елену в постах? Какой Telegram для слова «ПОМОЩНИК» (в оффере стоит</w:t>
+      </w:r>
+      <w:r>
+        <w:t xml:space="preserve"> </w:t>
+      </w:r>
+      <w:r>
+        <w:t xml:space="preserve">@________</w:t>
+      </w:r>
+      <w:r>
+        <w:t xml:space="preserve">)?</w:t>
+      </w:r>
+    </w:p>
+    <w:p>
+      <w:pPr>
+        <w:pStyle w:val="Compact"/>
+        <w:numPr>
+          <w:ilvl w:val="0"/>
+          <w:numId w:val="1035"/>
+        </w:numPr>
+      </w:pPr>
+      <w:r>
+        <w:rPr>
+          <w:b/>
+          <w:bCs/>
+        </w:rPr>
+        <w:t xml:space="preserve">Лид-магнит 22.10.</w:t>
+      </w:r>
+      <w:r>
+        <w:t xml:space="preserve"> </w:t>
+      </w:r>
+      <w:r>
+        <w:t xml:space="preserve">Делаем чек-лист «5 правил бизнеса без ручного управления» из слайдов презентации? Я могу собрать PDF.</w:t>
+      </w:r>
+    </w:p>
+    <w:bookmarkEnd w:id="80"/>
+    <w:bookmarkStart w:id="81" w:name="сайт-вариант-алины-v3"/>
+    <w:p>
+      <w:pPr>
+        <w:pStyle w:val="Heading2"/>
+      </w:pPr>
+      <w:r>
+        <w:t xml:space="preserve">🔵 Сайт (вариант Алины v3)</w:t>
+      </w:r>
+    </w:p>
+    <w:p>
+      <w:pPr>
+        <w:pStyle w:val="Compact"/>
+        <w:numPr>
+          <w:ilvl w:val="0"/>
+          <w:numId w:val="1036"/>
+        </w:numPr>
+      </w:pPr>
+      <w:r>
+        <w:rPr>
+          <w:b/>
+          <w:bCs/>
+        </w:rPr>
+        <w:t xml:space="preserve">«Минус 20 часов в неделю».</w:t>
+      </w:r>
+      <w:r>
+        <w:t xml:space="preserve"> </w:t>
+      </w:r>
+      <w:r>
+        <w:t xml:space="preserve">Оставляем с оговоркой «до» или заменяем на «у меня управление ~10 часов в неделю»?</w:t>
+      </w:r>
+    </w:p>
+    <w:p>
+      <w:pPr>
+        <w:pStyle w:val="Compact"/>
+        <w:numPr>
+          <w:ilvl w:val="0"/>
+          <w:numId w:val="1036"/>
+        </w:numPr>
+      </w:pPr>
+      <w:r>
+        <w:rPr>
+          <w:b/>
+          <w:bCs/>
+        </w:rPr>
+        <w:t xml:space="preserve">Стаж.</w:t>
+      </w:r>
+      <w:r>
+        <w:t xml:space="preserve"> </w:t>
+      </w:r>
+      <w:r>
+        <w:t xml:space="preserve">Меняем «10+ лет» на «13 лет в управлении» везде?</w:t>
+      </w:r>
+    </w:p>
+    <w:p>
+      <w:pPr>
+        <w:pStyle w:val="Compact"/>
+        <w:numPr>
+          <w:ilvl w:val="0"/>
+          <w:numId w:val="1036"/>
+        </w:numPr>
+      </w:pPr>
+      <w:r>
+        <w:rPr>
+          <w:b/>
+          <w:bCs/>
+        </w:rPr>
+        <w:t xml:space="preserve">Ссылка на блог.</w:t>
+      </w:r>
+      <w:r>
+        <w:t xml:space="preserve"> </w:t>
+      </w:r>
+      <w:r>
+        <w:t xml:space="preserve">Добавляем на сайт ссылку на TG-канал?</w:t>
+      </w:r>
+    </w:p>
+    <w:p>
+      <w:pPr>
+        <w:pStyle w:val="Compact"/>
+        <w:numPr>
+          <w:ilvl w:val="0"/>
+          <w:numId w:val="1036"/>
+        </w:numPr>
+      </w:pPr>
+      <w:r>
+        <w:rPr>
+          <w:b/>
+          <w:bCs/>
+        </w:rPr>
+        <w:t xml:space="preserve">ИИ-помощник.</w:t>
+      </w:r>
+      <w:r>
+        <w:t xml:space="preserve"> </w:t>
+      </w:r>
+      <w:r>
+        <w:t xml:space="preserve">Делаем для него отдельную страницу (например, /pomoshnik)?</w:t>
+      </w:r>
+    </w:p>
+    <w:p>
+      <w:pPr>
+        <w:pStyle w:val="Compact"/>
+        <w:numPr>
+          <w:ilvl w:val="0"/>
+          <w:numId w:val="1036"/>
+        </w:numPr>
+      </w:pPr>
+      <w:r>
+        <w:rPr>
+          <w:b/>
+          <w:bCs/>
+        </w:rPr>
+        <w:t xml:space="preserve">Кто вносит правки на сайт</w:t>
+      </w:r>
+      <w:r>
+        <w:t xml:space="preserve"> </w:t>
+      </w:r>
+      <w:r>
+        <w:t xml:space="preserve">— Алина или я через репозиторий сайта?</w:t>
+      </w:r>
+    </w:p>
+    <w:bookmarkEnd w:id="81"/>
+    <w:bookmarkStart w:id="82" w:name="общее"/>
+    <w:p>
+      <w:pPr>
+        <w:pStyle w:val="Heading2"/>
+      </w:pPr>
+      <w:r>
+        <w:t xml:space="preserve">⚪ Общее</w:t>
+      </w:r>
+    </w:p>
+    <w:p>
+      <w:pPr>
+        <w:numPr>
+          <w:ilvl w:val="0"/>
+          <w:numId w:val="1037"/>
+        </w:numPr>
+      </w:pPr>
+      <w:r>
+        <w:rPr>
+          <w:b/>
+          <w:bCs/>
+        </w:rPr>
+        <w:t xml:space="preserve">События октября.</w:t>
+      </w:r>
+      <w:r>
+        <w:t xml:space="preserve"> </w:t>
+      </w:r>
+      <w:r>
+        <w:t xml:space="preserve">Выступления, эфиры, мероприятия ИТ-парка — вставлю в календарь как свежие поводы.</w:t>
+      </w:r>
+    </w:p>
+    <w:p>
+      <w:pPr>
+        <w:numPr>
+          <w:ilvl w:val="0"/>
+          <w:numId w:val="1037"/>
+        </w:numPr>
+      </w:pPr>
+      <w:r>
+        <w:rPr>
+          <w:b/>
+          <w:bCs/>
+        </w:rPr>
+        <w:t xml:space="preserve">Ограничения по работе.</w:t>
+      </w:r>
+      <w:r>
+        <w:t xml:space="preserve"> </w:t>
+      </w:r>
+      <w:r>
+        <w:t xml:space="preserve">Нет ли ограничений на платные консультации для руководителя площадки госучреждения? Платные продукты лучше держать под личным брендом, отдельно от ИТ-парка.</w:t>
+      </w:r>
+    </w:p>
+    <w:p>
+      <w:pPr>
+        <w:numPr>
+          <w:ilvl w:val="0"/>
+          <w:numId w:val="1037"/>
+        </w:numPr>
+      </w:pPr>
+      <w:r>
+        <w:rPr>
+          <w:b/>
+          <w:bCs/>
+        </w:rPr>
+        <w:t xml:space="preserve">Безопасность.</w:t>
+      </w:r>
+      <w:r>
+        <w:t xml:space="preserve"> </w:t>
+      </w:r>
+      <w:r>
+        <w:t xml:space="preserve">В файле .env.example репозитория лежит ключ ChatPlace, похожий на настоящий. Если репозиторий публичный — перевыпустить ключ.</w:t>
+      </w:r>
+    </w:p>
+    <w:p>
+      <w:pPr>
+        <w:numPr>
+          <w:ilvl w:val="0"/>
+          <w:numId w:val="1037"/>
+        </w:numPr>
+      </w:pPr>
+      <w:r>
+        <w:rPr>
+          <w:b/>
+          <w:bCs/>
+        </w:rPr>
+        <w:t xml:space="preserve">Автоматизация.</w:t>
+      </w:r>
+      <w:r>
+        <w:t xml:space="preserve"> </w:t>
+      </w:r>
+      <w:r>
+        <w:t xml:space="preserve">С чего начинаем: автодубль TG → ВК и MAX, отложенный постинг или генерация обложек через Gemini?</w:t>
+      </w:r>
+    </w:p>
+    <w:p>
+      <w:pPr>
+        <w:numPr>
+          <w:ilvl w:val="0"/>
+          <w:numId w:val="1037"/>
+        </w:numPr>
+      </w:pPr>
+      <w:r>
+        <w:t xml:space="preserve">✅ ВК: постим на личную страницу vk.ru/a.sagdeev.</w:t>
+      </w:r>
+    </w:p>
+    <w:bookmarkEnd w:id="82"/>
+    <w:bookmarkEnd w:id="83"/>
     <w:sectPr>
       <w:footnotePr>
         <w:numRestart w:val="eachSect"/>
@@ -10263,6 +12230,601 @@
     </w:lvl>
     <w:lvl w:ilvl="8">
       <w:start w:val="1"/>
+      <w:numFmt w:val="decimal"/>
+      <w:lvlText w:val="%9."/>
+      <w:lvlJc w:val="left"/>
+      <w:pPr>
+        <w:ind w:left="6480" w:hanging="360"/>
+      </w:pPr>
+    </w:lvl>
+  </w:abstractNum>
+  <w:abstractNum w:abstractNumId="99415">
+    <w:nsid w:val="00A99415"/>
+    <w:multiLevelType w:val="multilevel"/>
+    <w:lvl w:ilvl="0">
+      <w:start w:val="5"/>
+      <w:numFmt w:val="decimal"/>
+      <w:lvlText w:val="%1."/>
+      <w:lvlJc w:val="left"/>
+      <w:pPr>
+        <w:ind w:left="720" w:hanging="360"/>
+      </w:pPr>
+    </w:lvl>
+    <w:lvl w:ilvl="1">
+      <w:start w:val="5"/>
+      <w:numFmt w:val="decimal"/>
+      <w:lvlText w:val="%2."/>
+      <w:lvlJc w:val="left"/>
+      <w:pPr>
+        <w:ind w:left="1440" w:hanging="360"/>
+      </w:pPr>
+    </w:lvl>
+    <w:lvl w:ilvl="2">
+      <w:start w:val="5"/>
+      <w:numFmt w:val="decimal"/>
+      <w:lvlText w:val="%3."/>
+      <w:lvlJc w:val="left"/>
+      <w:pPr>
+        <w:ind w:left="2160" w:hanging="360"/>
+      </w:pPr>
+    </w:lvl>
+    <w:lvl w:ilvl="3">
+      <w:start w:val="5"/>
+      <w:numFmt w:val="decimal"/>
+      <w:lvlText w:val="%4."/>
+      <w:lvlJc w:val="left"/>
+      <w:pPr>
+        <w:ind w:left="2880" w:hanging="360"/>
+      </w:pPr>
+    </w:lvl>
+    <w:lvl w:ilvl="4">
+      <w:start w:val="5"/>
+      <w:numFmt w:val="decimal"/>
+      <w:lvlText w:val="%5."/>
+      <w:lvlJc w:val="left"/>
+      <w:pPr>
+        <w:ind w:left="3600" w:hanging="360"/>
+      </w:pPr>
+    </w:lvl>
+    <w:lvl w:ilvl="5">
+      <w:start w:val="5"/>
+      <w:numFmt w:val="decimal"/>
+      <w:lvlText w:val="%6."/>
+      <w:lvlJc w:val="left"/>
+      <w:pPr>
+        <w:ind w:left="4320" w:hanging="360"/>
+      </w:pPr>
+    </w:lvl>
+    <w:lvl w:ilvl="6">
+      <w:start w:val="5"/>
+      <w:numFmt w:val="decimal"/>
+      <w:lvlText w:val="%7."/>
+      <w:lvlJc w:val="left"/>
+      <w:pPr>
+        <w:ind w:left="5040" w:hanging="360"/>
+      </w:pPr>
+    </w:lvl>
+    <w:lvl w:ilvl="7">
+      <w:start w:val="5"/>
+      <w:numFmt w:val="decimal"/>
+      <w:lvlText w:val="%8."/>
+      <w:lvlJc w:val="left"/>
+      <w:pPr>
+        <w:ind w:left="5760" w:hanging="360"/>
+      </w:pPr>
+    </w:lvl>
+    <w:lvl w:ilvl="8">
+      <w:start w:val="5"/>
+      <w:numFmt w:val="decimal"/>
+      <w:lvlText w:val="%9."/>
+      <w:lvlJc w:val="left"/>
+      <w:pPr>
+        <w:ind w:left="6480" w:hanging="360"/>
+      </w:pPr>
+    </w:lvl>
+  </w:abstractNum>
+  <w:abstractNum w:abstractNumId="99417">
+    <w:nsid w:val="00A99417"/>
+    <w:multiLevelType w:val="multilevel"/>
+    <w:lvl w:ilvl="0">
+      <w:start w:val="7"/>
+      <w:numFmt w:val="decimal"/>
+      <w:lvlText w:val="%1."/>
+      <w:lvlJc w:val="left"/>
+      <w:pPr>
+        <w:ind w:left="720" w:hanging="360"/>
+      </w:pPr>
+    </w:lvl>
+    <w:lvl w:ilvl="1">
+      <w:start w:val="7"/>
+      <w:numFmt w:val="decimal"/>
+      <w:lvlText w:val="%2."/>
+      <w:lvlJc w:val="left"/>
+      <w:pPr>
+        <w:ind w:left="1440" w:hanging="360"/>
+      </w:pPr>
+    </w:lvl>
+    <w:lvl w:ilvl="2">
+      <w:start w:val="7"/>
+      <w:numFmt w:val="decimal"/>
+      <w:lvlText w:val="%3."/>
+      <w:lvlJc w:val="left"/>
+      <w:pPr>
+        <w:ind w:left="2160" w:hanging="360"/>
+      </w:pPr>
+    </w:lvl>
+    <w:lvl w:ilvl="3">
+      <w:start w:val="7"/>
+      <w:numFmt w:val="decimal"/>
+      <w:lvlText w:val="%4."/>
+      <w:lvlJc w:val="left"/>
+      <w:pPr>
+        <w:ind w:left="2880" w:hanging="360"/>
+      </w:pPr>
+    </w:lvl>
+    <w:lvl w:ilvl="4">
+      <w:start w:val="7"/>
+      <w:numFmt w:val="decimal"/>
+      <w:lvlText w:val="%5."/>
+      <w:lvlJc w:val="left"/>
+      <w:pPr>
+        <w:ind w:left="3600" w:hanging="360"/>
+      </w:pPr>
+    </w:lvl>
+    <w:lvl w:ilvl="5">
+      <w:start w:val="7"/>
+      <w:numFmt w:val="decimal"/>
+      <w:lvlText w:val="%6."/>
+      <w:lvlJc w:val="left"/>
+      <w:pPr>
+        <w:ind w:left="4320" w:hanging="360"/>
+      </w:pPr>
+    </w:lvl>
+    <w:lvl w:ilvl="6">
+      <w:start w:val="7"/>
+      <w:numFmt w:val="decimal"/>
+      <w:lvlText w:val="%7."/>
+      <w:lvlJc w:val="left"/>
+      <w:pPr>
+        <w:ind w:left="5040" w:hanging="360"/>
+      </w:pPr>
+    </w:lvl>
+    <w:lvl w:ilvl="7">
+      <w:start w:val="7"/>
+      <w:numFmt w:val="decimal"/>
+      <w:lvlText w:val="%8."/>
+      <w:lvlJc w:val="left"/>
+      <w:pPr>
+        <w:ind w:left="5760" w:hanging="360"/>
+      </w:pPr>
+    </w:lvl>
+    <w:lvl w:ilvl="8">
+      <w:start w:val="7"/>
+      <w:numFmt w:val="decimal"/>
+      <w:lvlText w:val="%9."/>
+      <w:lvlJc w:val="left"/>
+      <w:pPr>
+        <w:ind w:left="6480" w:hanging="360"/>
+      </w:pPr>
+    </w:lvl>
+  </w:abstractNum>
+  <w:abstractNum w:abstractNumId="994110">
+    <w:nsid w:val="0A994110"/>
+    <w:multiLevelType w:val="multilevel"/>
+    <w:lvl w:ilvl="0">
+      <w:start w:val="10"/>
+      <w:numFmt w:val="decimal"/>
+      <w:lvlText w:val="%1."/>
+      <w:lvlJc w:val="left"/>
+      <w:pPr>
+        <w:ind w:left="720" w:hanging="360"/>
+      </w:pPr>
+    </w:lvl>
+    <w:lvl w:ilvl="1">
+      <w:start w:val="10"/>
+      <w:numFmt w:val="decimal"/>
+      <w:lvlText w:val="%2."/>
+      <w:lvlJc w:val="left"/>
+      <w:pPr>
+        <w:ind w:left="1440" w:hanging="360"/>
+      </w:pPr>
+    </w:lvl>
+    <w:lvl w:ilvl="2">
+      <w:start w:val="10"/>
+      <w:numFmt w:val="decimal"/>
+      <w:lvlText w:val="%3."/>
+      <w:lvlJc w:val="left"/>
+      <w:pPr>
+        <w:ind w:left="2160" w:hanging="360"/>
+      </w:pPr>
+    </w:lvl>
+    <w:lvl w:ilvl="3">
+      <w:start w:val="10"/>
+      <w:numFmt w:val="decimal"/>
+      <w:lvlText w:val="%4."/>
+      <w:lvlJc w:val="left"/>
+      <w:pPr>
+        <w:ind w:left="2880" w:hanging="360"/>
+      </w:pPr>
+    </w:lvl>
+    <w:lvl w:ilvl="4">
+      <w:start w:val="10"/>
+      <w:numFmt w:val="decimal"/>
+      <w:lvlText w:val="%5."/>
+      <w:lvlJc w:val="left"/>
+      <w:pPr>
+        <w:ind w:left="3600" w:hanging="360"/>
+      </w:pPr>
+    </w:lvl>
+    <w:lvl w:ilvl="5">
+      <w:start w:val="10"/>
+      <w:numFmt w:val="decimal"/>
+      <w:lvlText w:val="%6."/>
+      <w:lvlJc w:val="left"/>
+      <w:pPr>
+        <w:ind w:left="4320" w:hanging="360"/>
+      </w:pPr>
+    </w:lvl>
+    <w:lvl w:ilvl="6">
+      <w:start w:val="10"/>
+      <w:numFmt w:val="decimal"/>
+      <w:lvlText w:val="%7."/>
+      <w:lvlJc w:val="left"/>
+      <w:pPr>
+        <w:ind w:left="5040" w:hanging="360"/>
+      </w:pPr>
+    </w:lvl>
+    <w:lvl w:ilvl="7">
+      <w:start w:val="10"/>
+      <w:numFmt w:val="decimal"/>
+      <w:lvlText w:val="%8."/>
+      <w:lvlJc w:val="left"/>
+      <w:pPr>
+        <w:ind w:left="5760" w:hanging="360"/>
+      </w:pPr>
+    </w:lvl>
+    <w:lvl w:ilvl="8">
+      <w:start w:val="10"/>
+      <w:numFmt w:val="decimal"/>
+      <w:lvlText w:val="%9."/>
+      <w:lvlJc w:val="left"/>
+      <w:pPr>
+        <w:ind w:left="6480" w:hanging="360"/>
+      </w:pPr>
+    </w:lvl>
+  </w:abstractNum>
+  <w:abstractNum w:abstractNumId="994116">
+    <w:nsid w:val="0A994116"/>
+    <w:multiLevelType w:val="multilevel"/>
+    <w:lvl w:ilvl="0">
+      <w:start w:val="16"/>
+      <w:numFmt w:val="decimal"/>
+      <w:lvlText w:val="%1."/>
+      <w:lvlJc w:val="left"/>
+      <w:pPr>
+        <w:ind w:left="720" w:hanging="360"/>
+      </w:pPr>
+    </w:lvl>
+    <w:lvl w:ilvl="1">
+      <w:start w:val="16"/>
+      <w:numFmt w:val="decimal"/>
+      <w:lvlText w:val="%2."/>
+      <w:lvlJc w:val="left"/>
+      <w:pPr>
+        <w:ind w:left="1440" w:hanging="360"/>
+      </w:pPr>
+    </w:lvl>
+    <w:lvl w:ilvl="2">
+      <w:start w:val="16"/>
+      <w:numFmt w:val="decimal"/>
+      <w:lvlText w:val="%3."/>
+      <w:lvlJc w:val="left"/>
+      <w:pPr>
+        <w:ind w:left="2160" w:hanging="360"/>
+      </w:pPr>
+    </w:lvl>
+    <w:lvl w:ilvl="3">
+      <w:start w:val="16"/>
+      <w:numFmt w:val="decimal"/>
+      <w:lvlText w:val="%4."/>
+      <w:lvlJc w:val="left"/>
+      <w:pPr>
+        <w:ind w:left="2880" w:hanging="360"/>
+      </w:pPr>
+    </w:lvl>
+    <w:lvl w:ilvl="4">
+      <w:start w:val="16"/>
+      <w:numFmt w:val="decimal"/>
+      <w:lvlText w:val="%5."/>
+      <w:lvlJc w:val="left"/>
+      <w:pPr>
+        <w:ind w:left="3600" w:hanging="360"/>
+      </w:pPr>
+    </w:lvl>
+    <w:lvl w:ilvl="5">
+      <w:start w:val="16"/>
+      <w:numFmt w:val="decimal"/>
+      <w:lvlText w:val="%6."/>
+      <w:lvlJc w:val="left"/>
+      <w:pPr>
+        <w:ind w:left="4320" w:hanging="360"/>
+      </w:pPr>
+    </w:lvl>
+    <w:lvl w:ilvl="6">
+      <w:start w:val="16"/>
+      <w:numFmt w:val="decimal"/>
+      <w:lvlText w:val="%7."/>
+      <w:lvlJc w:val="left"/>
+      <w:pPr>
+        <w:ind w:left="5040" w:hanging="360"/>
+      </w:pPr>
+    </w:lvl>
+    <w:lvl w:ilvl="7">
+      <w:start w:val="16"/>
+      <w:numFmt w:val="decimal"/>
+      <w:lvlText w:val="%8."/>
+      <w:lvlJc w:val="left"/>
+      <w:pPr>
+        <w:ind w:left="5760" w:hanging="360"/>
+      </w:pPr>
+    </w:lvl>
+    <w:lvl w:ilvl="8">
+      <w:start w:val="16"/>
+      <w:numFmt w:val="decimal"/>
+      <w:lvlText w:val="%9."/>
+      <w:lvlJc w:val="left"/>
+      <w:pPr>
+        <w:ind w:left="6480" w:hanging="360"/>
+      </w:pPr>
+    </w:lvl>
+  </w:abstractNum>
+  <w:abstractNum w:abstractNumId="994120">
+    <w:nsid w:val="0A994120"/>
+    <w:multiLevelType w:val="multilevel"/>
+    <w:lvl w:ilvl="0">
+      <w:start w:val="20"/>
+      <w:numFmt w:val="decimal"/>
+      <w:lvlText w:val="%1."/>
+      <w:lvlJc w:val="left"/>
+      <w:pPr>
+        <w:ind w:left="720" w:hanging="360"/>
+      </w:pPr>
+    </w:lvl>
+    <w:lvl w:ilvl="1">
+      <w:start w:val="20"/>
+      <w:numFmt w:val="decimal"/>
+      <w:lvlText w:val="%2."/>
+      <w:lvlJc w:val="left"/>
+      <w:pPr>
+        <w:ind w:left="1440" w:hanging="360"/>
+      </w:pPr>
+    </w:lvl>
+    <w:lvl w:ilvl="2">
+      <w:start w:val="20"/>
+      <w:numFmt w:val="decimal"/>
+      <w:lvlText w:val="%3."/>
+      <w:lvlJc w:val="left"/>
+      <w:pPr>
+        <w:ind w:left="2160" w:hanging="360"/>
+      </w:pPr>
+    </w:lvl>
+    <w:lvl w:ilvl="3">
+      <w:start w:val="20"/>
+      <w:numFmt w:val="decimal"/>
+      <w:lvlText w:val="%4."/>
+      <w:lvlJc w:val="left"/>
+      <w:pPr>
+        <w:ind w:left="2880" w:hanging="360"/>
+      </w:pPr>
+    </w:lvl>
+    <w:lvl w:ilvl="4">
+      <w:start w:val="20"/>
+      <w:numFmt w:val="decimal"/>
+      <w:lvlText w:val="%5."/>
+      <w:lvlJc w:val="left"/>
+      <w:pPr>
+        <w:ind w:left="3600" w:hanging="360"/>
+      </w:pPr>
+    </w:lvl>
+    <w:lvl w:ilvl="5">
+      <w:start w:val="20"/>
+      <w:numFmt w:val="decimal"/>
+      <w:lvlText w:val="%6."/>
+      <w:lvlJc w:val="left"/>
+      <w:pPr>
+        <w:ind w:left="4320" w:hanging="360"/>
+      </w:pPr>
+    </w:lvl>
+    <w:lvl w:ilvl="6">
+      <w:start w:val="20"/>
+      <w:numFmt w:val="decimal"/>
+      <w:lvlText w:val="%7."/>
+      <w:lvlJc w:val="left"/>
+      <w:pPr>
+        <w:ind w:left="5040" w:hanging="360"/>
+      </w:pPr>
+    </w:lvl>
+    <w:lvl w:ilvl="7">
+      <w:start w:val="20"/>
+      <w:numFmt w:val="decimal"/>
+      <w:lvlText w:val="%8."/>
+      <w:lvlJc w:val="left"/>
+      <w:pPr>
+        <w:ind w:left="5760" w:hanging="360"/>
+      </w:pPr>
+    </w:lvl>
+    <w:lvl w:ilvl="8">
+      <w:start w:val="20"/>
+      <w:numFmt w:val="decimal"/>
+      <w:lvlText w:val="%9."/>
+      <w:lvlJc w:val="left"/>
+      <w:pPr>
+        <w:ind w:left="6480" w:hanging="360"/>
+      </w:pPr>
+    </w:lvl>
+  </w:abstractNum>
+  <w:abstractNum w:abstractNumId="994126">
+    <w:nsid w:val="0A994126"/>
+    <w:multiLevelType w:val="multilevel"/>
+    <w:lvl w:ilvl="0">
+      <w:start w:val="26"/>
+      <w:numFmt w:val="decimal"/>
+      <w:lvlText w:val="%1."/>
+      <w:lvlJc w:val="left"/>
+      <w:pPr>
+        <w:ind w:left="720" w:hanging="360"/>
+      </w:pPr>
+    </w:lvl>
+    <w:lvl w:ilvl="1">
+      <w:start w:val="26"/>
+      <w:numFmt w:val="decimal"/>
+      <w:lvlText w:val="%2."/>
+      <w:lvlJc w:val="left"/>
+      <w:pPr>
+        <w:ind w:left="1440" w:hanging="360"/>
+      </w:pPr>
+    </w:lvl>
+    <w:lvl w:ilvl="2">
+      <w:start w:val="26"/>
+      <w:numFmt w:val="decimal"/>
+      <w:lvlText w:val="%3."/>
+      <w:lvlJc w:val="left"/>
+      <w:pPr>
+        <w:ind w:left="2160" w:hanging="360"/>
+      </w:pPr>
+    </w:lvl>
+    <w:lvl w:ilvl="3">
+      <w:start w:val="26"/>
+      <w:numFmt w:val="decimal"/>
+      <w:lvlText w:val="%4."/>
+      <w:lvlJc w:val="left"/>
+      <w:pPr>
+        <w:ind w:left="2880" w:hanging="360"/>
+      </w:pPr>
+    </w:lvl>
+    <w:lvl w:ilvl="4">
+      <w:start w:val="26"/>
+      <w:numFmt w:val="decimal"/>
+      <w:lvlText w:val="%5."/>
+      <w:lvlJc w:val="left"/>
+      <w:pPr>
+        <w:ind w:left="3600" w:hanging="360"/>
+      </w:pPr>
+    </w:lvl>
+    <w:lvl w:ilvl="5">
+      <w:start w:val="26"/>
+      <w:numFmt w:val="decimal"/>
+      <w:lvlText w:val="%6."/>
+      <w:lvlJc w:val="left"/>
+      <w:pPr>
+        <w:ind w:left="4320" w:hanging="360"/>
+      </w:pPr>
+    </w:lvl>
+    <w:lvl w:ilvl="6">
+      <w:start w:val="26"/>
+      <w:numFmt w:val="decimal"/>
+      <w:lvlText w:val="%7."/>
+      <w:lvlJc w:val="left"/>
+      <w:pPr>
+        <w:ind w:left="5040" w:hanging="360"/>
+      </w:pPr>
+    </w:lvl>
+    <w:lvl w:ilvl="7">
+      <w:start w:val="26"/>
+      <w:numFmt w:val="decimal"/>
+      <w:lvlText w:val="%8."/>
+      <w:lvlJc w:val="left"/>
+      <w:pPr>
+        <w:ind w:left="5760" w:hanging="360"/>
+      </w:pPr>
+    </w:lvl>
+    <w:lvl w:ilvl="8">
+      <w:start w:val="26"/>
+      <w:numFmt w:val="decimal"/>
+      <w:lvlText w:val="%9."/>
+      <w:lvlJc w:val="left"/>
+      <w:pPr>
+        <w:ind w:left="6480" w:hanging="360"/>
+      </w:pPr>
+    </w:lvl>
+  </w:abstractNum>
+  <w:abstractNum w:abstractNumId="994131">
+    <w:nsid w:val="0A994131"/>
+    <w:multiLevelType w:val="multilevel"/>
+    <w:lvl w:ilvl="0">
+      <w:start w:val="31"/>
+      <w:numFmt w:val="decimal"/>
+      <w:lvlText w:val="%1."/>
+      <w:lvlJc w:val="left"/>
+      <w:pPr>
+        <w:ind w:left="720" w:hanging="360"/>
+      </w:pPr>
+    </w:lvl>
+    <w:lvl w:ilvl="1">
+      <w:start w:val="31"/>
+      <w:numFmt w:val="decimal"/>
+      <w:lvlText w:val="%2."/>
+      <w:lvlJc w:val="left"/>
+      <w:pPr>
+        <w:ind w:left="1440" w:hanging="360"/>
+      </w:pPr>
+    </w:lvl>
+    <w:lvl w:ilvl="2">
+      <w:start w:val="31"/>
+      <w:numFmt w:val="decimal"/>
+      <w:lvlText w:val="%3."/>
+      <w:lvlJc w:val="left"/>
+      <w:pPr>
+        <w:ind w:left="2160" w:hanging="360"/>
+      </w:pPr>
+    </w:lvl>
+    <w:lvl w:ilvl="3">
+      <w:start w:val="31"/>
+      <w:numFmt w:val="decimal"/>
+      <w:lvlText w:val="%4."/>
+      <w:lvlJc w:val="left"/>
+      <w:pPr>
+        <w:ind w:left="2880" w:hanging="360"/>
+      </w:pPr>
+    </w:lvl>
+    <w:lvl w:ilvl="4">
+      <w:start w:val="31"/>
+      <w:numFmt w:val="decimal"/>
+      <w:lvlText w:val="%5."/>
+      <w:lvlJc w:val="left"/>
+      <w:pPr>
+        <w:ind w:left="3600" w:hanging="360"/>
+      </w:pPr>
+    </w:lvl>
+    <w:lvl w:ilvl="5">
+      <w:start w:val="31"/>
+      <w:numFmt w:val="decimal"/>
+      <w:lvlText w:val="%6."/>
+      <w:lvlJc w:val="left"/>
+      <w:pPr>
+        <w:ind w:left="4320" w:hanging="360"/>
+      </w:pPr>
+    </w:lvl>
+    <w:lvl w:ilvl="6">
+      <w:start w:val="31"/>
+      <w:numFmt w:val="decimal"/>
+      <w:lvlText w:val="%7."/>
+      <w:lvlJc w:val="left"/>
+      <w:pPr>
+        <w:ind w:left="5040" w:hanging="360"/>
+      </w:pPr>
+    </w:lvl>
+    <w:lvl w:ilvl="7">
+      <w:start w:val="31"/>
+      <w:numFmt w:val="decimal"/>
+      <w:lvlText w:val="%8."/>
+      <w:lvlJc w:val="left"/>
+      <w:pPr>
+        <w:ind w:left="5760" w:hanging="360"/>
+      </w:pPr>
+    </w:lvl>
+    <w:lvl w:ilvl="8">
+      <w:start w:val="31"/>
       <w:numFmt w:val="decimal"/>
       <w:lvlText w:val="%9."/>
       <w:lvlJc w:val="left"/>
@@ -10582,6 +13144,267 @@
   </w:num>
   <w:num w:numId="1022">
     <w:abstractNumId w:val="991"/>
+  </w:num>
+  <w:num w:numId="1023">
+    <w:abstractNumId w:val="991"/>
+  </w:num>
+  <w:num w:numId="1024">
+    <w:abstractNumId w:val="991"/>
+  </w:num>
+  <w:num w:numId="1025">
+    <w:abstractNumId w:val="991"/>
+  </w:num>
+  <w:num w:numId="1026">
+    <w:abstractNumId w:val="991"/>
+  </w:num>
+  <w:num w:numId="1027">
+    <w:abstractNumId w:val="991"/>
+  </w:num>
+  <w:num w:numId="1028">
+    <w:abstractNumId w:val="991"/>
+  </w:num>
+  <w:num w:numId="1029">
+    <w:abstractNumId w:val="991"/>
+  </w:num>
+  <w:num w:numId="1030">
+    <w:abstractNumId w:val="99411"/>
+    <w:lvlOverride w:ilvl="0">
+      <w:startOverride w:val="1"/>
+    </w:lvlOverride>
+    <w:lvlOverride w:ilvl="1">
+      <w:startOverride w:val="1"/>
+    </w:lvlOverride>
+    <w:lvlOverride w:ilvl="2">
+      <w:startOverride w:val="1"/>
+    </w:lvlOverride>
+    <w:lvlOverride w:ilvl="3">
+      <w:startOverride w:val="1"/>
+    </w:lvlOverride>
+    <w:lvlOverride w:ilvl="4">
+      <w:startOverride w:val="1"/>
+    </w:lvlOverride>
+    <w:lvlOverride w:ilvl="5">
+      <w:startOverride w:val="1"/>
+    </w:lvlOverride>
+    <w:lvlOverride w:ilvl="6">
+      <w:startOverride w:val="1"/>
+    </w:lvlOverride>
+    <w:lvlOverride w:ilvl="7">
+      <w:startOverride w:val="1"/>
+    </w:lvlOverride>
+    <w:lvlOverride w:ilvl="8">
+      <w:startOverride w:val="1"/>
+    </w:lvlOverride>
+  </w:num>
+  <w:num w:numId="1031">
+    <w:abstractNumId w:val="99415"/>
+    <w:lvlOverride w:ilvl="0">
+      <w:startOverride w:val="5"/>
+    </w:lvlOverride>
+    <w:lvlOverride w:ilvl="1">
+      <w:startOverride w:val="5"/>
+    </w:lvlOverride>
+    <w:lvlOverride w:ilvl="2">
+      <w:startOverride w:val="5"/>
+    </w:lvlOverride>
+    <w:lvlOverride w:ilvl="3">
+      <w:startOverride w:val="5"/>
+    </w:lvlOverride>
+    <w:lvlOverride w:ilvl="4">
+      <w:startOverride w:val="5"/>
+    </w:lvlOverride>
+    <w:lvlOverride w:ilvl="5">
+      <w:startOverride w:val="5"/>
+    </w:lvlOverride>
+    <w:lvlOverride w:ilvl="6">
+      <w:startOverride w:val="5"/>
+    </w:lvlOverride>
+    <w:lvlOverride w:ilvl="7">
+      <w:startOverride w:val="5"/>
+    </w:lvlOverride>
+    <w:lvlOverride w:ilvl="8">
+      <w:startOverride w:val="5"/>
+    </w:lvlOverride>
+  </w:num>
+  <w:num w:numId="1032">
+    <w:abstractNumId w:val="99417"/>
+    <w:lvlOverride w:ilvl="0">
+      <w:startOverride w:val="7"/>
+    </w:lvlOverride>
+    <w:lvlOverride w:ilvl="1">
+      <w:startOverride w:val="7"/>
+    </w:lvlOverride>
+    <w:lvlOverride w:ilvl="2">
+      <w:startOverride w:val="7"/>
+    </w:lvlOverride>
+    <w:lvlOverride w:ilvl="3">
+      <w:startOverride w:val="7"/>
+    </w:lvlOverride>
+    <w:lvlOverride w:ilvl="4">
+      <w:startOverride w:val="7"/>
+    </w:lvlOverride>
+    <w:lvlOverride w:ilvl="5">
+      <w:startOverride w:val="7"/>
+    </w:lvlOverride>
+    <w:lvlOverride w:ilvl="6">
+      <w:startOverride w:val="7"/>
+    </w:lvlOverride>
+    <w:lvlOverride w:ilvl="7">
+      <w:startOverride w:val="7"/>
+    </w:lvlOverride>
+    <w:lvlOverride w:ilvl="8">
+      <w:startOverride w:val="7"/>
+    </w:lvlOverride>
+  </w:num>
+  <w:num w:numId="1033">
+    <w:abstractNumId w:val="994110"/>
+    <w:lvlOverride w:ilvl="0">
+      <w:startOverride w:val="10"/>
+    </w:lvlOverride>
+    <w:lvlOverride w:ilvl="1">
+      <w:startOverride w:val="10"/>
+    </w:lvlOverride>
+    <w:lvlOverride w:ilvl="2">
+      <w:startOverride w:val="10"/>
+    </w:lvlOverride>
+    <w:lvlOverride w:ilvl="3">
+      <w:startOverride w:val="10"/>
+    </w:lvlOverride>
+    <w:lvlOverride w:ilvl="4">
+      <w:startOverride w:val="10"/>
+    </w:lvlOverride>
+    <w:lvlOverride w:ilvl="5">
+      <w:startOverride w:val="10"/>
+    </w:lvlOverride>
+    <w:lvlOverride w:ilvl="6">
+      <w:startOverride w:val="10"/>
+    </w:lvlOverride>
+    <w:lvlOverride w:ilvl="7">
+      <w:startOverride w:val="10"/>
+    </w:lvlOverride>
+    <w:lvlOverride w:ilvl="8">
+      <w:startOverride w:val="10"/>
+    </w:lvlOverride>
+  </w:num>
+  <w:num w:numId="1034">
+    <w:abstractNumId w:val="994116"/>
+    <w:lvlOverride w:ilvl="0">
+      <w:startOverride w:val="16"/>
+    </w:lvlOverride>
+    <w:lvlOverride w:ilvl="1">
+      <w:startOverride w:val="16"/>
+    </w:lvlOverride>
+    <w:lvlOverride w:ilvl="2">
+      <w:startOverride w:val="16"/>
+    </w:lvlOverride>
+    <w:lvlOverride w:ilvl="3">
+      <w:startOverride w:val="16"/>
+    </w:lvlOverride>
+    <w:lvlOverride w:ilvl="4">
+      <w:startOverride w:val="16"/>
+    </w:lvlOverride>
+    <w:lvlOverride w:ilvl="5">
+      <w:startOverride w:val="16"/>
+    </w:lvlOverride>
+    <w:lvlOverride w:ilvl="6">
+      <w:startOverride w:val="16"/>
+    </w:lvlOverride>
+    <w:lvlOverride w:ilvl="7">
+      <w:startOverride w:val="16"/>
+    </w:lvlOverride>
+    <w:lvlOverride w:ilvl="8">
+      <w:startOverride w:val="16"/>
+    </w:lvlOverride>
+  </w:num>
+  <w:num w:numId="1035">
+    <w:abstractNumId w:val="994120"/>
+    <w:lvlOverride w:ilvl="0">
+      <w:startOverride w:val="20"/>
+    </w:lvlOverride>
+    <w:lvlOverride w:ilvl="1">
+      <w:startOverride w:val="20"/>
+    </w:lvlOverride>
+    <w:lvlOverride w:ilvl="2">
+      <w:startOverride w:val="20"/>
+    </w:lvlOverride>
+    <w:lvlOverride w:ilvl="3">
+      <w:startOverride w:val="20"/>
+    </w:lvlOverride>
+    <w:lvlOverride w:ilvl="4">
+      <w:startOverride w:val="20"/>
+    </w:lvlOverride>
+    <w:lvlOverride w:ilvl="5">
+      <w:startOverride w:val="20"/>
+    </w:lvlOverride>
+    <w:lvlOverride w:ilvl="6">
+      <w:startOverride w:val="20"/>
+    </w:lvlOverride>
+    <w:lvlOverride w:ilvl="7">
+      <w:startOverride w:val="20"/>
+    </w:lvlOverride>
+    <w:lvlOverride w:ilvl="8">
+      <w:startOverride w:val="20"/>
+    </w:lvlOverride>
+  </w:num>
+  <w:num w:numId="1036">
+    <w:abstractNumId w:val="994126"/>
+    <w:lvlOverride w:ilvl="0">
+      <w:startOverride w:val="26"/>
+    </w:lvlOverride>
+    <w:lvlOverride w:ilvl="1">
+      <w:startOverride w:val="26"/>
+    </w:lvlOverride>
+    <w:lvlOverride w:ilvl="2">
+      <w:startOverride w:val="26"/>
+    </w:lvlOverride>
+    <w:lvlOverride w:ilvl="3">
+      <w:startOverride w:val="26"/>
+    </w:lvlOverride>
+    <w:lvlOverride w:ilvl="4">
+      <w:startOverride w:val="26"/>
+    </w:lvlOverride>
+    <w:lvlOverride w:ilvl="5">
+      <w:startOverride w:val="26"/>
+    </w:lvlOverride>
+    <w:lvlOverride w:ilvl="6">
+      <w:startOverride w:val="26"/>
+    </w:lvlOverride>
+    <w:lvlOverride w:ilvl="7">
+      <w:startOverride w:val="26"/>
+    </w:lvlOverride>
+    <w:lvlOverride w:ilvl="8">
+      <w:startOverride w:val="26"/>
+    </w:lvlOverride>
+  </w:num>
+  <w:num w:numId="1037">
+    <w:abstractNumId w:val="994131"/>
+    <w:lvlOverride w:ilvl="0">
+      <w:startOverride w:val="31"/>
+    </w:lvlOverride>
+    <w:lvlOverride w:ilvl="1">
+      <w:startOverride w:val="31"/>
+    </w:lvlOverride>
+    <w:lvlOverride w:ilvl="2">
+      <w:startOverride w:val="31"/>
+    </w:lvlOverride>
+    <w:lvlOverride w:ilvl="3">
+      <w:startOverride w:val="31"/>
+    </w:lvlOverride>
+    <w:lvlOverride w:ilvl="4">
+      <w:startOverride w:val="31"/>
+    </w:lvlOverride>
+    <w:lvlOverride w:ilvl="5">
+      <w:startOverride w:val="31"/>
+    </w:lvlOverride>
+    <w:lvlOverride w:ilvl="6">
+      <w:startOverride w:val="31"/>
+    </w:lvlOverride>
+    <w:lvlOverride w:ilvl="7">
+      <w:startOverride w:val="31"/>
+    </w:lvlOverride>
+    <w:lvlOverride w:ilvl="8">
+      <w:startOverride w:val="31"/>
+    </w:lvlOverride>
   </w:num>
 </w:numbering>
 </file>

</xml_diff>

<commit_message>
Fix list and line-break rendering in Word exports
Co-Authored-By: Claude Opus 5.5 <noreply@anthropic.com>
Claude-Session: https://claude.ai/code/session_01DZfKE2Qbh1BJBTBdA16C3f
</commit_message>
<xml_diff>
--- a/content/Kontent-plan_Ayrat_oktyabr-2026.docx
+++ b/content/Kontent-plan_Ayrat_oktyabr-2026.docx
@@ -1274,7 +1274,7 @@
         <w:t xml:space="preserve">Опора — реальные цифры: 13 лет в управлении, площадка 50 000 м², 45 человек, дата-центр 24/7, ~10 часов в неделю на управление. Два слоя экспертизы:</w:t>
       </w:r>
       <w:r>
-        <w:t xml:space="preserve"> </w:t>
+        <w:br/>
       </w:r>
       <w:r>
         <w:t xml:space="preserve">1.</w:t>
@@ -1296,7 +1296,7 @@
         <w:t xml:space="preserve">(люди, механизм, ритм) — отсюда стратегические сессии.</w:t>
       </w:r>
       <w:r>
-        <w:t xml:space="preserve"> </w:t>
+        <w:br/>
       </w:r>
       <w:r>
         <w:t xml:space="preserve">2.</w:t>
@@ -1326,7 +1326,7 @@
         <w:t xml:space="preserve">Одна строка для шапки (IG / VK / MAX):</w:t>
       </w:r>
       <w:r>
-        <w:t xml:space="preserve"> </w:t>
+        <w:br/>
       </w:r>
       <w:r>
         <w:t xml:space="preserve">&gt; Строю машину, а не мотор. 13 лет в управлении, руковожу площадкой ИТ-парка в Челнах. Показываю, как бизнес работает без ручного управления и с ИИ.</w:t>
@@ -2169,7 +2169,7 @@
         <w:t xml:space="preserve">Два призыва, не путаем:</w:t>
       </w:r>
       <w:r>
-        <w:t xml:space="preserve"> </w:t>
+        <w:br/>
       </w:r>
       <w:r>
         <w:t xml:space="preserve">-</w:t>
@@ -2191,7 +2191,7 @@
         <w:t xml:space="preserve">«Записаться на экспресс-разбор» (сайт ayratsagdeev.ru) → стратегическая сессия.</w:t>
       </w:r>
       <w:r>
-        <w:t xml:space="preserve"> </w:t>
+        <w:br/>
       </w:r>
       <w:r>
         <w:t xml:space="preserve">-</w:t>
@@ -3171,7 +3171,7 @@
         <w:t xml:space="preserve">— сторис.</w:t>
       </w:r>
       <w:r>
-        <w:t xml:space="preserve"> </w:t>
+        <w:br/>
       </w:r>
       <w:r>
         <w:t xml:space="preserve">✅ — текст готов в posts/, 📝 — тема есть, текст напишу по вашему голосовому/материалу, ❓ — нужен факт от вас.</w:t>
@@ -5796,7 +5796,7 @@
         <w:t xml:space="preserve">Рубрика: #автоматизирую_себя · Форматы: TG (+ВК, MAX) · Reels · Сторис</w:t>
       </w:r>
       <w:r>
-        <w:t xml:space="preserve"> </w:t>
+        <w:br/>
       </w:r>
       <w:r>
         <w:t xml:space="preserve">Время публикации: 08:30–09:00 (коллеги читают по дороге и в начале дня)</w:t>
@@ -6217,31 +6217,31 @@
         <w:t xml:space="preserve">Подпись в Instagram:</w:t>
       </w:r>
       <w:r>
-        <w:t xml:space="preserve"> </w:t>
+        <w:br/>
       </w:r>
       <w:r>
         <w:t xml:space="preserve">&gt; Руководитель тонет не в больших решениях, а в мелочах. 30 дней отдаю их ИИ и показываю, что из этого выйдет. Неделя 1 — стартуем.</w:t>
       </w:r>
       <w:r>
-        <w:t xml:space="preserve"> </w:t>
+        <w:br/>
       </w:r>
       <w:r>
         <w:t xml:space="preserve">&gt;</w:t>
       </w:r>
       <w:r>
-        <w:t xml:space="preserve"> </w:t>
+        <w:br/>
       </w:r>
       <w:r>
         <w:t xml:space="preserve">&gt; А вы что отдали бы ИИ первым? Пишите в комментарии 👇</w:t>
       </w:r>
       <w:r>
-        <w:t xml:space="preserve"> </w:t>
+        <w:br/>
       </w:r>
       <w:r>
         <w:t xml:space="preserve">&gt;</w:t>
       </w:r>
       <w:r>
-        <w:t xml:space="preserve"> </w:t>
+        <w:br/>
       </w:r>
       <w:r>
         <w:t xml:space="preserve">&gt; #автоматизация #ии #нейросети #руководитель #эффективность #набережныечелны #айтипарк</w:t>
@@ -6294,13 +6294,13 @@
         <w:t xml:space="preserve">Пн 28.09</w:t>
       </w:r>
       <w:r>
-        <w:t xml:space="preserve"> </w:t>
+        <w:br/>
       </w:r>
       <w:r>
         <w:t xml:space="preserve">1. Скрин нового поста + «Перезапускаю канал. Подробности в посте 👇» (ссылка).</w:t>
       </w:r>
       <w:r>
-        <w:t xml:space="preserve"> </w:t>
+        <w:br/>
       </w:r>
       <w:r>
         <w:t xml:space="preserve">2. Селфи на ходу: «День 1. Сначала посчитаю, сколько времени уходит на рутину сейчас».</w:t>
@@ -6318,13 +6318,13 @@
         <w:t xml:space="preserve">Вт 29.09</w:t>
       </w:r>
       <w:r>
-        <w:t xml:space="preserve"> </w:t>
+        <w:br/>
       </w:r>
       <w:r>
         <w:t xml:space="preserve">3. Опрос: «Что автоматизировать первым?» — Почту / Мессенджеры / Протоколы встреч / Отчёты.</w:t>
       </w:r>
       <w:r>
-        <w:t xml:space="preserve"> </w:t>
+        <w:br/>
       </w:r>
       <w:r>
         <w:t xml:space="preserve">4. Скрин экранного времени в телефоне за неделю + «Вот с чего начинаем. Страшно» 😅</w:t>
@@ -6407,7 +6407,7 @@
         <w:t xml:space="preserve">Рубрика: #автоматизирую_себя · Форматы: TG (+ВК, MAX) · Reels · Сторис</w:t>
       </w:r>
       <w:r>
-        <w:t xml:space="preserve"> </w:t>
+        <w:br/>
       </w:r>
       <w:r>
         <w:t xml:space="preserve">Время публикации: 12:30–13:00 (обед)</w:t>
@@ -6465,31 +6465,31 @@
         <w:t xml:space="preserve">Алина — ИИ-ассистент в Telegram, который я собрал сам. Работает на своём сервере круглосуточно. Что она уже делает:</w:t>
       </w:r>
       <w:r>
-        <w:t xml:space="preserve"> </w:t>
+        <w:br/>
       </w:r>
       <w:r>
         <w:t xml:space="preserve">▫️ расшифровывает часовые записи встреч и делает выжимку;</w:t>
       </w:r>
       <w:r>
-        <w:t xml:space="preserve"> </w:t>
+        <w:br/>
       </w:r>
       <w:r>
         <w:t xml:space="preserve">▫️ каждое утро собирает задачи у 23 сотрудников, вечером — отчёт;</w:t>
       </w:r>
       <w:r>
-        <w:t xml:space="preserve"> </w:t>
+        <w:br/>
       </w:r>
       <w:r>
         <w:t xml:space="preserve">▫️ присылает сводки по рабочей почте;</w:t>
       </w:r>
       <w:r>
-        <w:t xml:space="preserve"> </w:t>
+        <w:br/>
       </w:r>
       <w:r>
         <w:t xml:space="preserve">▫️ пишет черновики постов из моих голосовых и рисует к ним картинки;</w:t>
       </w:r>
       <w:r>
-        <w:t xml:space="preserve"> </w:t>
+        <w:br/>
       </w:r>
       <w:r>
         <w:t xml:space="preserve">▫️ правит мой сайт. И даже предложила его переделать. Смелая.</w:t>
@@ -6842,31 +6842,31 @@
         <w:t xml:space="preserve">Подпись в Instagram:</w:t>
       </w:r>
       <w:r>
-        <w:t xml:space="preserve"> </w:t>
+        <w:br/>
       </w:r>
       <w:r>
         <w:t xml:space="preserve">&gt; Собрал себе ИИ-помощницу: встречи, задачи команды, почта, черновики постов. Главное открытие не про технологии: чтобы отдать задачу машине, сначала надо самому понять, как вы её делаете.</w:t>
       </w:r>
       <w:r>
-        <w:t xml:space="preserve"> </w:t>
+        <w:br/>
       </w:r>
       <w:r>
         <w:t xml:space="preserve">&gt;</w:t>
       </w:r>
       <w:r>
-        <w:t xml:space="preserve"> </w:t>
+        <w:br/>
       </w:r>
       <w:r>
         <w:t xml:space="preserve">&gt; Есть у вас ИИ-помощник? Расскажите в комментариях 👇</w:t>
       </w:r>
       <w:r>
-        <w:t xml:space="preserve"> </w:t>
+        <w:br/>
       </w:r>
       <w:r>
         <w:t xml:space="preserve">&gt;</w:t>
       </w:r>
       <w:r>
-        <w:t xml:space="preserve"> </w:t>
+        <w:br/>
       </w:r>
       <w:r>
         <w:t xml:space="preserve">&gt; #ииассистент #нейросети #автоматизация #руководитель #продуктивность</w:t>
@@ -6985,13 +6985,13 @@
         <w:t xml:space="preserve">Рубрика: #управленческое · Форматы: TG (+ВК, MAX) · Карусель IG · Reels (Сб 10.10) · Сторис</w:t>
       </w:r>
       <w:r>
-        <w:t xml:space="preserve"> </w:t>
+        <w:br/>
       </w:r>
       <w:r>
         <w:t xml:space="preserve">Время публикации: 09:00</w:t>
       </w:r>
       <w:r>
-        <w:t xml:space="preserve"> </w:t>
+        <w:br/>
       </w:r>
       <w:r>
         <w:t xml:space="preserve">Основа: презентация стартап-завтрака 23.09, слайды 2, 5–7, 16 (materials/text/startup-breakfast_5-pravil.md).</w:t>
@@ -7242,31 +7242,31 @@
         <w:t xml:space="preserve">Подпись:</w:t>
       </w:r>
       <w:r>
-        <w:t xml:space="preserve"> </w:t>
+        <w:br/>
       </w:r>
       <w:r>
         <w:t xml:space="preserve">&gt; Около 10 часов в неделю — столько я трачу на управление площадкой, которая работает 24/7. Секрет не в том, что я мало работаю. Всё держится не на мне.</w:t>
       </w:r>
       <w:r>
-        <w:t xml:space="preserve"> </w:t>
+        <w:br/>
       </w:r>
       <w:r>
         <w:t xml:space="preserve">&gt;</w:t>
       </w:r>
       <w:r>
-        <w:t xml:space="preserve"> </w:t>
+        <w:br/>
       </w:r>
       <w:r>
         <w:t xml:space="preserve">&gt; Какое решение на прошлой неделе ждали именно вас? Напишите в комментариях 👇</w:t>
       </w:r>
       <w:r>
-        <w:t xml:space="preserve"> </w:t>
+        <w:br/>
       </w:r>
       <w:r>
         <w:t xml:space="preserve">&gt;</w:t>
       </w:r>
       <w:r>
-        <w:t xml:space="preserve"> </w:t>
+        <w:br/>
       </w:r>
       <w:r>
         <w:t xml:space="preserve">&gt; #управление #бизнес #делегирование #руководитель #предприниматель #бизнессистема #набережныечелны</w:t>
@@ -7642,7 +7642,7 @@
         <w:t xml:space="preserve">Рубрика: #ближе + #автоматизирую_себя · Форматы: TG (+ВК, MAX) · Сторис</w:t>
       </w:r>
       <w:r>
-        <w:t xml:space="preserve"> </w:t>
+        <w:br/>
       </w:r>
       <w:r>
         <w:t xml:space="preserve">Время публикации: 11:00–12:00</w:t>
@@ -7710,25 +7710,25 @@
         <w:t xml:space="preserve">Было / стало:</w:t>
       </w:r>
       <w:r>
-        <w:t xml:space="preserve"> </w:t>
+        <w:br/>
       </w:r>
       <w:r>
         <w:t xml:space="preserve">▫️ Постов в канале за неделю: 0 → [4]</w:t>
       </w:r>
       <w:r>
-        <w:t xml:space="preserve"> </w:t>
+        <w:br/>
       </w:r>
       <w:r>
         <w:t xml:space="preserve">▫️ Времени на один пост: [~1,5 часа] → [~25 минут] (голосовое + правка черновика)</w:t>
       </w:r>
       <w:r>
-        <w:t xml:space="preserve"> </w:t>
+        <w:br/>
       </w:r>
       <w:r>
         <w:t xml:space="preserve">▫️ Экранное время в мессенджерах: [X ч] в день → [Y ч]</w:t>
       </w:r>
       <w:r>
-        <w:t xml:space="preserve"> </w:t>
+        <w:br/>
       </w:r>
       <w:r>
         <w:t xml:space="preserve">▫️ Подписчиков: 131 → [N]</w:t>
@@ -7859,7 +7859,7 @@
         <w:t xml:space="preserve">Сб 03.10</w:t>
       </w:r>
       <w:r>
-        <w:t xml:space="preserve"> </w:t>
+        <w:br/>
       </w:r>
       <w:r>
         <w:t xml:space="preserve">1. Живое с выходных, без текста или одной фразой (семья, прогулка, еда).</w:t>
@@ -7877,13 +7877,13 @@
         <w:t xml:space="preserve">Вс 04.10</w:t>
       </w:r>
       <w:r>
-        <w:t xml:space="preserve"> </w:t>
+        <w:br/>
       </w:r>
       <w:r>
         <w:t xml:space="preserve">2. «Неделя 1: [4] поста вместо 0. Подробности в канале» + ссылка.</w:t>
       </w:r>
       <w:r>
-        <w:t xml:space="preserve"> </w:t>
+        <w:br/>
       </w:r>
       <w:r>
         <w:t xml:space="preserve">3. Ящик вопросов: «Что вы хотите, чтобы я попробовал автоматизировать?» — ответы пойдут в темы следующих недель.</w:t>
@@ -8370,13 +8370,13 @@
         <w:t xml:space="preserve">Рубрика: #автоматизирую_себя · Форматы: TG (+ВК, MAX) · Reels · Карусель IG · Сторис</w:t>
       </w:r>
       <w:r>
-        <w:t xml:space="preserve"> </w:t>
+        <w:br/>
       </w:r>
       <w:r>
         <w:t xml:space="preserve">Время публикации: 12:30</w:t>
       </w:r>
       <w:r>
-        <w:t xml:space="preserve"> </w:t>
+        <w:br/>
       </w:r>
       <w:r>
         <w:t xml:space="preserve">Основа: слайд 11 презентации стартап-завтрака («Приём директора завода»), продукт «бот задач» с сайта (v3).</w:t>
@@ -8846,31 +8846,31 @@
         <w:t xml:space="preserve">Подпись в Instagram:</w:t>
       </w:r>
       <w:r>
-        <w:t xml:space="preserve"> </w:t>
+        <w:br/>
       </w:r>
       <w:r>
         <w:t xml:space="preserve">&gt; Утром 3 задачи, вечером — что сделано. Приём директора завода + ИИ = бот задач, который спрашивает вместо меня.</w:t>
       </w:r>
       <w:r>
-        <w:t xml:space="preserve"> </w:t>
+        <w:br/>
       </w:r>
       <w:r>
         <w:t xml:space="preserve">&gt;</w:t>
       </w:r>
       <w:r>
-        <w:t xml:space="preserve"> </w:t>
+        <w:br/>
       </w:r>
       <w:r>
         <w:t xml:space="preserve">&gt; Кто в вашей команде задаёт вопрос «ну что, как там?» 👇</w:t>
       </w:r>
       <w:r>
-        <w:t xml:space="preserve"> </w:t>
+        <w:br/>
       </w:r>
       <w:r>
         <w:t xml:space="preserve">&gt;</w:t>
       </w:r>
       <w:r>
-        <w:t xml:space="preserve"> </w:t>
+        <w:br/>
       </w:r>
       <w:r>
         <w:t xml:space="preserve">&gt; #автоматизация #ии #управление #руководитель #делегирование #телеграмбот #продуктивность</w:t>
@@ -9090,13 +9090,13 @@
         <w:t xml:space="preserve">Рубрика: #управленческое · Форматы: TG (+ВК, MAX) · Reels · Сторис</w:t>
       </w:r>
       <w:r>
-        <w:t xml:space="preserve"> </w:t>
+        <w:br/>
       </w:r>
       <w:r>
         <w:t xml:space="preserve">Время публикации: 09:00</w:t>
       </w:r>
       <w:r>
-        <w:t xml:space="preserve"> </w:t>
+        <w:br/>
       </w:r>
       <w:r>
         <w:t xml:space="preserve">Основа: слайды 8–9 презентации стартап-завтрака.</w:t>
@@ -9184,7 +9184,7 @@
         <w:t xml:space="preserve">Что ещё я для себя вывел:</w:t>
       </w:r>
       <w:r>
-        <w:t xml:space="preserve"> </w:t>
+        <w:br/>
       </w:r>
       <w:r>
         <w:t xml:space="preserve">▫️</w:t>
@@ -9206,7 +9206,7 @@
         <w:t xml:space="preserve">Кто видит только задачи — ждёт следующую.</w:t>
       </w:r>
       <w:r>
-        <w:t xml:space="preserve"> </w:t>
+        <w:br/>
       </w:r>
       <w:r>
         <w:t xml:space="preserve">▫️</w:t>
@@ -9228,7 +9228,7 @@
         <w:t xml:space="preserve">Берите тех, у кого горит, и не мешайте.</w:t>
       </w:r>
       <w:r>
-        <w:t xml:space="preserve"> </w:t>
+        <w:br/>
       </w:r>
       <w:r>
         <w:t xml:space="preserve">▫️</w:t>
@@ -9563,31 +9563,31 @@
         <w:t xml:space="preserve">Подпись в Instagram:</w:t>
       </w:r>
       <w:r>
-        <w:t xml:space="preserve"> </w:t>
+        <w:br/>
       </w:r>
       <w:r>
         <w:t xml:space="preserve">&gt; Правило 1 из 5 бизнеса без ручного управления: мотивированные люди. И история про комплектовщика, которого чуть не уволили 🙂</w:t>
       </w:r>
       <w:r>
-        <w:t xml:space="preserve"> </w:t>
+        <w:br/>
       </w:r>
       <w:r>
         <w:t xml:space="preserve">&gt;</w:t>
       </w:r>
       <w:r>
-        <w:t xml:space="preserve"> </w:t>
+        <w:br/>
       </w:r>
       <w:r>
         <w:t xml:space="preserve">&gt; Кого вы последний раз уговаривали работать? Сколько это продлилось? 👇</w:t>
       </w:r>
       <w:r>
-        <w:t xml:space="preserve"> </w:t>
+        <w:br/>
       </w:r>
       <w:r>
         <w:t xml:space="preserve">&gt;</w:t>
       </w:r>
       <w:r>
-        <w:t xml:space="preserve"> </w:t>
+        <w:br/>
       </w:r>
       <w:r>
         <w:t xml:space="preserve">&gt; #управление #команда #hr #найм #руководитель #бизнес #мотивация</w:t>
@@ -9995,7 +9995,7 @@
         <w:t xml:space="preserve">Можно целиком переслать Алине. Порядок = приоритет.</w:t>
       </w:r>
       <w:r>
-        <w:t xml:space="preserve"> </w:t>
+        <w:br/>
       </w:r>
       <w:r>
         <w:t xml:space="preserve">Правило прежнее: всё от имени Айрата публикуется только после его «ок».</w:t>

</xml_diff>